<commit_message>
corrige nome e cria relatório docx
</commit_message>
<xml_diff>
--- a/R/Relatorio_anual_2022.docx
+++ b/R/Relatorio_anual_2022.docx
@@ -1,55 +1,13 @@
 
 <file path=word/document.xml><?xml version="1.0" encoding="utf-8"?>
-<w:document xmlns:w="http://schemas.openxmlformats.org/wordprocessingml/2006/main" xmlns:m="http://schemas.openxmlformats.org/officeDocument/2006/math" xmlns:r="http://schemas.openxmlformats.org/officeDocument/2006/relationships" xmlns:o="urn:schemas-microsoft-com:office:office" xmlns:v="urn:schemas-microsoft-com:vml" xmlns:w10="urn:schemas-microsoft-com:office:word" xmlns:a="http://schemas.openxmlformats.org/drawingml/2006/main" xmlns:pic="http://schemas.openxmlformats.org/drawingml/2006/picture" xmlns:wp="http://schemas.openxmlformats.org/drawingml/2006/wordprocessingDrawing">
+<w:document xmlns:wpc="http://schemas.microsoft.com/office/word/2010/wordprocessingCanvas" xmlns:cx="http://schemas.microsoft.com/office/drawing/2014/chartex" xmlns:cx1="http://schemas.microsoft.com/office/drawing/2015/9/8/chartex" xmlns:cx2="http://schemas.microsoft.com/office/drawing/2015/10/21/chartex" xmlns:cx3="http://schemas.microsoft.com/office/drawing/2016/5/9/chartex" xmlns:cx4="http://schemas.microsoft.com/office/drawing/2016/5/10/chartex" xmlns:cx5="http://schemas.microsoft.com/office/drawing/2016/5/11/chartex" xmlns:cx6="http://schemas.microsoft.com/office/drawing/2016/5/12/chartex" xmlns:cx7="http://schemas.microsoft.com/office/drawing/2016/5/13/chartex" xmlns:cx8="http://schemas.microsoft.com/office/drawing/2016/5/14/chartex" xmlns:mc="http://schemas.openxmlformats.org/markup-compatibility/2006" xmlns:aink="http://schemas.microsoft.com/office/drawing/2016/ink" xmlns:am3d="http://schemas.microsoft.com/office/drawing/2017/model3d" xmlns:o="urn:schemas-microsoft-com:office:office" xmlns:oel="http://schemas.microsoft.com/office/2019/extlst" xmlns:r="http://schemas.openxmlformats.org/officeDocument/2006/relationships" xmlns:m="http://schemas.openxmlformats.org/officeDocument/2006/math" xmlns:v="urn:schemas-microsoft-com:vml" xmlns:wp14="http://schemas.microsoft.com/office/word/2010/wordprocessingDrawing" xmlns:wp="http://schemas.openxmlformats.org/drawingml/2006/wordprocessingDrawing" xmlns:w10="urn:schemas-microsoft-com:office:word" xmlns:w="http://schemas.openxmlformats.org/wordprocessingml/2006/main" xmlns:w14="http://schemas.microsoft.com/office/word/2010/wordml" xmlns:w15="http://schemas.microsoft.com/office/word/2012/wordml" xmlns:w16cex="http://schemas.microsoft.com/office/word/2018/wordml/cex" xmlns:w16cid="http://schemas.microsoft.com/office/word/2016/wordml/cid" xmlns:w16="http://schemas.microsoft.com/office/word/2018/wordml" xmlns:w16sdtdh="http://schemas.microsoft.com/office/word/2020/wordml/sdtdatahash" xmlns:w16se="http://schemas.microsoft.com/office/word/2015/wordml/symex" xmlns:wpg="http://schemas.microsoft.com/office/word/2010/wordprocessingGroup" xmlns:wpi="http://schemas.microsoft.com/office/word/2010/wordprocessingInk" xmlns:wne="http://schemas.microsoft.com/office/word/2006/wordml" xmlns:wps="http://schemas.microsoft.com/office/word/2010/wordprocessingShape" mc:Ignorable="w14 w15 w16se w16cid w16 w16cex w16sdtdh wp14">
   <w:body>
     <w:p>
       <w:pPr>
-        <w:pStyle w:val="Title"/>
-      </w:pPr>
-      <w:r>
-        <w:t xml:space="preserve">Boletim</w:t>
-      </w:r>
-      <w:r>
-        <w:t xml:space="preserve"> </w:t>
-      </w:r>
-      <w:r>
-        <w:t xml:space="preserve">Sou</w:t>
-      </w:r>
-      <w:r>
-        <w:t xml:space="preserve"> </w:t>
-      </w:r>
-      <w:r>
-        <w:t xml:space="preserve">da</w:t>
-      </w:r>
-      <w:r>
-        <w:t xml:space="preserve"> </w:t>
-      </w:r>
-      <w:r>
-        <w:t xml:space="preserve">Paz</w:t>
-      </w:r>
-      <w:r>
-        <w:t xml:space="preserve"> </w:t>
-      </w:r>
-      <w:r>
-        <w:t xml:space="preserve">Analisa</w:t>
-      </w:r>
-      <w:r>
-        <w:t xml:space="preserve"> </w:t>
-      </w:r>
-      <w:r>
-        <w:t xml:space="preserve">2022</w:t>
-      </w:r>
-      <w:r>
-        <w:t xml:space="preserve"> </w:t>
-      </w:r>
-      <w:r>
-        <w:t xml:space="preserve">-</w:t>
-      </w:r>
-      <w:r>
-        <w:t xml:space="preserve"> </w:t>
-      </w:r>
-      <w:r>
-        <w:t xml:space="preserve">Panorama</w:t>
+        <w:pStyle w:val="Ttulo"/>
+      </w:pPr>
+      <w:r>
+        <w:t>Boletim Sou da Paz Analisa 2022 - Panorama</w:t>
       </w:r>
     </w:p>
     <w:p>
@@ -57,33 +15,15 @@
         <w:pStyle w:val="Author"/>
       </w:pPr>
       <w:r>
-        <w:t xml:space="preserve">Instituto</w:t>
-      </w:r>
-      <w:r>
-        <w:t xml:space="preserve"> </w:t>
-      </w:r>
-      <w:r>
-        <w:t xml:space="preserve">Sou</w:t>
-      </w:r>
-      <w:r>
-        <w:t xml:space="preserve"> </w:t>
-      </w:r>
-      <w:r>
-        <w:t xml:space="preserve">da</w:t>
-      </w:r>
-      <w:r>
-        <w:t xml:space="preserve"> </w:t>
-      </w:r>
-      <w:r>
-        <w:t xml:space="preserve">Paz</w:t>
-      </w:r>
-    </w:p>
-    <w:p>
-      <w:pPr>
-        <w:pStyle w:val="Date"/>
-      </w:pPr>
-      <w:r>
-        <w:t xml:space="preserve">2023-02-27</w:t>
+        <w:t>Instituto Sou da Paz</w:t>
+      </w:r>
+    </w:p>
+    <w:p>
+      <w:pPr>
+        <w:pStyle w:val="Data"/>
+      </w:pPr>
+      <w:r>
+        <w:t>2023-03-02</w:t>
       </w:r>
     </w:p>
     <w:p>
@@ -91,15 +31,15 @@
         <w:pStyle w:val="Estilo2"/>
       </w:pPr>
       <w:r>
-        <w:t xml:space="preserve">APRESENTAÇÃO</w:t>
-      </w:r>
-    </w:p>
-    <w:p>
-      <w:pPr>
-        <w:pStyle w:val="BodyText"/>
-      </w:pPr>
-      <w:r>
-        <w:t xml:space="preserve">Texto introdutório sobre o objetivo do boletim, os dados usados e a análise especial.</w:t>
+        <w:t>APRESENTAÇÃO</w:t>
+      </w:r>
+    </w:p>
+    <w:p>
+      <w:pPr>
+        <w:pStyle w:val="Corpodetexto"/>
+      </w:pPr>
+      <w:r>
+        <w:t>O Instituto Sou da Paz acompanha as estatísticas criminais divulgadas pela Secretaria da Segurança Pública de São Paulo (SSP/SP) desde 2012, a fim de contribuir para a melhor compreensão das dinâmicas criminais e atividades policiais no estado de São Paulo e em suas grandes regiões - Capital, Grande São Paulo e Interior. Além dos dados mensal e trimestralmente divulgados pela SSP/SP, são consideradas informações produzidas pelas Corregedorias das Polícias Civil e Militar do Estado de São Paulo publicadas no Diário Oficial. Nesta edição do Sou da Paz Analisa, damos destaque aos casos de extorsão mediante sequestro, que tiveram aumento de 143,5% em 2022, comparado ao ano anterior. Nesta modalidade de crime, são registrados os casos que ficaram popularmente conhecidos como “golpe do pix”, dinâmica criminal que vem se popularizando desde 2020. Nos crimes de letalidade violenta, as mortes cometidas por policiais em serviço reduziram em -39% no período. Os casos de homicídio doloso aumentaram em 7,2%, com destaque para a região da Grande São Paulo, com representativos 21,2% de casos a mais registrados em 2022. Os casos de latrocínio aumentaram em 46,5%. Os casos de violência contra a mulher, mais especificamente a modalidade de lesão corporal, vêm aumentando de maneira substancial. As pessoas vulneráveis foram as maiores vitimadas nos casos de estupro registrados em 2022, representando 77% do total dos casos. As dinâmicas de roubo voltaram a subir, com destaque para a Capital, com 12,4% de novos casos no período.</w:t>
       </w:r>
     </w:p>
     <w:p>
@@ -112,54 +52,53 @@
         <w:pStyle w:val="Estilo2"/>
       </w:pPr>
       <w:r>
-        <w:t xml:space="preserve">Criminalidade Violenta</w:t>
-      </w:r>
-    </w:p>
-    <w:p>
-      <w:pPr>
-        <w:pStyle w:val="BodyText"/>
-      </w:pPr>
-      <w:r>
-        <w:t xml:space="preserve">Texto de descrição do</w:t>
-      </w:r>
-      <w:r>
-        <w:t xml:space="preserve"> </w:t>
+        <w:lastRenderedPageBreak/>
+        <w:t>Criminalidade Violenta</w:t>
+      </w:r>
+    </w:p>
+    <w:p>
+      <w:pPr>
+        <w:pStyle w:val="Corpodetexto"/>
+      </w:pPr>
+      <w:r>
+        <w:t xml:space="preserve">Texto de descrição do </w:t>
       </w:r>
       <w:r>
         <w:rPr>
+          <w:i/>
           <w:iCs/>
-          <w:i/>
         </w:rPr>
-        <w:t xml:space="preserve">principal</w:t>
-      </w:r>
-      <w:r>
-        <w:t xml:space="preserve"> </w:t>
-      </w:r>
-      <w:r>
-        <w:t xml:space="preserve">destaque dos dados</w:t>
-      </w:r>
-    </w:p>
-    <w:p>
-      <w:pPr>
-        <w:pStyle w:val="BodyText"/>
-      </w:pPr>
-      <w:r>
+        <w:t>principal</w:t>
+      </w:r>
+      <w:r>
+        <w:t xml:space="preserve"> destaque dos dados</w:t>
+      </w:r>
+    </w:p>
+    <w:p>
+      <w:pPr>
+        <w:pStyle w:val="Corpodetexto"/>
+      </w:pPr>
+      <w:r>
+        <w:rPr>
+          <w:noProof/>
+        </w:rPr>
         <w:drawing>
-          <wp:inline>
+          <wp:inline distT="0" distB="0" distL="0" distR="0" wp14:anchorId="5F0FC1DA" wp14:editId="5F0FC1DB">
             <wp:extent cx="5334000" cy="3556000"/>
-            <wp:effectExtent b="0" l="0" r="0" t="0"/>
-            <wp:docPr descr="" title="" id="21" name="Picture"/>
-            <a:graphic>
+            <wp:effectExtent l="0" t="0" r="0" b="0"/>
+            <wp:docPr id="21" name="Picture"/>
+            <wp:cNvGraphicFramePr/>
+            <a:graphic xmlns:a="http://schemas.openxmlformats.org/drawingml/2006/main">
               <a:graphicData uri="http://schemas.openxmlformats.org/drawingml/2006/picture">
-                <pic:pic>
+                <pic:pic xmlns:pic="http://schemas.openxmlformats.org/drawingml/2006/picture">
                   <pic:nvPicPr>
-                    <pic:cNvPr descr="Relatorio_anual_2022_files/figure-docx/crimes%20violentos-1.png" id="22" name="Picture"/>
+                    <pic:cNvPr id="22" name="Picture" descr="Relatorio_anual_2022_files/figure-docx/crimes%20violentos-1.png"/>
                     <pic:cNvPicPr>
-                      <a:picLocks noChangeArrowheads="1" noChangeAspect="1"/>
+                      <a:picLocks noChangeAspect="1" noChangeArrowheads="1"/>
                     </pic:cNvPicPr>
                   </pic:nvPicPr>
                   <pic:blipFill>
-                    <a:blip r:embed="rId20"/>
+                    <a:blip r:embed="rId7"/>
                     <a:stretch>
                       <a:fillRect/>
                     </a:stretch>
@@ -185,42 +124,39 @@
           </wp:inline>
         </w:drawing>
       </w:r>
-      <w:r>
-        <w:t xml:space="preserve"> </w:t>
-      </w:r>
-      <w:r>
-        <w:t xml:space="preserve">Lorem ipsum dolor sit amet, consectetur adipiscing elit. Sed ut faucibus ligula. Nunc in faucibus diam. Praesent consectetur dapibus neque, ornare venenatis urna fermentum id. Donec quis mi laoreet, cursus felis quis, volutpat orci. Etiam sagittis scelerisque magna et commodo. Integer porta turpis ut augue vestibulum rhoncus. In non erat justo. Nulla a efficitur elit. Ut congue molestie diam, eu pellentesque ipsum molestie ut. Nullam elementum facilisis erat, et fringilla massa facilisis at. Fusce hendrerit ornare nunc non imperdiet. Cras a velit nec diam scelerisque mattis sed ullamcorper nisi. Nam mattis, massa non accumsan gravida, diam massa placerat magna, vel finibus ante nibh nec sapien. Morbi eleifend est et facilisis vehicula. Mauris quis nulla vel ante efficitur condimentum ac eget massa.</w:t>
-      </w:r>
-    </w:p>
-    <w:p>
-      <w:pPr>
-        <w:pStyle w:val="Estilo2"/>
-      </w:pPr>
-      <w:r>
-        <w:t xml:space="preserve">Letalidade Violenta</w:t>
-      </w:r>
-    </w:p>
-    <w:p>
-      <w:pPr>
-        <w:pStyle w:val="BodyText"/>
-      </w:pPr>
-      <w:r>
+    </w:p>
+    <w:p>
+      <w:pPr>
+        <w:pStyle w:val="Corpodetexto"/>
+      </w:pPr>
+      <w:r>
+        <w:t xml:space="preserve">Em 2022, a criminalidade violenta no estado de São Paulo apresentou aumento em todos os tipos criminais analisados, porém a extorsão mediante sequestro é, entre todos, o crime que teve o maior acréscimo, dobrando o número de casos na comparação entre os anos de 2021 e 2022. Esta elevação pode ter como um dos principais fatores uma nova dinâmica, chamada de “sequestros do pix”, modalidade de crime que surgiu com o advento da tecnologia de transferências monetárias de forma imediata, o pix, lançado pelo Banco Central em 2020. O aumento no número total de ocorrências no ano de 2022 também se atrela ao fim das políticas de redução de circulação social e da campanha de vacinação contra Covid-19 que, ao longo dos anos de 2020 e 2021, reduziram o número de pessoas em circulação nas ruas. Ao observarmos outros crimes, também é constatado o aumento nos números de casos, como o estrupo com um acréscimo de 7,3% de registros — mantendo o total agregado acima de 10.000 casos desde a pandemia de Covid-19 —, e o latrocínio e homicídios dolosos que apresentaram aumentos de 7,3% e 7,2%, respectivamente, mas com </w:t>
+      </w:r>
+      <w:r>
+        <w:lastRenderedPageBreak/>
+        <w:t xml:space="preserve">pouca variação bruta.  ::: {custom-style=“Estilo2”} Letalidade Violenta ::: </w:t>
+      </w:r>
+      <w:r>
+        <w:rPr>
+          <w:noProof/>
+        </w:rPr>
         <w:drawing>
-          <wp:inline>
+          <wp:inline distT="0" distB="0" distL="0" distR="0" wp14:anchorId="5F0FC1DC" wp14:editId="5F0FC1DD">
             <wp:extent cx="5334000" cy="3556000"/>
-            <wp:effectExtent b="0" l="0" r="0" t="0"/>
-            <wp:docPr descr="" title="" id="24" name="Picture"/>
-            <a:graphic>
+            <wp:effectExtent l="0" t="0" r="0" b="0"/>
+            <wp:docPr id="24" name="Picture"/>
+            <wp:cNvGraphicFramePr/>
+            <a:graphic xmlns:a="http://schemas.openxmlformats.org/drawingml/2006/main">
               <a:graphicData uri="http://schemas.openxmlformats.org/drawingml/2006/picture">
-                <pic:pic>
+                <pic:pic xmlns:pic="http://schemas.openxmlformats.org/drawingml/2006/picture">
                   <pic:nvPicPr>
-                    <pic:cNvPr descr="Relatorio_anual_2022_files/figure-docx/letalidade%20violenta-1.png" id="25" name="Picture"/>
+                    <pic:cNvPr id="25" name="Picture" descr="Relatorio_anual_2022_files/figure-docx/letalidade%20violenta-1.png"/>
                     <pic:cNvPicPr>
-                      <a:picLocks noChangeArrowheads="1" noChangeAspect="1"/>
+                      <a:picLocks noChangeAspect="1" noChangeArrowheads="1"/>
                     </pic:cNvPicPr>
                   </pic:nvPicPr>
                   <pic:blipFill>
-                    <a:blip r:embed="rId23"/>
+                    <a:blip r:embed="rId8"/>
                     <a:stretch>
                       <a:fillRect/>
                     </a:stretch>
@@ -246,11 +182,13 @@
           </wp:inline>
         </w:drawing>
       </w:r>
-      <w:r>
-        <w:t xml:space="preserve"> </w:t>
-      </w:r>
-      <w:r>
-        <w:t xml:space="preserve">Lorem ipsum dolor sit amet, consectetur adipiscing elit. Sed ut faucibus ligula. Nunc in faucibus diam. Praesent consectetur dapibus neque, ornare venenatis urna fermentum id. Donec quis mi laoreet, cursus felis quis, volutpat orci. Etiam sagittis scelerisque magna et commodo. Integer porta turpis ut augue vestibulum rhoncus. In non erat justo. Nulla a efficitur elit. Ut congue molestie diam, eu pellentesque ipsum molestie ut. Nullam elementum facilisis erat, et fringilla massa facilisis at. Fusce hendrerit ornare nunc non imperdiet. Cras a velit nec diam scelerisque mattis sed ullamcorper nisi. Nam mattis, massa non accumsan gravida, diam massa placerat magna, vel finibus ante nibh nec sapien. Morbi eleifend est et facilisis vehicula. Mauris quis nulla vel ante efficitur condimentum ac eget massa.</w:t>
+    </w:p>
+    <w:p>
+      <w:pPr>
+        <w:pStyle w:val="Corpodetexto"/>
+      </w:pPr>
+      <w:r>
+        <w:t>As mortes cometidas por policiais em serviço reduziram significativamente no estado de São Paulo em 2022. Foram -39% de mortes registradas, comparado ao ano anterior. Em contrapartida, os casos de mortes cometidas por policiais fora de serviço aumentaram em 8% no período analisado, mantendo caráter oscilatório, após queda notável ocorrida em 2019 . Os casos de latrocínio aumentaram em 24%. Num panorama do total de vítimas, houve pouca variação (2%), fenômeno que pode ser explicado se observado a redução dos casos de mortos pela polícia em serviço e o aumento de latrocínios no estado.</w:t>
       </w:r>
     </w:p>
     <w:p>
@@ -263,30 +201,35 @@
         <w:pStyle w:val="Estilo1"/>
       </w:pPr>
       <w:r>
-        <w:t xml:space="preserve">Homicídios</w:t>
-      </w:r>
-    </w:p>
-    <w:p>
-      <w:pPr>
-        <w:pStyle w:val="BodyText"/>
-      </w:pPr>
-      <w:r>
+        <w:lastRenderedPageBreak/>
+        <w:t>Homicídios</w:t>
+      </w:r>
+    </w:p>
+    <w:p>
+      <w:pPr>
+        <w:pStyle w:val="Corpodetexto"/>
+      </w:pPr>
+      <w:r>
+        <w:rPr>
+          <w:noProof/>
+        </w:rPr>
         <w:drawing>
-          <wp:inline>
+          <wp:inline distT="0" distB="0" distL="0" distR="0" wp14:anchorId="5F0FC1DE" wp14:editId="5F0FC1DF">
             <wp:extent cx="5334000" cy="3556000"/>
-            <wp:effectExtent b="0" l="0" r="0" t="0"/>
-            <wp:docPr descr="" title="" id="27" name="Picture"/>
-            <a:graphic>
+            <wp:effectExtent l="0" t="0" r="0" b="0"/>
+            <wp:docPr id="27" name="Picture"/>
+            <wp:cNvGraphicFramePr/>
+            <a:graphic xmlns:a="http://schemas.openxmlformats.org/drawingml/2006/main">
               <a:graphicData uri="http://schemas.openxmlformats.org/drawingml/2006/picture">
-                <pic:pic>
+                <pic:pic xmlns:pic="http://schemas.openxmlformats.org/drawingml/2006/picture">
                   <pic:nvPicPr>
-                    <pic:cNvPr descr="Relatorio_anual_2022_files/figure-docx/homicidios%20macroreg-1.png" id="28" name="Picture"/>
+                    <pic:cNvPr id="28" name="Picture" descr="Relatorio_anual_2022_files/figure-docx/homicidios%20macroreg-1.png"/>
                     <pic:cNvPicPr>
-                      <a:picLocks noChangeArrowheads="1" noChangeAspect="1"/>
+                      <a:picLocks noChangeAspect="1" noChangeArrowheads="1"/>
                     </pic:cNvPicPr>
                   </pic:nvPicPr>
                   <pic:blipFill>
-                    <a:blip r:embed="rId26"/>
+                    <a:blip r:embed="rId9"/>
                     <a:stretch>
                       <a:fillRect/>
                     </a:stretch>
@@ -315,10 +258,10 @@
     </w:p>
     <w:p>
       <w:pPr>
-        <w:pStyle w:val="BodyText"/>
-      </w:pPr>
-      <w:r>
-        <w:t xml:space="preserve">Lorem ipsum dolor sit amet, consectetur adipiscing elit. Sed ut faucibus ligula. Nunc in faucibus diam. Praesent consectetur dapibus neque, ornare venenatis urna fermentum id. Donec quis mi laoreet, cursus felis quis, volutpat orci. Etiam sagittis scelerisque magna et commodo. Integer porta turpis ut augue vestibulum rhoncus. In non erat justo. Nulla a efficitur elit. Ut congue molestie diam, eu pellentesque ipsum molestie ut. Nullam elementum facilisis erat, et fringilla massa facilisis at. Fusce hendrerit ornare nunc non imperdiet. Cras a velit nec diam scelerisque mattis sed ullamcorper nisi. Nam mattis, massa non accumsan gravida, diam massa placerat magna, vel finibus ante nibh nec sapien. Morbi eleifend est et facilisis vehicula. Mauris quis nulla vel ante efficitur condimentum ac eget massa.</w:t>
+        <w:pStyle w:val="Corpodetexto"/>
+      </w:pPr>
+      <w:r>
+        <w:t>Os casos de homicídio doloso seguem com suas variações, que podem ser observadas desde o início da série histórica. Ao comparar o ano de 2022 com 2018, é notada uma redução mínima de -1,4% de casos registrados. Já comparado com 2019, ano pré-pandemia de covid-19, houve aumento de 4,7%. Entre 2022 e 2020, ano em que ocorreram diversas mudanças no comportamento da sociedade em decorrência da pandemia, notamos aumento de 0,6% nos casos de homicídio no estado de São Paulo. Neste período, destaca-se somente a redução da Capital, região em manteve diversas políticas de isolamento social, com -15% de casos registrados. Em 2022, os casos voltaram a subir de maneira notável, com 7,2% de casos de homicídios a mais registrados em São Paulo. O destaque fica com a região da Grande São Paulo, que teve 21,2% de casos a mais no período analisado. No Interior, houve aumento de 5,6% e na Capital, queda de -0,5%. Com esta série é possível constatar que o período pandêmico sofrido entre os anos de 2020 e 2021 não afetou os índices de homicídio doloso no estado de São Paulo, visto que houve pouca variação se comparado aos anos que antecederam a pandemia.</w:t>
       </w:r>
     </w:p>
     <w:p>
@@ -331,30 +274,35 @@
         <w:pStyle w:val="Estilo1"/>
       </w:pPr>
       <w:r>
-        <w:t xml:space="preserve">Latrocínio</w:t>
-      </w:r>
-    </w:p>
-    <w:p>
-      <w:pPr>
-        <w:pStyle w:val="BodyText"/>
-      </w:pPr>
-      <w:r>
+        <w:lastRenderedPageBreak/>
+        <w:t>Latrocínio</w:t>
+      </w:r>
+    </w:p>
+    <w:p>
+      <w:pPr>
+        <w:pStyle w:val="Corpodetexto"/>
+      </w:pPr>
+      <w:r>
+        <w:rPr>
+          <w:noProof/>
+        </w:rPr>
         <w:drawing>
-          <wp:inline>
+          <wp:inline distT="0" distB="0" distL="0" distR="0" wp14:anchorId="5F0FC1E0" wp14:editId="5F0FC1E1">
             <wp:extent cx="5334000" cy="3556000"/>
-            <wp:effectExtent b="0" l="0" r="0" t="0"/>
-            <wp:docPr descr="" title="" id="30" name="Picture"/>
-            <a:graphic>
+            <wp:effectExtent l="0" t="0" r="0" b="0"/>
+            <wp:docPr id="30" name="Picture"/>
+            <wp:cNvGraphicFramePr/>
+            <a:graphic xmlns:a="http://schemas.openxmlformats.org/drawingml/2006/main">
               <a:graphicData uri="http://schemas.openxmlformats.org/drawingml/2006/picture">
-                <pic:pic>
+                <pic:pic xmlns:pic="http://schemas.openxmlformats.org/drawingml/2006/picture">
                   <pic:nvPicPr>
-                    <pic:cNvPr descr="Relatorio_anual_2022_files/figure-docx/lat%20ocorrencia%20macroreg-1.png" id="31" name="Picture"/>
+                    <pic:cNvPr id="31" name="Picture" descr="Relatorio_anual_2022_files/figure-docx/lat%20ocorrencia%20macroreg-1.png"/>
                     <pic:cNvPicPr>
-                      <a:picLocks noChangeArrowheads="1" noChangeAspect="1"/>
+                      <a:picLocks noChangeAspect="1" noChangeArrowheads="1"/>
                     </pic:cNvPicPr>
                   </pic:nvPicPr>
                   <pic:blipFill>
-                    <a:blip r:embed="rId29"/>
+                    <a:blip r:embed="rId10"/>
                     <a:stretch>
                       <a:fillRect/>
                     </a:stretch>
@@ -380,11 +328,13 @@
           </wp:inline>
         </w:drawing>
       </w:r>
-      <w:r>
-        <w:t xml:space="preserve"> </w:t>
-      </w:r>
-      <w:r>
-        <w:t xml:space="preserve">Lorem ipsum dolor sit amet, consectetur adipiscing elit. Sed ut faucibus ligula. Nunc in faucibus diam. Praesent consectetur dapibus neque, ornare venenatis urna fermentum id. Donec quis mi laoreet, cursus felis quis, volutpat orci. Etiam sagittis scelerisque magna et commodo. Integer porta turpis ut augue vestibulum rhoncus. In non erat justo. Nulla a efficitur elit. Ut congue molestie diam, eu pellentesque ipsum molestie ut. Nullam elementum facilisis erat, et fringilla massa facilisis at. Fusce hendrerit ornare nunc non imperdiet. Cras a velit nec diam scelerisque mattis sed ullamcorper nisi. Nam mattis, massa non accumsan gravida, diam massa placerat magna, vel finibus ante nibh nec sapien. Morbi eleifend est et facilisis vehicula. Mauris quis nulla vel ante efficitur condimentum ac eget massa.</w:t>
+    </w:p>
+    <w:p>
+      <w:pPr>
+        <w:pStyle w:val="Corpodetexto"/>
+      </w:pPr>
+      <w:r>
+        <w:t>Em 2022 houveram 178 casos de latrocínios registrados pela polícia paulista, aumento de 7,6% se comparado ao ano anterior. A Capital foi a região que apresentou maior alta no número de casos de latrocínio, saindo de 53 em 2021, para 63 em 2022, um salto de 18,8%. Na comparação entre os anos de 2020 e 2022, não se observa redução significativa no total de casos, porém, a Capital tem o maior acréscimo (46,5%) observado no total de casos entre os dois anos, o que é explicado pela redução do número de pessoas em circulação nas ruas durante o ano de 2020 em razão da pandemia de Covid-19, cenário normalizado em 2022.</w:t>
       </w:r>
     </w:p>
     <w:p>
@@ -397,30 +347,35 @@
         <w:pStyle w:val="Estilo1"/>
       </w:pPr>
       <w:r>
-        <w:t xml:space="preserve">Lesão corporal mulheres</w:t>
-      </w:r>
-    </w:p>
-    <w:p>
-      <w:pPr>
-        <w:pStyle w:val="BodyText"/>
-      </w:pPr>
-      <w:r>
+        <w:lastRenderedPageBreak/>
+        <w:t>Lesão corporal mulheres</w:t>
+      </w:r>
+    </w:p>
+    <w:p>
+      <w:pPr>
+        <w:pStyle w:val="Corpodetexto"/>
+      </w:pPr>
+      <w:r>
+        <w:rPr>
+          <w:noProof/>
+        </w:rPr>
         <w:drawing>
-          <wp:inline>
+          <wp:inline distT="0" distB="0" distL="0" distR="0" wp14:anchorId="5F0FC1E2" wp14:editId="5F0FC1E3">
             <wp:extent cx="5334000" cy="3556000"/>
-            <wp:effectExtent b="0" l="0" r="0" t="0"/>
-            <wp:docPr descr="" title="" id="33" name="Picture"/>
-            <a:graphic>
+            <wp:effectExtent l="0" t="0" r="0" b="0"/>
+            <wp:docPr id="33" name="Picture"/>
+            <wp:cNvGraphicFramePr/>
+            <a:graphic xmlns:a="http://schemas.openxmlformats.org/drawingml/2006/main">
               <a:graphicData uri="http://schemas.openxmlformats.org/drawingml/2006/picture">
-                <pic:pic>
+                <pic:pic xmlns:pic="http://schemas.openxmlformats.org/drawingml/2006/picture">
                   <pic:nvPicPr>
-                    <pic:cNvPr descr="Relatorio_anual_2022_files/figure-docx/lesao%20mulheres%20macroreg-1.png" id="34" name="Picture"/>
+                    <pic:cNvPr id="34" name="Picture" descr="Relatorio_anual_2022_files/figure-docx/lesao%20mulheres%20macroreg-1.png"/>
                     <pic:cNvPicPr>
-                      <a:picLocks noChangeArrowheads="1" noChangeAspect="1"/>
+                      <a:picLocks noChangeAspect="1" noChangeArrowheads="1"/>
                     </pic:cNvPicPr>
                   </pic:nvPicPr>
                   <pic:blipFill>
-                    <a:blip r:embed="rId32"/>
+                    <a:blip r:embed="rId11"/>
                     <a:stretch>
                       <a:fillRect/>
                     </a:stretch>
@@ -446,42 +401,56 @@
           </wp:inline>
         </w:drawing>
       </w:r>
-      <w:r>
-        <w:t xml:space="preserve"> </w:t>
-      </w:r>
-      <w:r>
-        <w:t xml:space="preserve">Lorem ipsum dolor sit amet, consectetur adipiscing elit. Sed ut faucibus ligula. Nunc in faucibus diam. Praesent consectetur dapibus neque, ornare venenatis urna fermentum id. Donec quis mi laoreet, cursus felis quis, volutpat orci. Etiam sagittis scelerisque magna et commodo. Integer porta turpis ut augue vestibulum rhoncus. In non erat justo. Nulla a efficitur elit. Ut congue molestie diam, eu pellentesque ipsum molestie ut. Nullam elementum facilisis erat, et fringilla massa facilisis at. Fusce hendrerit ornare nunc non imperdiet. Cras a velit nec diam scelerisque mattis sed ullamcorper nisi. Nam mattis, massa non accumsan gravida, diam massa placerat magna, vel finibus ante nibh nec sapien. Morbi eleifend est et facilisis vehicula. Mauris quis nulla vel ante efficitur condimentum ac eget massa.</w:t>
+    </w:p>
+    <w:p>
+      <w:pPr>
+        <w:pStyle w:val="Corpodetexto"/>
+      </w:pPr>
+      <w:r>
+        <w:t xml:space="preserve">Ao menos 52.672 casos de lesão corporal de mulheres foram registrados em 2022 no estado de São Paulo, um aumento de 1,38% em comparação a 2021. Desde o início da série histórica esta modalidade de crime vem sofrendo variações. Sua queda em 2020 pode estar atrelada às subnotificações dos casos, provocada pelo isolamento social em decorrência da pandemia de covid-19. O aumento progressivo que vem sendo observado desde então denota a urgência de se pensar políticas públicas para a redução efetiva dos casos de lesão corporal contra a mulher. </w:t>
+      </w:r>
+    </w:p>
+    <w:p>
+      <w:r>
+        <w:br w:type="page"/>
       </w:r>
     </w:p>
     <w:p>
       <w:pPr>
         <w:pStyle w:val="Estilo1"/>
       </w:pPr>
-      <w:r>
-        <w:t xml:space="preserve">Estupro</w:t>
-      </w:r>
-    </w:p>
-    <w:p>
-      <w:pPr>
-        <w:pStyle w:val="BodyText"/>
-      </w:pPr>
-      <w:r>
+      <w:proofErr w:type="spellStart"/>
+      <w:r>
+        <w:lastRenderedPageBreak/>
+        <w:t>Estupro</w:t>
+      </w:r>
+      <w:proofErr w:type="spellEnd"/>
+    </w:p>
+    <w:p>
+      <w:pPr>
+        <w:pStyle w:val="Corpodetexto"/>
+      </w:pPr>
+      <w:r>
+        <w:rPr>
+          <w:noProof/>
+        </w:rPr>
         <w:drawing>
-          <wp:inline>
+          <wp:inline distT="0" distB="0" distL="0" distR="0" wp14:anchorId="5F0FC1E4" wp14:editId="5F0FC1E5">
             <wp:extent cx="5334000" cy="3556000"/>
-            <wp:effectExtent b="0" l="0" r="0" t="0"/>
-            <wp:docPr descr="" title="" id="36" name="Picture"/>
-            <a:graphic>
+            <wp:effectExtent l="0" t="0" r="0" b="0"/>
+            <wp:docPr id="36" name="Picture"/>
+            <wp:cNvGraphicFramePr/>
+            <a:graphic xmlns:a="http://schemas.openxmlformats.org/drawingml/2006/main">
               <a:graphicData uri="http://schemas.openxmlformats.org/drawingml/2006/picture">
-                <pic:pic>
+                <pic:pic xmlns:pic="http://schemas.openxmlformats.org/drawingml/2006/picture">
                   <pic:nvPicPr>
-                    <pic:cNvPr descr="Relatorio_anual_2022_files/figure-docx/estupro-1.png" id="37" name="Picture"/>
+                    <pic:cNvPr id="37" name="Picture" descr="Relatorio_anual_2022_files/figure-docx/estupro-1.png"/>
                     <pic:cNvPicPr>
-                      <a:picLocks noChangeArrowheads="1" noChangeAspect="1"/>
+                      <a:picLocks noChangeAspect="1" noChangeArrowheads="1"/>
                     </pic:cNvPicPr>
                   </pic:nvPicPr>
                   <pic:blipFill>
-                    <a:blip r:embed="rId35"/>
+                    <a:blip r:embed="rId12"/>
                     <a:stretch>
                       <a:fillRect/>
                     </a:stretch>
@@ -507,11 +476,13 @@
           </wp:inline>
         </w:drawing>
       </w:r>
-      <w:r>
-        <w:t xml:space="preserve"> </w:t>
-      </w:r>
-      <w:r>
-        <w:t xml:space="preserve">Lorem ipsum dolor sit amet, consectetur adipiscing elit. Sed ut faucibus ligula. Nunc in faucibus diam. Praesent consectetur dapibus neque, ornare venenatis urna fermentum id. Donec quis mi laoreet, cursus felis quis, volutpat orci. Etiam sagittis scelerisque magna et commodo. Integer porta turpis ut augue vestibulum rhoncus. In non erat justo. Nulla a efficitur elit. Ut congue molestie diam, eu pellentesque ipsum molestie ut. Nullam elementum facilisis erat, et fringilla massa facilisis at. Fusce hendrerit ornare nunc non imperdiet. Cras a velit nec diam scelerisque mattis sed ullamcorper nisi. Nam mattis, massa non accumsan gravida, diam massa placerat magna, vel finibus ante nibh nec sapien. Morbi eleifend est et facilisis vehicula. Mauris quis nulla vel ante efficitur condimentum ac eget massa.</w:t>
+    </w:p>
+    <w:p>
+      <w:pPr>
+        <w:pStyle w:val="Corpodetexto"/>
+      </w:pPr>
+      <w:r>
+        <w:t xml:space="preserve">Os casos de estupro aumentaram 7,3% em comparação a 2021, e uma variação geral no período de 2019 a 2022 de 1,9%. A tendência de crescimento nos casos de violência sexual também se confirma entre estupro de vulneráveis, que aumentou 5,4% para o mesmo período. Entre 2021 e 2022, foram registrados 715 casos a mais de estupro de vulnerável, uma média 2 casos registrados por dia no estado. Somente na Capital houve redução nas ocorrências estupro (de vulnerável ou não), respectivamente, de -8,1% e -4,7%. Na Grande São Paulo, o aumento foi de 5,8% para vulnerável, e 7,8% para estupro em geral, enquanto no Interior houve aumento de 4,3% nos casos de estupro, e 8,1% nos casos de estupro de vulnerável entre 2018 e 2022. O estupro de vulneráveis (contra vítimas menores de 14 anos ou pessoas cujas condições de saúde as impedem de discernir o ato sexual) compõe 77% do total dos casos de estupros registrados em 2022. </w:t>
       </w:r>
     </w:p>
     <w:p>
@@ -524,30 +495,100 @@
         <w:pStyle w:val="Estilo1"/>
       </w:pPr>
       <w:r>
-        <w:t xml:space="preserve">Roubo outros</w:t>
-      </w:r>
-    </w:p>
-    <w:p>
-      <w:pPr>
-        <w:pStyle w:val="BodyText"/>
-      </w:pPr>
-      <w:r>
+        <w:lastRenderedPageBreak/>
+        <w:t>Feminicídio</w:t>
+      </w:r>
+    </w:p>
+    <w:p>
+      <w:pPr>
+        <w:pStyle w:val="Corpodetexto"/>
+      </w:pPr>
+      <w:r>
+        <w:rPr>
+          <w:noProof/>
+        </w:rPr>
         <w:drawing>
-          <wp:inline>
-            <wp:extent cx="5334000" cy="3556000"/>
-            <wp:effectExtent b="0" l="0" r="0" t="0"/>
-            <wp:docPr descr="" title="" id="39" name="Picture"/>
-            <a:graphic>
+          <wp:inline distT="0" distB="0" distL="0" distR="0" wp14:anchorId="5F0FC1E6" wp14:editId="5F0FC1E7">
+            <wp:extent cx="5334000" cy="4000500"/>
+            <wp:effectExtent l="0" t="0" r="0" b="0"/>
+            <wp:docPr id="39" name="Picture"/>
+            <wp:cNvGraphicFramePr/>
+            <a:graphic xmlns:a="http://schemas.openxmlformats.org/drawingml/2006/main">
               <a:graphicData uri="http://schemas.openxmlformats.org/drawingml/2006/picture">
-                <pic:pic>
+                <pic:pic xmlns:pic="http://schemas.openxmlformats.org/drawingml/2006/picture">
                   <pic:nvPicPr>
-                    <pic:cNvPr descr="Relatorio_anual_2022_files/figure-docx/roubo-1.png" id="40" name="Picture"/>
+                    <pic:cNvPr id="40" name="Picture" descr="Relatorio_anual_2022_files/figure-docx/feminicídio-1.png"/>
                     <pic:cNvPicPr>
-                      <a:picLocks noChangeArrowheads="1" noChangeAspect="1"/>
+                      <a:picLocks noChangeAspect="1" noChangeArrowheads="1"/>
                     </pic:cNvPicPr>
                   </pic:nvPicPr>
                   <pic:blipFill>
-                    <a:blip r:embed="rId38"/>
+                    <a:blip r:embed="rId13"/>
+                    <a:stretch>
+                      <a:fillRect/>
+                    </a:stretch>
+                  </pic:blipFill>
+                  <pic:spPr bwMode="auto">
+                    <a:xfrm>
+                      <a:off x="0" y="0"/>
+                      <a:ext cx="5334000" cy="4000500"/>
+                    </a:xfrm>
+                    <a:prstGeom prst="rect">
+                      <a:avLst/>
+                    </a:prstGeom>
+                    <a:noFill/>
+                    <a:ln w="9525">
+                      <a:noFill/>
+                      <a:headEnd/>
+                      <a:tailEnd/>
+                    </a:ln>
+                  </pic:spPr>
+                </pic:pic>
+              </a:graphicData>
+            </a:graphic>
+          </wp:inline>
+        </w:drawing>
+      </w:r>
+    </w:p>
+    <w:p>
+      <w:r>
+        <w:br w:type="page"/>
+      </w:r>
+    </w:p>
+    <w:p>
+      <w:pPr>
+        <w:pStyle w:val="Estilo1"/>
+      </w:pPr>
+      <w:r>
+        <w:lastRenderedPageBreak/>
+        <w:t>Total de Roubos</w:t>
+      </w:r>
+    </w:p>
+    <w:p>
+      <w:pPr>
+        <w:pStyle w:val="Corpodetexto"/>
+      </w:pPr>
+      <w:r>
+        <w:rPr>
+          <w:noProof/>
+        </w:rPr>
+        <w:drawing>
+          <wp:inline distT="0" distB="0" distL="0" distR="0" wp14:anchorId="5F0FC1E8" wp14:editId="5F0FC1E9">
+            <wp:extent cx="5334000" cy="3556000"/>
+            <wp:effectExtent l="0" t="0" r="0" b="0"/>
+            <wp:docPr id="42" name="Picture"/>
+            <wp:cNvGraphicFramePr/>
+            <a:graphic xmlns:a="http://schemas.openxmlformats.org/drawingml/2006/main">
+              <a:graphicData uri="http://schemas.openxmlformats.org/drawingml/2006/picture">
+                <pic:pic xmlns:pic="http://schemas.openxmlformats.org/drawingml/2006/picture">
+                  <pic:nvPicPr>
+                    <pic:cNvPr id="43" name="Picture" descr="Relatorio_anual_2022_files/figure-docx/roubo-1.png"/>
+                    <pic:cNvPicPr>
+                      <a:picLocks noChangeAspect="1" noChangeArrowheads="1"/>
+                    </pic:cNvPicPr>
+                  </pic:nvPicPr>
+                  <pic:blipFill>
+                    <a:blip r:embed="rId14"/>
                     <a:stretch>
                       <a:fillRect/>
                     </a:stretch>
@@ -573,35 +614,62 @@
           </wp:inline>
         </w:drawing>
       </w:r>
-      <w:r>
-        <w:t xml:space="preserve"> </w:t>
-      </w:r>
-      <w:r>
-        <w:t xml:space="preserve">Lorem ipsum dolor sit amet, consectetur adipiscing elit. Sed ut faucibus ligula. Nunc in faucibus diam. Praesent consectetur dapibus neque, ornare venenatis urna fermentum id. Donec quis mi laoreet, cursus felis quis, volutpat orci. Etiam sagittis scelerisque magna et commodo. Integer porta turpis ut augue vestibulum rhoncus. In non erat justo. Nulla a efficitur elit. Ut congue molestie diam, eu pellentesque ipsum molestie ut. Nullam elementum facilisis erat, et fringilla massa facilisis at. Fusce hendrerit ornare nunc non imperdiet. Cras a velit nec diam scelerisque mattis sed ullamcorper nisi. Nam mattis, massa non accumsan gravida, diam massa placerat magna, vel finibus ante nibh nec sapien. Morbi eleifend est et facilisis vehicula. Mauris quis nulla vel ante efficitur condimentum ac eget massa.</w:t>
-      </w:r>
-    </w:p>
-    <w:sectPr/>
+    </w:p>
+    <w:p>
+      <w:pPr>
+        <w:pStyle w:val="Corpodetexto"/>
+      </w:pPr>
+      <w:r>
+        <w:t>O ano de 2022 terminou com um total de 286.573 casos de roubos (outros) em todo o estado de São Paulo, 10,75% maior que o total do ano anterior, que fechou com 258.747 casos registrados pela polícia, com a Capital paulista demonstrando o maior aumento percentual dentre todas ass regiões do estado, crescimento de 12,4%. Este aumento também é elevado quando se compara os totais de 2020 com 2022, apresentando um aumento de 14,30%, o que pode se inferir sendo um reflexo da pandemia de Covid-19, que durante o ano de 2020 teve seu maior pico de contágio e as políticas de redução de livre circulação de maior rigor, diminuindo a quantidade de pessoas em movimento nas ruas, o que em 2022 não é mais observado, com a população voltando completamente à circulação.</w:t>
+      </w:r>
+    </w:p>
+    <w:sectPr>
+      <w:pgSz w:w="12240" w:h="15840"/>
+      <w:pgMar w:top="1417" w:right="1701" w:bottom="1417" w:left="1701" w:header="720" w:footer="720" w:gutter="0"/>
+      <w:cols w:space="720"/>
+    </w:sectPr>
   </w:body>
 </w:document>
 </file>
 
-<file path=word/comments.xml><?xml version="1.0" encoding="utf-8"?>
-<w:comments xmlns:w="http://schemas.openxmlformats.org/wordprocessingml/2006/main" xmlns:m="http://schemas.openxmlformats.org/officeDocument/2006/math" xmlns:r="http://schemas.openxmlformats.org/officeDocument/2006/relationships" xmlns:o="urn:schemas-microsoft-com:office:office" xmlns:v="urn:schemas-microsoft-com:vml" xmlns:w10="urn:schemas-microsoft-com:office:word" xmlns:a="http://schemas.openxmlformats.org/drawingml/2006/main" xmlns:pic="http://schemas.openxmlformats.org/drawingml/2006/picture" xmlns:wp="http://schemas.openxmlformats.org/drawingml/2006/wordprocessingDrawing"/>
+<file path=word/endnotes.xml><?xml version="1.0" encoding="utf-8"?>
+<w:endnotes xmlns:wpc="http://schemas.microsoft.com/office/word/2010/wordprocessingCanvas" xmlns:cx="http://schemas.microsoft.com/office/drawing/2014/chartex" xmlns:cx1="http://schemas.microsoft.com/office/drawing/2015/9/8/chartex" xmlns:cx2="http://schemas.microsoft.com/office/drawing/2015/10/21/chartex" xmlns:cx3="http://schemas.microsoft.com/office/drawing/2016/5/9/chartex" xmlns:cx4="http://schemas.microsoft.com/office/drawing/2016/5/10/chartex" xmlns:cx5="http://schemas.microsoft.com/office/drawing/2016/5/11/chartex" xmlns:cx6="http://schemas.microsoft.com/office/drawing/2016/5/12/chartex" xmlns:cx7="http://schemas.microsoft.com/office/drawing/2016/5/13/chartex" xmlns:cx8="http://schemas.microsoft.com/office/drawing/2016/5/14/chartex" xmlns:mc="http://schemas.openxmlformats.org/markup-compatibility/2006" xmlns:aink="http://schemas.microsoft.com/office/drawing/2016/ink" xmlns:am3d="http://schemas.microsoft.com/office/drawing/2017/model3d" xmlns:o="urn:schemas-microsoft-com:office:office" xmlns:oel="http://schemas.microsoft.com/office/2019/extlst" xmlns:r="http://schemas.openxmlformats.org/officeDocument/2006/relationships" xmlns:m="http://schemas.openxmlformats.org/officeDocument/2006/math" xmlns:v="urn:schemas-microsoft-com:vml" xmlns:wp14="http://schemas.microsoft.com/office/word/2010/wordprocessingDrawing" xmlns:wp="http://schemas.openxmlformats.org/drawingml/2006/wordprocessingDrawing" xmlns:w10="urn:schemas-microsoft-com:office:word" xmlns:w="http://schemas.openxmlformats.org/wordprocessingml/2006/main" xmlns:w14="http://schemas.microsoft.com/office/word/2010/wordml" xmlns:w15="http://schemas.microsoft.com/office/word/2012/wordml" xmlns:w16cex="http://schemas.microsoft.com/office/word/2018/wordml/cex" xmlns:w16cid="http://schemas.microsoft.com/office/word/2016/wordml/cid" xmlns:w16="http://schemas.microsoft.com/office/word/2018/wordml" xmlns:w16sdtdh="http://schemas.microsoft.com/office/word/2020/wordml/sdtdatahash" xmlns:w16se="http://schemas.microsoft.com/office/word/2015/wordml/symex" xmlns:wpg="http://schemas.microsoft.com/office/word/2010/wordprocessingGroup" xmlns:wpi="http://schemas.microsoft.com/office/word/2010/wordprocessingInk" xmlns:wne="http://schemas.microsoft.com/office/word/2006/wordml" xmlns:wps="http://schemas.microsoft.com/office/word/2010/wordprocessingShape" mc:Ignorable="w14 w15 w16se w16cid w16 w16cex w16sdtdh wp14">
+  <w:endnote w:type="separator" w:id="-1">
+    <w:p>
+      <w:pPr>
+        <w:spacing w:after="0"/>
+      </w:pPr>
+      <w:r>
+        <w:separator/>
+      </w:r>
+    </w:p>
+  </w:endnote>
+  <w:endnote w:type="continuationSeparator" w:id="0">
+    <w:p>
+      <w:pPr>
+        <w:spacing w:after="0"/>
+      </w:pPr>
+      <w:r>
+        <w:continuationSeparator/>
+      </w:r>
+    </w:p>
+  </w:endnote>
+</w:endnotes>
 </file>
 
 <file path=word/footnotes.xml><?xml version="1.0" encoding="utf-8"?>
-<w:footnotes xmlns:w="http://schemas.openxmlformats.org/wordprocessingml/2006/main" xmlns:m="http://schemas.openxmlformats.org/officeDocument/2006/math" xmlns:r="http://schemas.openxmlformats.org/officeDocument/2006/relationships" xmlns:o="urn:schemas-microsoft-com:office:office" xmlns:v="urn:schemas-microsoft-com:vml" xmlns:w10="urn:schemas-microsoft-com:office:word" xmlns:a="http://schemas.openxmlformats.org/drawingml/2006/main" xmlns:pic="http://schemas.openxmlformats.org/drawingml/2006/picture" xmlns:wp="http://schemas.openxmlformats.org/drawingml/2006/wordprocessingDrawing">
+<w:footnotes xmlns:wpc="http://schemas.microsoft.com/office/word/2010/wordprocessingCanvas" xmlns:cx="http://schemas.microsoft.com/office/drawing/2014/chartex" xmlns:cx1="http://schemas.microsoft.com/office/drawing/2015/9/8/chartex" xmlns:cx2="http://schemas.microsoft.com/office/drawing/2015/10/21/chartex" xmlns:cx3="http://schemas.microsoft.com/office/drawing/2016/5/9/chartex" xmlns:cx4="http://schemas.microsoft.com/office/drawing/2016/5/10/chartex" xmlns:cx5="http://schemas.microsoft.com/office/drawing/2016/5/11/chartex" xmlns:cx6="http://schemas.microsoft.com/office/drawing/2016/5/12/chartex" xmlns:cx7="http://schemas.microsoft.com/office/drawing/2016/5/13/chartex" xmlns:cx8="http://schemas.microsoft.com/office/drawing/2016/5/14/chartex" xmlns:mc="http://schemas.openxmlformats.org/markup-compatibility/2006" xmlns:aink="http://schemas.microsoft.com/office/drawing/2016/ink" xmlns:am3d="http://schemas.microsoft.com/office/drawing/2017/model3d" xmlns:o="urn:schemas-microsoft-com:office:office" xmlns:oel="http://schemas.microsoft.com/office/2019/extlst" xmlns:r="http://schemas.openxmlformats.org/officeDocument/2006/relationships" xmlns:m="http://schemas.openxmlformats.org/officeDocument/2006/math" xmlns:v="urn:schemas-microsoft-com:vml" xmlns:wp14="http://schemas.microsoft.com/office/word/2010/wordprocessingDrawing" xmlns:wp="http://schemas.openxmlformats.org/drawingml/2006/wordprocessingDrawing" xmlns:w10="urn:schemas-microsoft-com:office:word" xmlns:w="http://schemas.openxmlformats.org/wordprocessingml/2006/main" xmlns:w14="http://schemas.microsoft.com/office/word/2010/wordml" xmlns:w15="http://schemas.microsoft.com/office/word/2012/wordml" xmlns:w16cex="http://schemas.microsoft.com/office/word/2018/wordml/cex" xmlns:w16cid="http://schemas.microsoft.com/office/word/2016/wordml/cid" xmlns:w16="http://schemas.microsoft.com/office/word/2018/wordml" xmlns:w16sdtdh="http://schemas.microsoft.com/office/word/2020/wordml/sdtdatahash" xmlns:w16se="http://schemas.microsoft.com/office/word/2015/wordml/symex" xmlns:wpg="http://schemas.microsoft.com/office/word/2010/wordprocessingGroup" xmlns:wpi="http://schemas.microsoft.com/office/word/2010/wordprocessingInk" xmlns:wne="http://schemas.microsoft.com/office/word/2006/wordml" xmlns:wps="http://schemas.microsoft.com/office/word/2010/wordprocessingShape" mc:Ignorable="w14 w15 w16se w16cid w16 w16cex w16sdtdh wp14">
+  <w:footnote w:type="separator" w:id="-1">
+    <w:p>
+      <w:r>
+        <w:separator/>
+      </w:r>
+    </w:p>
+  </w:footnote>
   <w:footnote w:type="continuationSeparator" w:id="0">
     <w:p>
       <w:r>
         <w:continuationSeparator/>
-      </w:r>
-    </w:p>
-  </w:footnote>
-  <w:footnote w:type="separator" w:id="-1">
-    <w:p>
-      <w:r>
-        <w:separator/>
       </w:r>
     </w:p>
   </w:footnote>
@@ -609,10 +677,11 @@
 </file>
 
 <file path=word/numbering.xml><?xml version="1.0" encoding="utf-8"?>
-<w:numbering xmlns:w="http://schemas.openxmlformats.org/wordprocessingml/2006/main">
-  <w:abstractNum w:abstractNumId="990">
-    <w:nsid w:val="A990"/>
+<w:numbering xmlns:wpc="http://schemas.microsoft.com/office/word/2010/wordprocessingCanvas" xmlns:cx="http://schemas.microsoft.com/office/drawing/2014/chartex" xmlns:cx1="http://schemas.microsoft.com/office/drawing/2015/9/8/chartex" xmlns:cx2="http://schemas.microsoft.com/office/drawing/2015/10/21/chartex" xmlns:cx3="http://schemas.microsoft.com/office/drawing/2016/5/9/chartex" xmlns:cx4="http://schemas.microsoft.com/office/drawing/2016/5/10/chartex" xmlns:cx5="http://schemas.microsoft.com/office/drawing/2016/5/11/chartex" xmlns:cx6="http://schemas.microsoft.com/office/drawing/2016/5/12/chartex" xmlns:cx7="http://schemas.microsoft.com/office/drawing/2016/5/13/chartex" xmlns:cx8="http://schemas.microsoft.com/office/drawing/2016/5/14/chartex" xmlns:mc="http://schemas.openxmlformats.org/markup-compatibility/2006" xmlns:aink="http://schemas.microsoft.com/office/drawing/2016/ink" xmlns:am3d="http://schemas.microsoft.com/office/drawing/2017/model3d" xmlns:o="urn:schemas-microsoft-com:office:office" xmlns:oel="http://schemas.microsoft.com/office/2019/extlst" xmlns:r="http://schemas.openxmlformats.org/officeDocument/2006/relationships" xmlns:m="http://schemas.openxmlformats.org/officeDocument/2006/math" xmlns:v="urn:schemas-microsoft-com:vml" xmlns:wp14="http://schemas.microsoft.com/office/word/2010/wordprocessingDrawing" xmlns:wp="http://schemas.openxmlformats.org/drawingml/2006/wordprocessingDrawing" xmlns:w10="urn:schemas-microsoft-com:office:word" xmlns:w="http://schemas.openxmlformats.org/wordprocessingml/2006/main" xmlns:w14="http://schemas.microsoft.com/office/word/2010/wordml" xmlns:w15="http://schemas.microsoft.com/office/word/2012/wordml" xmlns:w16cex="http://schemas.microsoft.com/office/word/2018/wordml/cex" xmlns:w16cid="http://schemas.microsoft.com/office/word/2016/wordml/cid" xmlns:w16="http://schemas.microsoft.com/office/word/2018/wordml" xmlns:w16sdtdh="http://schemas.microsoft.com/office/word/2020/wordml/sdtdatahash" xmlns:w16se="http://schemas.microsoft.com/office/word/2015/wordml/symex" xmlns:wpg="http://schemas.microsoft.com/office/word/2010/wordprocessingGroup" xmlns:wpi="http://schemas.microsoft.com/office/word/2010/wordprocessingInk" xmlns:wne="http://schemas.microsoft.com/office/word/2006/wordml" xmlns:wps="http://schemas.microsoft.com/office/word/2010/wordprocessingShape" mc:Ignorable="w14 w15 w16se w16cid w16 w16cex w16sdtdh wp14">
+  <w:abstractNum w:abstractNumId="0" w15:restartNumberingAfterBreak="0">
+    <w:nsid w:val="0000A990"/>
     <w:multiLevelType w:val="multilevel"/>
+    <w:tmpl w:val="F50C905A"/>
     <w:lvl w:ilvl="0">
       <w:numFmt w:val="bullet"/>
       <w:lvlText w:val=" "/>
@@ -686,21 +755,21 @@
       </w:pPr>
     </w:lvl>
   </w:abstractNum>
-  <w:num w:numId="1000">
-    <w:abstractNumId w:val="990"/>
+  <w:num w:numId="1" w16cid:durableId="1814517743">
+    <w:abstractNumId w:val="0"/>
   </w:num>
 </w:numbering>
 </file>
 
 <file path=word/styles.xml><?xml version="1.0" encoding="utf-8"?>
-<w:styles xmlns:r="http://schemas.openxmlformats.org/officeDocument/2006/relationships" xmlns:w="http://schemas.openxmlformats.org/wordprocessingml/2006/main">
+<w:styles xmlns:mc="http://schemas.openxmlformats.org/markup-compatibility/2006" xmlns:r="http://schemas.openxmlformats.org/officeDocument/2006/relationships" xmlns:w="http://schemas.openxmlformats.org/wordprocessingml/2006/main" xmlns:w14="http://schemas.microsoft.com/office/word/2010/wordml" xmlns:w15="http://schemas.microsoft.com/office/word/2012/wordml" xmlns:w16cex="http://schemas.microsoft.com/office/word/2018/wordml/cex" xmlns:w16cid="http://schemas.microsoft.com/office/word/2016/wordml/cid" xmlns:w16="http://schemas.microsoft.com/office/word/2018/wordml" xmlns:w16sdtdh="http://schemas.microsoft.com/office/word/2020/wordml/sdtdatahash" xmlns:w16se="http://schemas.microsoft.com/office/word/2015/wordml/symex" mc:Ignorable="w14 w15 w16se w16cid w16 w16cex w16sdtdh">
   <w:docDefaults>
     <w:rPrDefault>
       <w:rPr>
-        <w:rFonts w:asciiTheme="minorHAnsi" w:cstheme="minorBidi" w:eastAsiaTheme="minorHAnsi" w:hAnsiTheme="minorHAnsi"/>
+        <w:rFonts w:asciiTheme="minorHAnsi" w:eastAsiaTheme="minorHAnsi" w:hAnsiTheme="minorHAnsi" w:cstheme="minorBidi"/>
         <w:sz w:val="24"/>
         <w:szCs w:val="24"/>
-        <w:lang w:bidi="ar-SA" w:eastAsia="en-US" w:val="en-US"/>
+        <w:lang w:val="en-US" w:eastAsia="en-US" w:bidi="ar-SA"/>
       </w:rPr>
     </w:rPrDefault>
     <w:pPrDefault>
@@ -709,73 +778,600 @@
       </w:pPr>
     </w:pPrDefault>
   </w:docDefaults>
-  <w:latentStyles w:count="276" w:defLockedState="0" w:defQFormat="0" w:defSemiHidden="0" w:defUIPriority="0" w:defUnhideWhenUsed="0"/>
-  <w:style w:default="1" w:styleId="Normal" w:type="paragraph">
+  <w:latentStyles w:defLockedState="0" w:defUIPriority="0" w:defSemiHidden="0" w:defUnhideWhenUsed="0" w:defQFormat="0" w:count="376">
+    <w:lsdException w:name="heading 5" w:semiHidden="1" w:unhideWhenUsed="1"/>
+    <w:lsdException w:name="index 2" w:semiHidden="1" w:unhideWhenUsed="1"/>
+    <w:lsdException w:name="index 3" w:semiHidden="1" w:unhideWhenUsed="1"/>
+    <w:lsdException w:name="index 4" w:semiHidden="1" w:unhideWhenUsed="1"/>
+    <w:lsdException w:name="index 5" w:semiHidden="1" w:unhideWhenUsed="1"/>
+    <w:lsdException w:name="index 6" w:semiHidden="1" w:unhideWhenUsed="1"/>
+    <w:lsdException w:name="index 7" w:semiHidden="1" w:unhideWhenUsed="1"/>
+    <w:lsdException w:name="index 8" w:semiHidden="1" w:unhideWhenUsed="1"/>
+    <w:lsdException w:name="index 9" w:semiHidden="1" w:unhideWhenUsed="1"/>
+    <w:lsdException w:name="toc 1" w:semiHidden="1" w:unhideWhenUsed="1"/>
+    <w:lsdException w:name="toc 2" w:semiHidden="1" w:unhideWhenUsed="1"/>
+    <w:lsdException w:name="toc 3" w:semiHidden="1" w:unhideWhenUsed="1"/>
+    <w:lsdException w:name="toc 4" w:semiHidden="1" w:unhideWhenUsed="1"/>
+    <w:lsdException w:name="toc 5" w:semiHidden="1" w:unhideWhenUsed="1"/>
+    <w:lsdException w:name="toc 6" w:semiHidden="1" w:unhideWhenUsed="1"/>
+    <w:lsdException w:name="toc 7" w:semiHidden="1" w:unhideWhenUsed="1"/>
+    <w:lsdException w:name="toc 8" w:semiHidden="1" w:unhideWhenUsed="1"/>
+    <w:lsdException w:name="toc 9" w:semiHidden="1" w:unhideWhenUsed="1"/>
+    <w:lsdException w:name="Normal Indent" w:semiHidden="1" w:unhideWhenUsed="1"/>
+    <w:lsdException w:name="footnote text" w:semiHidden="1" w:unhideWhenUsed="1"/>
+    <w:lsdException w:name="annotation text" w:semiHidden="1" w:unhideWhenUsed="1"/>
+    <w:lsdException w:name="header" w:semiHidden="1" w:unhideWhenUsed="1"/>
+    <w:lsdException w:name="footer" w:semiHidden="1" w:unhideWhenUsed="1"/>
+    <w:lsdException w:name="index heading" w:semiHidden="1" w:unhideWhenUsed="1"/>
+    <w:lsdException w:name="caption" w:semiHidden="1" w:unhideWhenUsed="1"/>
+    <w:lsdException w:name="table of figures" w:semiHidden="1" w:unhideWhenUsed="1"/>
+    <w:lsdException w:name="envelope address" w:semiHidden="1" w:unhideWhenUsed="1"/>
+    <w:lsdException w:name="envelope return" w:semiHidden="1" w:unhideWhenUsed="1"/>
+    <w:lsdException w:name="footnote reference" w:semiHidden="1" w:unhideWhenUsed="1"/>
+    <w:lsdException w:name="annotation reference" w:semiHidden="1" w:unhideWhenUsed="1"/>
+    <w:lsdException w:name="line number" w:semiHidden="1" w:unhideWhenUsed="1"/>
+    <w:lsdException w:name="page number" w:semiHidden="1" w:unhideWhenUsed="1"/>
+    <w:lsdException w:name="endnote reference" w:semiHidden="1" w:unhideWhenUsed="1"/>
+    <w:lsdException w:name="endnote text" w:semiHidden="1" w:unhideWhenUsed="1"/>
+    <w:lsdException w:name="table of authorities" w:semiHidden="1" w:unhideWhenUsed="1"/>
+    <w:lsdException w:name="macro" w:semiHidden="1" w:unhideWhenUsed="1"/>
+    <w:lsdException w:name="toa heading" w:semiHidden="1" w:unhideWhenUsed="1"/>
+    <w:lsdException w:name="List" w:semiHidden="1" w:unhideWhenUsed="1"/>
+    <w:lsdException w:name="List Bullet" w:semiHidden="1" w:unhideWhenUsed="1"/>
+    <w:lsdException w:name="List Number" w:semiHidden="1" w:unhideWhenUsed="1"/>
+    <w:lsdException w:name="List 2" w:semiHidden="1" w:unhideWhenUsed="1"/>
+    <w:lsdException w:name="List 3" w:semiHidden="1" w:unhideWhenUsed="1"/>
+    <w:lsdException w:name="List 4" w:semiHidden="1" w:unhideWhenUsed="1"/>
+    <w:lsdException w:name="List Bullet 2" w:semiHidden="1" w:unhideWhenUsed="1"/>
+    <w:lsdException w:name="List Bullet 3" w:semiHidden="1" w:unhideWhenUsed="1"/>
+    <w:lsdException w:name="List Number 2" w:semiHidden="1" w:unhideWhenUsed="1"/>
+    <w:lsdException w:name="List Number 3" w:semiHidden="1" w:unhideWhenUsed="1"/>
+    <w:lsdException w:name="List Number 4" w:semiHidden="1" w:unhideWhenUsed="1"/>
+    <w:lsdException w:name="List Number 5" w:semiHidden="1" w:unhideWhenUsed="1"/>
+    <w:lsdException w:name="Closing" w:semiHidden="1" w:unhideWhenUsed="1"/>
+    <w:lsdException w:name="Signature" w:semiHidden="1" w:unhideWhenUsed="1"/>
+    <w:lsdException w:name="Default Paragraph Font" w:semiHidden="1" w:unhideWhenUsed="1"/>
+    <w:lsdException w:name="Body Text" w:semiHidden="1" w:unhideWhenUsed="1"/>
+    <w:lsdException w:name="Body Text Indent" w:semiHidden="1" w:unhideWhenUsed="1"/>
+    <w:lsdException w:name="List Continue" w:semiHidden="1" w:unhideWhenUsed="1"/>
+    <w:lsdException w:name="List Continue 2" w:semiHidden="1" w:unhideWhenUsed="1"/>
+    <w:lsdException w:name="List Continue 3" w:semiHidden="1" w:unhideWhenUsed="1"/>
+    <w:lsdException w:name="List Continue 4" w:semiHidden="1" w:unhideWhenUsed="1"/>
+    <w:lsdException w:name="List Continue 5" w:semiHidden="1" w:unhideWhenUsed="1"/>
+    <w:lsdException w:name="Message Header" w:semiHidden="1" w:unhideWhenUsed="1"/>
+    <w:lsdException w:name="Salutation" w:semiHidden="1" w:unhideWhenUsed="1"/>
+    <w:lsdException w:name="Date" w:semiHidden="1" w:unhideWhenUsed="1"/>
+    <w:lsdException w:name="Body Text First Indent" w:semiHidden="1" w:unhideWhenUsed="1"/>
+    <w:lsdException w:name="Body Text Indent 2" w:semiHidden="1" w:unhideWhenUsed="1"/>
+    <w:lsdException w:name="Body Text Indent 3" w:semiHidden="1" w:unhideWhenUsed="1"/>
+    <w:lsdException w:name="Block Text" w:semiHidden="1" w:unhideWhenUsed="1"/>
+    <w:lsdException w:name="Hyperlink" w:semiHidden="1" w:unhideWhenUsed="1"/>
+    <w:lsdException w:name="FollowedHyperlink" w:semiHidden="1" w:unhideWhenUsed="1"/>
+    <w:lsdException w:name="Document Map" w:semiHidden="1" w:unhideWhenUsed="1"/>
+    <w:lsdException w:name="Plain Text" w:semiHidden="1" w:unhideWhenUsed="1"/>
+    <w:lsdException w:name="E-mail Signature" w:semiHidden="1" w:unhideWhenUsed="1"/>
+    <w:lsdException w:name="HTML Top of Form" w:semiHidden="1" w:unhideWhenUsed="1"/>
+    <w:lsdException w:name="HTML Bottom of Form" w:semiHidden="1" w:unhideWhenUsed="1"/>
+    <w:lsdException w:name="Normal (Web)" w:semiHidden="1" w:unhideWhenUsed="1"/>
+    <w:lsdException w:name="HTML Acronym" w:semiHidden="1" w:unhideWhenUsed="1"/>
+    <w:lsdException w:name="HTML Address" w:semiHidden="1" w:unhideWhenUsed="1"/>
+    <w:lsdException w:name="HTML Cite" w:semiHidden="1" w:unhideWhenUsed="1"/>
+    <w:lsdException w:name="HTML Code" w:semiHidden="1" w:unhideWhenUsed="1"/>
+    <w:lsdException w:name="HTML Definition" w:semiHidden="1" w:unhideWhenUsed="1"/>
+    <w:lsdException w:name="HTML Keyboard" w:semiHidden="1" w:unhideWhenUsed="1"/>
+    <w:lsdException w:name="HTML Preformatted" w:semiHidden="1" w:unhideWhenUsed="1"/>
+    <w:lsdException w:name="HTML Sample" w:semiHidden="1" w:unhideWhenUsed="1"/>
+    <w:lsdException w:name="HTML Typewriter" w:semiHidden="1" w:unhideWhenUsed="1"/>
+    <w:lsdException w:name="HTML Variable" w:semiHidden="1" w:unhideWhenUsed="1"/>
+    <w:lsdException w:name="Normal Table" w:semiHidden="1" w:unhideWhenUsed="1"/>
+    <w:lsdException w:name="annotation subject" w:semiHidden="1" w:unhideWhenUsed="1"/>
+    <w:lsdException w:name="No List" w:semiHidden="1" w:unhideWhenUsed="1"/>
+    <w:lsdException w:name="Outline List 1" w:semiHidden="1" w:unhideWhenUsed="1"/>
+    <w:lsdException w:name="Outline List 2" w:semiHidden="1" w:unhideWhenUsed="1"/>
+    <w:lsdException w:name="Outline List 3" w:semiHidden="1" w:unhideWhenUsed="1"/>
+    <w:lsdException w:name="Table Simple 1" w:semiHidden="1" w:unhideWhenUsed="1"/>
+    <w:lsdException w:name="Table Simple 2" w:semiHidden="1" w:unhideWhenUsed="1"/>
+    <w:lsdException w:name="Table Simple 3" w:semiHidden="1" w:unhideWhenUsed="1"/>
+    <w:lsdException w:name="Table Classic 1" w:semiHidden="1" w:unhideWhenUsed="1"/>
+    <w:lsdException w:name="Table Classic 2" w:semiHidden="1" w:unhideWhenUsed="1"/>
+    <w:lsdException w:name="Table Classic 3" w:semiHidden="1" w:unhideWhenUsed="1"/>
+    <w:lsdException w:name="Table Classic 4" w:semiHidden="1" w:unhideWhenUsed="1"/>
+    <w:lsdException w:name="Table Colorful 1" w:semiHidden="1" w:unhideWhenUsed="1"/>
+    <w:lsdException w:name="Table Colorful 2" w:semiHidden="1" w:unhideWhenUsed="1"/>
+    <w:lsdException w:name="Table Colorful 3" w:semiHidden="1" w:unhideWhenUsed="1"/>
+    <w:lsdException w:name="Table Columns 1" w:semiHidden="1" w:unhideWhenUsed="1"/>
+    <w:lsdException w:name="Table Columns 2" w:semiHidden="1" w:unhideWhenUsed="1"/>
+    <w:lsdException w:name="Table Columns 3" w:semiHidden="1" w:unhideWhenUsed="1"/>
+    <w:lsdException w:name="Table Columns 4" w:semiHidden="1" w:unhideWhenUsed="1"/>
+    <w:lsdException w:name="Table Columns 5" w:semiHidden="1" w:unhideWhenUsed="1"/>
+    <w:lsdException w:name="Table Grid 1" w:semiHidden="1" w:unhideWhenUsed="1"/>
+    <w:lsdException w:name="Table Grid 2" w:semiHidden="1" w:unhideWhenUsed="1"/>
+    <w:lsdException w:name="Table Grid 3" w:semiHidden="1" w:unhideWhenUsed="1"/>
+    <w:lsdException w:name="Table Grid 4" w:semiHidden="1" w:unhideWhenUsed="1"/>
+    <w:lsdException w:name="Table Grid 5" w:semiHidden="1" w:unhideWhenUsed="1"/>
+    <w:lsdException w:name="Table Grid 6" w:semiHidden="1" w:unhideWhenUsed="1"/>
+    <w:lsdException w:name="Table Grid 7" w:semiHidden="1" w:unhideWhenUsed="1"/>
+    <w:lsdException w:name="Table Grid 8" w:semiHidden="1" w:unhideWhenUsed="1"/>
+    <w:lsdException w:name="Table List 1" w:semiHidden="1" w:unhideWhenUsed="1"/>
+    <w:lsdException w:name="Table List 2" w:semiHidden="1" w:unhideWhenUsed="1"/>
+    <w:lsdException w:name="Table List 3" w:semiHidden="1" w:unhideWhenUsed="1"/>
+    <w:lsdException w:name="Table List 4" w:semiHidden="1" w:unhideWhenUsed="1"/>
+    <w:lsdException w:name="Table List 5" w:semiHidden="1" w:unhideWhenUsed="1"/>
+    <w:lsdException w:name="Table List 6" w:semiHidden="1" w:unhideWhenUsed="1"/>
+    <w:lsdException w:name="Table List 7" w:semiHidden="1" w:unhideWhenUsed="1"/>
+    <w:lsdException w:name="Table List 8" w:semiHidden="1" w:unhideWhenUsed="1"/>
+    <w:lsdException w:name="Table 3D effects 1" w:semiHidden="1" w:unhideWhenUsed="1"/>
+    <w:lsdException w:name="Table 3D effects 2" w:semiHidden="1" w:unhideWhenUsed="1"/>
+    <w:lsdException w:name="Table 3D effects 3" w:semiHidden="1" w:unhideWhenUsed="1"/>
+    <w:lsdException w:name="Table Contemporary" w:semiHidden="1" w:unhideWhenUsed="1"/>
+    <w:lsdException w:name="Table Elegant" w:semiHidden="1" w:unhideWhenUsed="1"/>
+    <w:lsdException w:name="Table Professional" w:semiHidden="1" w:unhideWhenUsed="1"/>
+    <w:lsdException w:name="Table Subtle 1" w:semiHidden="1" w:unhideWhenUsed="1"/>
+    <w:lsdException w:name="Table Subtle 2" w:semiHidden="1" w:unhideWhenUsed="1"/>
+    <w:lsdException w:name="Table Web 1" w:semiHidden="1" w:unhideWhenUsed="1"/>
+    <w:lsdException w:name="Table Web 2" w:semiHidden="1" w:unhideWhenUsed="1"/>
+    <w:lsdException w:name="Table Web 3" w:semiHidden="1" w:unhideWhenUsed="1"/>
+    <w:lsdException w:name="Balloon Text" w:semiHidden="1" w:unhideWhenUsed="1"/>
+    <w:lsdException w:name="Table Theme" w:semiHidden="1" w:unhideWhenUsed="1"/>
+    <w:lsdException w:name="Placeholder Text" w:semiHidden="1"/>
+    <w:lsdException w:name="Light Shading"/>
+    <w:lsdException w:name="Light List"/>
+    <w:lsdException w:name="Medium Grid 3"/>
+    <w:lsdException w:name="Dark List"/>
+    <w:lsdException w:name="Colorful Shading"/>
+    <w:lsdException w:name="Colorful List"/>
+    <w:lsdException w:name="Colorful Grid"/>
+    <w:lsdException w:name="Light Shading Accent 1"/>
+    <w:lsdException w:name="Light List Accent 1"/>
+    <w:lsdException w:name="Light Grid Accent 1"/>
+    <w:lsdException w:name="Medium Shading 1 Accent 1"/>
+    <w:lsdException w:name="Medium Shading 2 Accent 1"/>
+    <w:lsdException w:name="Medium List 1 Accent 1"/>
+    <w:lsdException w:name="Revision" w:semiHidden="1"/>
+    <w:lsdException w:name="Medium List 2 Accent 1"/>
+    <w:lsdException w:name="Medium Grid 1 Accent 1"/>
+    <w:lsdException w:name="Medium Grid 2 Accent 1"/>
+    <w:lsdException w:name="Medium Grid 3 Accent 1"/>
+    <w:lsdException w:name="Dark List Accent 1"/>
+    <w:lsdException w:name="Colorful Shading Accent 1"/>
+    <w:lsdException w:name="Colorful List Accent 1"/>
+    <w:lsdException w:name="Colorful Grid Accent 1"/>
+    <w:lsdException w:name="Light Shading Accent 2"/>
+    <w:lsdException w:name="Light List Accent 2"/>
+    <w:lsdException w:name="Light Grid Accent 2"/>
+    <w:lsdException w:name="Medium Shading 1 Accent 2"/>
+    <w:lsdException w:name="Medium Shading 2 Accent 2"/>
+    <w:lsdException w:name="Medium List 1 Accent 2"/>
+    <w:lsdException w:name="Medium List 2 Accent 2"/>
+    <w:lsdException w:name="Medium Grid 1 Accent 2"/>
+    <w:lsdException w:name="Medium Grid 2 Accent 2"/>
+    <w:lsdException w:name="Medium Grid 3 Accent 2"/>
+    <w:lsdException w:name="Dark List Accent 2"/>
+    <w:lsdException w:name="Colorful Shading Accent 2"/>
+    <w:lsdException w:name="Colorful List Accent 2"/>
+    <w:lsdException w:name="Colorful Grid Accent 2"/>
+    <w:lsdException w:name="Light Shading Accent 3"/>
+    <w:lsdException w:name="Light List Accent 3"/>
+    <w:lsdException w:name="Light Grid Accent 3"/>
+    <w:lsdException w:name="Medium Shading 1 Accent 3"/>
+    <w:lsdException w:name="Medium Shading 2 Accent 3"/>
+    <w:lsdException w:name="Medium List 1 Accent 3"/>
+    <w:lsdException w:name="Medium List 2 Accent 3"/>
+    <w:lsdException w:name="Medium Grid 1 Accent 3"/>
+    <w:lsdException w:name="Medium Grid 2 Accent 3"/>
+    <w:lsdException w:name="Medium Grid 3 Accent 3"/>
+    <w:lsdException w:name="Dark List Accent 3"/>
+    <w:lsdException w:name="Colorful Shading Accent 3"/>
+    <w:lsdException w:name="Colorful List Accent 3"/>
+    <w:lsdException w:name="Colorful Grid Accent 3"/>
+    <w:lsdException w:name="Light Shading Accent 4"/>
+    <w:lsdException w:name="Light List Accent 4"/>
+    <w:lsdException w:name="Light Grid Accent 4"/>
+    <w:lsdException w:name="Medium Shading 1 Accent 4"/>
+    <w:lsdException w:name="Medium Shading 2 Accent 4"/>
+    <w:lsdException w:name="Medium List 1 Accent 4"/>
+    <w:lsdException w:name="Medium List 2 Accent 4"/>
+    <w:lsdException w:name="Medium Grid 1 Accent 4"/>
+    <w:lsdException w:name="Medium Grid 2 Accent 4"/>
+    <w:lsdException w:name="Medium Grid 3 Accent 4"/>
+    <w:lsdException w:name="Dark List Accent 4"/>
+    <w:lsdException w:name="Colorful Shading Accent 4"/>
+    <w:lsdException w:name="Colorful List Accent 4"/>
+    <w:lsdException w:name="Colorful Grid Accent 4"/>
+    <w:lsdException w:name="Light Shading Accent 5"/>
+    <w:lsdException w:name="Light List Accent 5"/>
+    <w:lsdException w:name="Light Grid Accent 5"/>
+    <w:lsdException w:name="Medium Shading 1 Accent 5"/>
+    <w:lsdException w:name="Medium Shading 2 Accent 5"/>
+    <w:lsdException w:name="Medium List 1 Accent 5"/>
+    <w:lsdException w:name="Medium List 2 Accent 5"/>
+    <w:lsdException w:name="Medium Grid 1 Accent 5"/>
+    <w:lsdException w:name="Medium Grid 2 Accent 5"/>
+    <w:lsdException w:name="Medium Grid 3 Accent 5"/>
+    <w:lsdException w:name="Dark List Accent 5"/>
+    <w:lsdException w:name="Colorful Shading Accent 5"/>
+    <w:lsdException w:name="Colorful List Accent 5"/>
+    <w:lsdException w:name="Colorful Grid Accent 5"/>
+    <w:lsdException w:name="Light Shading Accent 6"/>
+    <w:lsdException w:name="Light List Accent 6"/>
+    <w:lsdException w:name="Light Grid Accent 6"/>
+    <w:lsdException w:name="Medium Shading 1 Accent 6"/>
+    <w:lsdException w:name="Medium Shading 2 Accent 6"/>
+    <w:lsdException w:name="Medium List 1 Accent 6"/>
+    <w:lsdException w:name="Medium List 2 Accent 6"/>
+    <w:lsdException w:name="Medium Grid 1 Accent 6"/>
+    <w:lsdException w:name="Medium Grid 2 Accent 6"/>
+    <w:lsdException w:name="Medium Grid 3 Accent 6"/>
+    <w:lsdException w:name="Dark List Accent 6"/>
+    <w:lsdException w:name="Colorful Shading Accent 6"/>
+    <w:lsdException w:name="Colorful List Accent 6"/>
+    <w:lsdException w:name="Colorful Grid Accent 6"/>
+    <w:lsdException w:name="Bibliography" w:semiHidden="1" w:unhideWhenUsed="1"/>
+    <w:lsdException w:name="TOC Heading" w:semiHidden="1" w:unhideWhenUsed="1"/>
+    <w:lsdException w:name="Grid Table 4" w:uiPriority="49"/>
+    <w:lsdException w:name="Grid Table 5 Dark" w:uiPriority="50"/>
+    <w:lsdException w:name="Grid Table 6 Colorful" w:uiPriority="51"/>
+    <w:lsdException w:name="Grid Table 7 Colorful" w:uiPriority="52"/>
+    <w:lsdException w:name="Grid Table 1 Light Accent 1" w:uiPriority="46"/>
+    <w:lsdException w:name="Grid Table 2 Accent 1" w:uiPriority="47"/>
+    <w:lsdException w:name="Grid Table 3 Accent 1" w:uiPriority="48"/>
+    <w:lsdException w:name="Grid Table 4 Accent 1" w:uiPriority="49"/>
+    <w:lsdException w:name="Grid Table 5 Dark Accent 1" w:uiPriority="50"/>
+    <w:lsdException w:name="Grid Table 6 Colorful Accent 1" w:uiPriority="51"/>
+    <w:lsdException w:name="Grid Table 7 Colorful Accent 1" w:uiPriority="52"/>
+    <w:lsdException w:name="Grid Table 1 Light Accent 2" w:uiPriority="46"/>
+    <w:lsdException w:name="Grid Table 2 Accent 2" w:uiPriority="47"/>
+    <w:lsdException w:name="Grid Table 3 Accent 2" w:uiPriority="48"/>
+    <w:lsdException w:name="Grid Table 4 Accent 2" w:uiPriority="49"/>
+    <w:lsdException w:name="Grid Table 5 Dark Accent 2" w:uiPriority="50"/>
+    <w:lsdException w:name="Grid Table 6 Colorful Accent 2" w:uiPriority="51"/>
+    <w:lsdException w:name="Grid Table 7 Colorful Accent 2" w:uiPriority="52"/>
+    <w:lsdException w:name="Grid Table 1 Light Accent 3" w:uiPriority="46"/>
+    <w:lsdException w:name="Grid Table 2 Accent 3" w:uiPriority="47"/>
+    <w:lsdException w:name="Grid Table 3 Accent 3" w:uiPriority="48"/>
+    <w:lsdException w:name="Grid Table 4 Accent 3" w:uiPriority="49"/>
+    <w:lsdException w:name="Grid Table 5 Dark Accent 3" w:uiPriority="50"/>
+    <w:lsdException w:name="Grid Table 6 Colorful Accent 3" w:uiPriority="51"/>
+    <w:lsdException w:name="Grid Table 7 Colorful Accent 3" w:uiPriority="52"/>
+    <w:lsdException w:name="Grid Table 1 Light Accent 4" w:uiPriority="46"/>
+    <w:lsdException w:name="Grid Table 2 Accent 4" w:uiPriority="47"/>
+    <w:lsdException w:name="Grid Table 3 Accent 4" w:uiPriority="48"/>
+    <w:lsdException w:name="Grid Table 4 Accent 4" w:uiPriority="49"/>
+    <w:lsdException w:name="Grid Table 5 Dark Accent 4" w:uiPriority="50"/>
+    <w:lsdException w:name="Grid Table 6 Colorful Accent 4" w:uiPriority="51"/>
+    <w:lsdException w:name="Grid Table 7 Colorful Accent 4" w:uiPriority="52"/>
+    <w:lsdException w:name="Grid Table 1 Light Accent 5" w:uiPriority="46"/>
+    <w:lsdException w:name="Grid Table 2 Accent 5" w:uiPriority="47"/>
+    <w:lsdException w:name="Grid Table 3 Accent 5" w:uiPriority="48"/>
+    <w:lsdException w:name="Grid Table 4 Accent 5" w:uiPriority="49"/>
+    <w:lsdException w:name="Grid Table 5 Dark Accent 5" w:uiPriority="50"/>
+    <w:lsdException w:name="Grid Table 6 Colorful Accent 5" w:uiPriority="51"/>
+    <w:lsdException w:name="Grid Table 7 Colorful Accent 5" w:uiPriority="52"/>
+    <w:lsdException w:name="Grid Table 1 Light Accent 6" w:uiPriority="46"/>
+    <w:lsdException w:name="Grid Table 2 Accent 6" w:uiPriority="47"/>
+    <w:lsdException w:name="Grid Table 3 Accent 6" w:uiPriority="48"/>
+    <w:lsdException w:name="Grid Table 4 Accent 6" w:uiPriority="49"/>
+    <w:lsdException w:name="Grid Table 5 Dark Accent 6" w:uiPriority="50"/>
+    <w:lsdException w:name="Grid Table 6 Colorful Accent 6" w:uiPriority="51"/>
+    <w:lsdException w:name="Grid Table 7 Colorful Accent 6" w:uiPriority="52"/>
+    <w:lsdException w:name="List Table 1 Light" w:uiPriority="46"/>
+    <w:lsdException w:name="List Table 2" w:uiPriority="47"/>
+    <w:lsdException w:name="List Table 3" w:uiPriority="48"/>
+    <w:lsdException w:name="List Table 4" w:uiPriority="49"/>
+    <w:lsdException w:name="List Table 5 Dark" w:uiPriority="50"/>
+    <w:lsdException w:name="List Table 6 Colorful" w:uiPriority="51"/>
+    <w:lsdException w:name="List Table 7 Colorful" w:uiPriority="52"/>
+    <w:lsdException w:name="List Table 1 Light Accent 1" w:uiPriority="46"/>
+    <w:lsdException w:name="List Table 2 Accent 1" w:uiPriority="47"/>
+    <w:lsdException w:name="List Table 3 Accent 1" w:uiPriority="48"/>
+    <w:lsdException w:name="List Table 4 Accent 1" w:uiPriority="49"/>
+    <w:lsdException w:name="List Table 5 Dark Accent 1" w:uiPriority="50"/>
+    <w:lsdException w:name="List Table 6 Colorful Accent 1" w:uiPriority="51"/>
+    <w:lsdException w:name="List Table 7 Colorful Accent 1" w:uiPriority="52"/>
+    <w:lsdException w:name="List Table 1 Light Accent 2" w:uiPriority="46"/>
+    <w:lsdException w:name="List Table 2 Accent 2" w:uiPriority="47"/>
+    <w:lsdException w:name="List Table 3 Accent 2" w:uiPriority="48"/>
+    <w:lsdException w:name="List Table 4 Accent 2" w:uiPriority="49"/>
+    <w:lsdException w:name="List Table 5 Dark Accent 2" w:uiPriority="50"/>
+    <w:lsdException w:name="List Table 6 Colorful Accent 2" w:uiPriority="51"/>
+    <w:lsdException w:name="List Table 7 Colorful Accent 2" w:uiPriority="52"/>
+    <w:lsdException w:name="List Table 1 Light Accent 3" w:uiPriority="46"/>
+    <w:lsdException w:name="List Table 2 Accent 3" w:uiPriority="47"/>
+    <w:lsdException w:name="List Table 3 Accent 3" w:uiPriority="48"/>
+    <w:lsdException w:name="List Table 4 Accent 3" w:uiPriority="49"/>
+    <w:lsdException w:name="List Table 5 Dark Accent 3" w:uiPriority="50"/>
+    <w:lsdException w:name="List Table 6 Colorful Accent 3" w:uiPriority="51"/>
+    <w:lsdException w:name="List Table 7 Colorful Accent 3" w:uiPriority="52"/>
+    <w:lsdException w:name="List Table 1 Light Accent 4" w:uiPriority="46"/>
+    <w:lsdException w:name="List Table 2 Accent 4" w:uiPriority="47"/>
+    <w:lsdException w:name="List Table 3 Accent 4" w:uiPriority="48"/>
+    <w:lsdException w:name="List Table 4 Accent 4" w:uiPriority="49"/>
+    <w:lsdException w:name="List Table 5 Dark Accent 4" w:uiPriority="50"/>
+    <w:lsdException w:name="List Table 6 Colorful Accent 4" w:uiPriority="51"/>
+    <w:lsdException w:name="List Table 7 Colorful Accent 4" w:uiPriority="52"/>
+    <w:lsdException w:name="List Table 1 Light Accent 5" w:uiPriority="46"/>
+    <w:lsdException w:name="List Table 2 Accent 5" w:uiPriority="47"/>
+    <w:lsdException w:name="List Table 3 Accent 5" w:uiPriority="48"/>
+    <w:lsdException w:name="List Table 4 Accent 5" w:uiPriority="49"/>
+    <w:lsdException w:name="List Table 5 Dark Accent 5" w:uiPriority="50"/>
+    <w:lsdException w:name="List Table 6 Colorful Accent 5" w:uiPriority="51"/>
+    <w:lsdException w:name="List Table 7 Colorful Accent 5" w:uiPriority="52"/>
+    <w:lsdException w:name="List Table 1 Light Accent 6" w:uiPriority="46"/>
+    <w:lsdException w:name="List Table 2 Accent 6" w:uiPriority="47"/>
+    <w:lsdException w:name="List Table 3 Accent 6" w:uiPriority="48"/>
+    <w:lsdException w:name="List Table 4 Accent 6" w:uiPriority="49"/>
+    <w:lsdException w:name="List Table 5 Dark Accent 6" w:uiPriority="50"/>
+    <w:lsdException w:name="List Table 6 Colorful Accent 6" w:uiPriority="51"/>
+    <w:lsdException w:name="List Table 7 Colorful Accent 6" w:uiPriority="52"/>
+    <w:lsdException w:name="Mention" w:semiHidden="1" w:uiPriority="99" w:unhideWhenUsed="1"/>
+    <w:lsdException w:name="Smart Hyperlink" w:semiHidden="1" w:uiPriority="99" w:unhideWhenUsed="1"/>
+    <w:lsdException w:name="Hashtag" w:semiHidden="1" w:uiPriority="99" w:unhideWhenUsed="1"/>
+    <w:lsdException w:name="Unresolved Mention" w:semiHidden="1" w:uiPriority="99" w:unhideWhenUsed="1"/>
+    <w:lsdException w:name="Smart Link" w:semiHidden="1" w:uiPriority="99" w:unhideWhenUsed="1"/>
+  </w:latentStyles>
+  <w:style w:type="paragraph" w:default="1" w:styleId="Normal">
     <w:name w:val="Normal"/>
     <w:qFormat/>
   </w:style>
-  <w:style w:styleId="BodyText" w:type="paragraph">
-    <w:name w:val="Body Text"/>
+  <w:style w:type="paragraph" w:styleId="Ttulo1">
+    <w:name w:val="heading 1"/>
     <w:basedOn w:val="Normal"/>
-    <w:link w:val="BodyTextChar"/>
-    <w:pPr>
-      <w:spacing w:after="180" w:before="180"/>
-    </w:pPr>
-    <w:qFormat/>
-  </w:style>
-  <w:style w:customStyle="1" w:styleId="FirstParagraph" w:type="paragraph">
-    <w:name w:val="First Paragraph"/>
-    <w:basedOn w:val="BodyText"/>
-    <w:next w:val="BodyText"/>
-    <w:qFormat/>
-  </w:style>
-  <w:style w:customStyle="1" w:styleId="Compact" w:type="paragraph">
-    <w:name w:val="Compact"/>
-    <w:basedOn w:val="BodyText"/>
-    <w:qFormat/>
-    <w:pPr>
-      <w:spacing w:after="36" w:before="36"/>
-    </w:pPr>
-  </w:style>
-  <w:style w:styleId="Title" w:type="paragraph">
-    <w:name w:val="Title"/>
-    <w:basedOn w:val="Normal"/>
-    <w:next w:val="BodyText"/>
+    <w:next w:val="Corpodetexto"/>
+    <w:uiPriority w:val="9"/>
     <w:qFormat/>
     <w:pPr>
       <w:keepNext/>
       <w:keepLines/>
-      <w:spacing w:after="240" w:before="480"/>
-      <w:jc w:val="center"/>
+      <w:spacing w:before="480" w:after="0"/>
+      <w:outlineLvl w:val="0"/>
     </w:pPr>
     <w:rPr>
-      <w:rFonts w:asciiTheme="majorHAnsi" w:cstheme="majorBidi" w:eastAsiaTheme="majorEastAsia" w:hAnsiTheme="majorHAnsi"/>
+      <w:rFonts w:asciiTheme="majorHAnsi" w:eastAsiaTheme="majorEastAsia" w:hAnsiTheme="majorHAnsi" w:cstheme="majorBidi"/>
       <w:b/>
       <w:bCs/>
-      <w:color w:themeColor="accent1" w:themeShade="B5" w:val="345A8A"/>
-      <w:sz w:val="36"/>
-      <w:szCs w:val="36"/>
-    </w:rPr>
-  </w:style>
-  <w:style w:styleId="Subtitle" w:type="paragraph">
-    <w:name w:val="Subtitle"/>
-    <w:basedOn w:val="Title"/>
-    <w:next w:val="BodyText"/>
+      <w:color w:val="4F81BD" w:themeColor="accent1"/>
+      <w:sz w:val="32"/>
+      <w:szCs w:val="32"/>
+    </w:rPr>
+  </w:style>
+  <w:style w:type="paragraph" w:styleId="Ttulo2">
+    <w:name w:val="heading 2"/>
+    <w:basedOn w:val="Normal"/>
+    <w:next w:val="Corpodetexto"/>
+    <w:uiPriority w:val="9"/>
+    <w:unhideWhenUsed/>
     <w:qFormat/>
     <w:pPr>
       <w:keepNext/>
       <w:keepLines/>
-      <w:spacing w:after="240" w:before="240"/>
+      <w:spacing w:before="200" w:after="0"/>
+      <w:outlineLvl w:val="1"/>
+    </w:pPr>
+    <w:rPr>
+      <w:rFonts w:asciiTheme="majorHAnsi" w:eastAsiaTheme="majorEastAsia" w:hAnsiTheme="majorHAnsi" w:cstheme="majorBidi"/>
+      <w:b/>
+      <w:bCs/>
+      <w:color w:val="4F81BD" w:themeColor="accent1"/>
+      <w:sz w:val="28"/>
+      <w:szCs w:val="28"/>
+    </w:rPr>
+  </w:style>
+  <w:style w:type="paragraph" w:styleId="Ttulo3">
+    <w:name w:val="heading 3"/>
+    <w:basedOn w:val="Normal"/>
+    <w:next w:val="Corpodetexto"/>
+    <w:uiPriority w:val="9"/>
+    <w:unhideWhenUsed/>
+    <w:qFormat/>
+    <w:pPr>
+      <w:keepNext/>
+      <w:keepLines/>
+      <w:spacing w:before="200" w:after="0"/>
+      <w:outlineLvl w:val="2"/>
+    </w:pPr>
+    <w:rPr>
+      <w:rFonts w:asciiTheme="majorHAnsi" w:eastAsiaTheme="majorEastAsia" w:hAnsiTheme="majorHAnsi" w:cstheme="majorBidi"/>
+      <w:b/>
+      <w:bCs/>
+      <w:color w:val="4F81BD" w:themeColor="accent1"/>
+    </w:rPr>
+  </w:style>
+  <w:style w:type="paragraph" w:styleId="Ttulo4">
+    <w:name w:val="heading 4"/>
+    <w:basedOn w:val="Normal"/>
+    <w:next w:val="Corpodetexto"/>
+    <w:uiPriority w:val="9"/>
+    <w:unhideWhenUsed/>
+    <w:qFormat/>
+    <w:pPr>
+      <w:keepNext/>
+      <w:keepLines/>
+      <w:spacing w:before="200" w:after="0"/>
+      <w:outlineLvl w:val="3"/>
+    </w:pPr>
+    <w:rPr>
+      <w:rFonts w:asciiTheme="majorHAnsi" w:eastAsiaTheme="majorEastAsia" w:hAnsiTheme="majorHAnsi" w:cstheme="majorBidi"/>
+      <w:bCs/>
+      <w:i/>
+      <w:color w:val="4F81BD" w:themeColor="accent1"/>
+    </w:rPr>
+  </w:style>
+  <w:style w:type="paragraph" w:styleId="Ttulo5">
+    <w:name w:val="heading 5"/>
+    <w:basedOn w:val="Normal"/>
+    <w:next w:val="Corpodetexto"/>
+    <w:uiPriority w:val="9"/>
+    <w:unhideWhenUsed/>
+    <w:qFormat/>
+    <w:pPr>
+      <w:keepNext/>
+      <w:keepLines/>
+      <w:spacing w:before="200" w:after="0"/>
+      <w:outlineLvl w:val="4"/>
+    </w:pPr>
+    <w:rPr>
+      <w:rFonts w:asciiTheme="majorHAnsi" w:eastAsiaTheme="majorEastAsia" w:hAnsiTheme="majorHAnsi" w:cstheme="majorBidi"/>
+      <w:iCs/>
+      <w:color w:val="4F81BD" w:themeColor="accent1"/>
+    </w:rPr>
+  </w:style>
+  <w:style w:type="paragraph" w:styleId="Ttulo6">
+    <w:name w:val="heading 6"/>
+    <w:basedOn w:val="Normal"/>
+    <w:next w:val="Corpodetexto"/>
+    <w:uiPriority w:val="9"/>
+    <w:unhideWhenUsed/>
+    <w:qFormat/>
+    <w:pPr>
+      <w:keepNext/>
+      <w:keepLines/>
+      <w:spacing w:before="200" w:after="0"/>
+      <w:outlineLvl w:val="5"/>
+    </w:pPr>
+    <w:rPr>
+      <w:rFonts w:asciiTheme="majorHAnsi" w:eastAsiaTheme="majorEastAsia" w:hAnsiTheme="majorHAnsi" w:cstheme="majorBidi"/>
+      <w:color w:val="4F81BD" w:themeColor="accent1"/>
+    </w:rPr>
+  </w:style>
+  <w:style w:type="paragraph" w:styleId="Ttulo7">
+    <w:name w:val="heading 7"/>
+    <w:basedOn w:val="Normal"/>
+    <w:next w:val="Corpodetexto"/>
+    <w:uiPriority w:val="9"/>
+    <w:unhideWhenUsed/>
+    <w:qFormat/>
+    <w:pPr>
+      <w:keepNext/>
+      <w:keepLines/>
+      <w:spacing w:before="200" w:after="0"/>
+      <w:outlineLvl w:val="6"/>
+    </w:pPr>
+    <w:rPr>
+      <w:rFonts w:asciiTheme="majorHAnsi" w:eastAsiaTheme="majorEastAsia" w:hAnsiTheme="majorHAnsi" w:cstheme="majorBidi"/>
+      <w:color w:val="4F81BD" w:themeColor="accent1"/>
+    </w:rPr>
+  </w:style>
+  <w:style w:type="paragraph" w:styleId="Ttulo8">
+    <w:name w:val="heading 8"/>
+    <w:basedOn w:val="Normal"/>
+    <w:next w:val="Corpodetexto"/>
+    <w:uiPriority w:val="9"/>
+    <w:unhideWhenUsed/>
+    <w:qFormat/>
+    <w:pPr>
+      <w:keepNext/>
+      <w:keepLines/>
+      <w:spacing w:before="200" w:after="0"/>
+      <w:outlineLvl w:val="7"/>
+    </w:pPr>
+    <w:rPr>
+      <w:rFonts w:asciiTheme="majorHAnsi" w:eastAsiaTheme="majorEastAsia" w:hAnsiTheme="majorHAnsi" w:cstheme="majorBidi"/>
+      <w:color w:val="4F81BD" w:themeColor="accent1"/>
+    </w:rPr>
+  </w:style>
+  <w:style w:type="paragraph" w:styleId="Ttulo9">
+    <w:name w:val="heading 9"/>
+    <w:basedOn w:val="Normal"/>
+    <w:next w:val="Corpodetexto"/>
+    <w:uiPriority w:val="9"/>
+    <w:unhideWhenUsed/>
+    <w:qFormat/>
+    <w:pPr>
+      <w:keepNext/>
+      <w:keepLines/>
+      <w:spacing w:before="200" w:after="0"/>
+      <w:outlineLvl w:val="8"/>
+    </w:pPr>
+    <w:rPr>
+      <w:rFonts w:asciiTheme="majorHAnsi" w:eastAsiaTheme="majorEastAsia" w:hAnsiTheme="majorHAnsi" w:cstheme="majorBidi"/>
+      <w:color w:val="4F81BD" w:themeColor="accent1"/>
+    </w:rPr>
+  </w:style>
+  <w:style w:type="character" w:default="1" w:styleId="Fontepargpadro">
+    <w:name w:val="Default Paragraph Font"/>
+    <w:uiPriority w:val="1"/>
+    <w:semiHidden/>
+    <w:unhideWhenUsed/>
+  </w:style>
+  <w:style w:type="table" w:default="1" w:styleId="Tabelanormal">
+    <w:name w:val="Normal Table"/>
+    <w:uiPriority w:val="99"/>
+    <w:semiHidden/>
+    <w:unhideWhenUsed/>
+    <w:tblPr>
+      <w:tblInd w:w="0" w:type="dxa"/>
+      <w:tblCellMar>
+        <w:top w:w="0" w:type="dxa"/>
+        <w:left w:w="108" w:type="dxa"/>
+        <w:bottom w:w="0" w:type="dxa"/>
+        <w:right w:w="108" w:type="dxa"/>
+      </w:tblCellMar>
+    </w:tblPr>
+  </w:style>
+  <w:style w:type="numbering" w:default="1" w:styleId="Semlista">
+    <w:name w:val="No List"/>
+    <w:uiPriority w:val="99"/>
+    <w:semiHidden/>
+    <w:unhideWhenUsed/>
+  </w:style>
+  <w:style w:type="paragraph" w:styleId="Corpodetexto">
+    <w:name w:val="Body Text"/>
+    <w:basedOn w:val="Normal"/>
+    <w:qFormat/>
+    <w:pPr>
+      <w:spacing w:before="180" w:after="180"/>
+    </w:pPr>
+  </w:style>
+  <w:style w:type="paragraph" w:customStyle="1" w:styleId="FirstParagraph">
+    <w:name w:val="First Paragraph"/>
+    <w:basedOn w:val="Corpodetexto"/>
+    <w:next w:val="Corpodetexto"/>
+    <w:qFormat/>
+  </w:style>
+  <w:style w:type="paragraph" w:customStyle="1" w:styleId="Compact">
+    <w:name w:val="Compact"/>
+    <w:basedOn w:val="Corpodetexto"/>
+    <w:qFormat/>
+    <w:pPr>
+      <w:spacing w:before="36" w:after="36"/>
+    </w:pPr>
+  </w:style>
+  <w:style w:type="paragraph" w:styleId="Ttulo">
+    <w:name w:val="Title"/>
+    <w:basedOn w:val="Normal"/>
+    <w:next w:val="Corpodetexto"/>
+    <w:qFormat/>
+    <w:pPr>
+      <w:keepNext/>
+      <w:keepLines/>
+      <w:spacing w:before="480" w:after="240"/>
       <w:jc w:val="center"/>
     </w:pPr>
     <w:rPr>
+      <w:rFonts w:asciiTheme="majorHAnsi" w:eastAsiaTheme="majorEastAsia" w:hAnsiTheme="majorHAnsi" w:cstheme="majorBidi"/>
+      <w:b/>
+      <w:bCs/>
+      <w:color w:val="345A8A" w:themeColor="accent1" w:themeShade="B5"/>
+      <w:sz w:val="36"/>
+      <w:szCs w:val="36"/>
+    </w:rPr>
+  </w:style>
+  <w:style w:type="paragraph" w:styleId="Subttulo">
+    <w:name w:val="Subtitle"/>
+    <w:basedOn w:val="Ttulo"/>
+    <w:next w:val="Corpodetexto"/>
+    <w:qFormat/>
+    <w:pPr>
+      <w:spacing w:before="240"/>
+    </w:pPr>
+    <w:rPr>
       <w:sz w:val="30"/>
       <w:szCs w:val="30"/>
     </w:rPr>
   </w:style>
-  <w:style w:customStyle="1" w:styleId="Author" w:type="paragraph">
+  <w:style w:type="paragraph" w:customStyle="1" w:styleId="Author">
     <w:name w:val="Author"/>
-    <w:next w:val="BodyText"/>
+    <w:next w:val="Corpodetexto"/>
     <w:qFormat/>
     <w:pPr>
       <w:keepNext/>
@@ -783,9 +1379,9 @@
       <w:jc w:val="center"/>
     </w:pPr>
   </w:style>
-  <w:style w:styleId="Date" w:type="paragraph">
+  <w:style w:type="paragraph" w:styleId="Data">
     <w:name w:val="Date"/>
-    <w:next w:val="BodyText"/>
+    <w:next w:val="Corpodetexto"/>
     <w:qFormat/>
     <w:pPr>
       <w:keepNext/>
@@ -793,274 +1389,75 @@
       <w:jc w:val="center"/>
     </w:pPr>
   </w:style>
-  <w:style w:customStyle="1" w:styleId="Abstract" w:type="paragraph">
+  <w:style w:type="paragraph" w:customStyle="1" w:styleId="Abstract">
     <w:name w:val="Abstract"/>
     <w:basedOn w:val="Normal"/>
-    <w:next w:val="BodyText"/>
+    <w:next w:val="Corpodetexto"/>
     <w:qFormat/>
     <w:pPr>
       <w:keepNext/>
       <w:keepLines/>
-      <w:spacing w:after="300" w:before="300"/>
+      <w:spacing w:before="300" w:after="300"/>
     </w:pPr>
     <w:rPr>
       <w:sz w:val="20"/>
       <w:szCs w:val="20"/>
     </w:rPr>
   </w:style>
-  <w:style w:styleId="Bibliography" w:type="paragraph">
+  <w:style w:type="paragraph" w:styleId="Bibliografia">
     <w:name w:val="Bibliography"/>
     <w:basedOn w:val="Normal"/>
-    <w:next w:val="Bibliography"/>
-    <w:qFormat/>
-    <w:pPr/>
-    <w:rPr/>
-  </w:style>
-  <w:style w:styleId="Heading1" w:type="paragraph">
-    <w:name w:val="Heading 1"/>
-    <w:basedOn w:val="Normal"/>
-    <w:next w:val="BodyText"/>
-    <w:uiPriority w:val="9"/>
-    <w:qFormat/>
-    <w:pPr>
-      <w:keepNext/>
-      <w:keepLines/>
-      <w:spacing w:after="0" w:before="480"/>
-      <w:outlineLvl w:val="0"/>
-    </w:pPr>
-    <w:rPr>
-      <w:rFonts w:asciiTheme="majorHAnsi" w:cstheme="majorBidi" w:eastAsiaTheme="majorEastAsia" w:hAnsiTheme="majorHAnsi"/>
-      <w:b/>
-      <w:bCs/>
-      <w:color w:themeColor="accent1" w:val="4F81BD"/>
-      <w:sz w:val="32"/>
-      <w:szCs w:val="32"/>
-    </w:rPr>
-  </w:style>
-  <w:style w:styleId="Heading2" w:type="paragraph">
-    <w:name w:val="Heading 2"/>
-    <w:basedOn w:val="Normal"/>
-    <w:next w:val="BodyText"/>
+    <w:qFormat/>
+  </w:style>
+  <w:style w:type="paragraph" w:styleId="Textoembloco">
+    <w:name w:val="Block Text"/>
+    <w:basedOn w:val="Corpodetexto"/>
+    <w:next w:val="Corpodetexto"/>
     <w:uiPriority w:val="9"/>
     <w:unhideWhenUsed/>
     <w:qFormat/>
     <w:pPr>
-      <w:keepNext/>
-      <w:keepLines/>
-      <w:spacing w:after="0" w:before="200"/>
-      <w:outlineLvl w:val="1"/>
+      <w:spacing w:before="100" w:after="100"/>
+      <w:ind w:left="480" w:right="480"/>
     </w:pPr>
-    <w:rPr>
-      <w:rFonts w:asciiTheme="majorHAnsi" w:cstheme="majorBidi" w:eastAsiaTheme="majorEastAsia" w:hAnsiTheme="majorHAnsi"/>
-      <w:b/>
-      <w:bCs/>
-      <w:color w:themeColor="accent1" w:val="4F81BD"/>
-      <w:sz w:val="28"/>
-      <w:szCs w:val="28"/>
-    </w:rPr>
-  </w:style>
-  <w:style w:styleId="Heading3" w:type="paragraph">
-    <w:name w:val="Heading 3"/>
+  </w:style>
+  <w:style w:type="paragraph" w:styleId="Textodenotaderodap">
+    <w:name w:val="footnote text"/>
     <w:basedOn w:val="Normal"/>
-    <w:next w:val="BodyText"/>
     <w:uiPriority w:val="9"/>
     <w:unhideWhenUsed/>
     <w:qFormat/>
-    <w:pPr>
-      <w:keepNext/>
-      <w:keepLines/>
-      <w:spacing w:after="0" w:before="200"/>
-      <w:outlineLvl w:val="2"/>
-    </w:pPr>
-    <w:rPr>
-      <w:rFonts w:asciiTheme="majorHAnsi" w:cstheme="majorBidi" w:eastAsiaTheme="majorEastAsia" w:hAnsiTheme="majorHAnsi"/>
-      <w:b/>
-      <w:bCs/>
-      <w:color w:themeColor="accent1" w:val="4F81BD"/>
-      <w:sz w:val="24"/>
-      <w:szCs w:val="24"/>
-    </w:rPr>
-  </w:style>
-  <w:style w:styleId="Heading4" w:type="paragraph">
-    <w:name w:val="Heading 4"/>
-    <w:basedOn w:val="Normal"/>
-    <w:next w:val="BodyText"/>
-    <w:uiPriority w:val="9"/>
-    <w:unhideWhenUsed/>
-    <w:qFormat/>
-    <w:pPr>
-      <w:keepNext/>
-      <w:keepLines/>
-      <w:spacing w:after="0" w:before="200"/>
-      <w:outlineLvl w:val="3"/>
-    </w:pPr>
-    <w:rPr>
-      <w:rFonts w:asciiTheme="majorHAnsi" w:cstheme="majorBidi" w:eastAsiaTheme="majorEastAsia" w:hAnsiTheme="majorHAnsi"/>
-      <w:i/>
-      <w:bCs/>
-      <w:color w:themeColor="accent1" w:val="4F81BD"/>
-      <w:sz w:val="24"/>
-      <w:szCs w:val="24"/>
-    </w:rPr>
-  </w:style>
-  <w:style w:styleId="Heading5" w:type="paragraph">
-    <w:name w:val="Heading 5"/>
-    <w:basedOn w:val="Normal"/>
-    <w:next w:val="BodyText"/>
-    <w:uiPriority w:val="9"/>
-    <w:unhideWhenUsed/>
-    <w:qFormat/>
-    <w:pPr>
-      <w:keepNext/>
-      <w:keepLines/>
-      <w:spacing w:after="0" w:before="200"/>
-      <w:outlineLvl w:val="4"/>
-    </w:pPr>
-    <w:rPr>
-      <w:rFonts w:asciiTheme="majorHAnsi" w:cstheme="majorBidi" w:eastAsiaTheme="majorEastAsia" w:hAnsiTheme="majorHAnsi"/>
-      <w:iCs/>
-      <w:color w:themeColor="accent1" w:val="4F81BD"/>
-      <w:sz w:val="24"/>
-      <w:szCs w:val="24"/>
-    </w:rPr>
-  </w:style>
-  <w:style w:styleId="Heading6" w:type="paragraph">
-    <w:name w:val="Heading 6"/>
-    <w:basedOn w:val="Normal"/>
-    <w:next w:val="BodyText"/>
-    <w:uiPriority w:val="9"/>
-    <w:unhideWhenUsed/>
-    <w:qFormat/>
-    <w:pPr>
-      <w:keepNext/>
-      <w:keepLines/>
-      <w:spacing w:after="0" w:before="200"/>
-      <w:outlineLvl w:val="5"/>
-    </w:pPr>
-    <w:rPr>
-      <w:rFonts w:asciiTheme="majorHAnsi" w:cstheme="majorBidi" w:eastAsiaTheme="majorEastAsia" w:hAnsiTheme="majorHAnsi"/>
-      <w:color w:themeColor="accent1" w:val="4F81BD"/>
-      <w:sz w:val="24"/>
-      <w:szCs w:val="24"/>
-    </w:rPr>
-  </w:style>
-  <w:style w:styleId="Heading7" w:type="paragraph">
-    <w:name w:val="Heading 7"/>
-    <w:basedOn w:val="Normal"/>
-    <w:next w:val="BodyText"/>
-    <w:uiPriority w:val="9"/>
-    <w:unhideWhenUsed/>
-    <w:qFormat/>
-    <w:pPr>
-      <w:keepNext/>
-      <w:keepLines/>
-      <w:spacing w:after="0" w:before="200"/>
-      <w:outlineLvl w:val="6"/>
-    </w:pPr>
-    <w:rPr>
-      <w:rFonts w:asciiTheme="majorHAnsi" w:cstheme="majorBidi" w:eastAsiaTheme="majorEastAsia" w:hAnsiTheme="majorHAnsi"/>
-      <w:color w:themeColor="accent1" w:val="4F81BD"/>
-      <w:sz w:val="24"/>
-      <w:szCs w:val="24"/>
-    </w:rPr>
-  </w:style>
-  <w:style w:styleId="Heading8" w:type="paragraph">
-    <w:name w:val="Heading 8"/>
-    <w:basedOn w:val="Normal"/>
-    <w:next w:val="BodyText"/>
-    <w:uiPriority w:val="9"/>
-    <w:unhideWhenUsed/>
-    <w:qFormat/>
-    <w:pPr>
-      <w:keepNext/>
-      <w:keepLines/>
-      <w:spacing w:after="0" w:before="200"/>
-      <w:outlineLvl w:val="7"/>
-    </w:pPr>
-    <w:rPr>
-      <w:rFonts w:asciiTheme="majorHAnsi" w:cstheme="majorBidi" w:eastAsiaTheme="majorEastAsia" w:hAnsiTheme="majorHAnsi"/>
-      <w:color w:themeColor="accent1" w:val="4F81BD"/>
-      <w:sz w:val="24"/>
-      <w:szCs w:val="24"/>
-    </w:rPr>
-  </w:style>
-  <w:style w:styleId="Heading9" w:type="paragraph">
-    <w:name w:val="Heading 9"/>
-    <w:basedOn w:val="Normal"/>
-    <w:next w:val="BodyText"/>
-    <w:uiPriority w:val="9"/>
-    <w:unhideWhenUsed/>
-    <w:qFormat/>
-    <w:pPr>
-      <w:keepNext/>
-      <w:keepLines/>
-      <w:spacing w:after="0" w:before="200"/>
-      <w:outlineLvl w:val="8"/>
-    </w:pPr>
-    <w:rPr>
-      <w:rFonts w:asciiTheme="majorHAnsi" w:cstheme="majorBidi" w:eastAsiaTheme="majorEastAsia" w:hAnsiTheme="majorHAnsi"/>
-      <w:color w:themeColor="accent1" w:val="4F81BD"/>
-      <w:sz w:val="24"/>
-      <w:szCs w:val="24"/>
-    </w:rPr>
-  </w:style>
-  <w:style w:styleId="BlockText" w:type="paragraph">
-    <w:name w:val="Block Text"/>
-    <w:basedOn w:val="BodyText"/>
-    <w:next w:val="BodyText"/>
-    <w:uiPriority w:val="9"/>
-    <w:unhideWhenUsed/>
-    <w:qFormat/>
-    <w:pPr>
-      <w:spacing w:after="100" w:before="100"/>
-      <w:ind w:firstLine="0" w:left="480" w:right="480"/>
-    </w:pPr>
-  </w:style>
-  <w:style w:styleId="FootnoteText" w:type="paragraph">
-    <w:name w:val="Footnote Text"/>
-    <w:basedOn w:val="Normal"/>
-    <w:next w:val="FootnoteText"/>
-    <w:uiPriority w:val="9"/>
-    <w:unhideWhenUsed/>
-    <w:qFormat/>
-  </w:style>
-  <w:style w:default="1" w:styleId="DefaultParagraphFont" w:type="character">
-    <w:name w:val="Default Paragraph Font"/>
+  </w:style>
+  <w:style w:type="table" w:customStyle="1" w:styleId="Table">
+    <w:name w:val="Table"/>
     <w:semiHidden/>
     <w:unhideWhenUsed/>
-  </w:style>
-  <w:style w:default="1" w:styleId="Table" w:type="table">
-    <w:name w:val="Table"/>
-    <w:basedOn w:val="TableNormal"/>
-    <w:semiHidden/>
-    <w:unhideWhenUsed/>
     <w:qFormat/>
     <w:tblPr>
-      <w:tblInd w:type="dxa" w:w="0"/>
+      <w:tblInd w:w="0" w:type="dxa"/>
       <w:tblCellMar>
-        <w:top w:type="dxa" w:w="0"/>
-        <w:left w:type="dxa" w:w="108"/>
-        <w:bottom w:type="dxa" w:w="0"/>
-        <w:right w:type="dxa" w:w="108"/>
+        <w:top w:w="0" w:type="dxa"/>
+        <w:left w:w="108" w:type="dxa"/>
+        <w:bottom w:w="0" w:type="dxa"/>
+        <w:right w:w="108" w:type="dxa"/>
       </w:tblCellMar>
     </w:tblPr>
     <w:tblStylePr w:type="firstRow">
       <w:tblPr>
         <w:jc w:val="left"/>
-        <w:tblInd w:type="dxa" w:w="0"/>
       </w:tblPr>
       <w:trPr>
         <w:jc w:val="left"/>
       </w:trPr>
       <w:tcPr>
+        <w:tcBorders>
+          <w:bottom w:val="single" w:sz="0" w:space="0" w:color="auto"/>
+        </w:tcBorders>
         <w:vAlign w:val="bottom"/>
-        <w:tcBorders>
-          <w:bottom w:val="single"/>
-        </w:tcBorders>
       </w:tcPr>
     </w:tblStylePr>
   </w:style>
-  <w:style w:customStyle="1" w:styleId="DefinitionTerm" w:type="paragraph">
+  <w:style w:type="paragraph" w:customStyle="1" w:styleId="DefinitionTerm">
     <w:name w:val="Definition Term"/>
     <w:basedOn w:val="Normal"/>
     <w:next w:val="Definition"/>
@@ -1073,78 +1470,79 @@
       <w:b/>
     </w:rPr>
   </w:style>
-  <w:style w:customStyle="1" w:styleId="Definition" w:type="paragraph">
+  <w:style w:type="paragraph" w:customStyle="1" w:styleId="Definition">
     <w:name w:val="Definition"/>
     <w:basedOn w:val="Normal"/>
   </w:style>
-  <w:style w:styleId="Caption" w:type="paragraph">
-    <w:name w:val="Caption"/>
+  <w:style w:type="paragraph" w:styleId="Legenda">
+    <w:name w:val="caption"/>
     <w:basedOn w:val="Normal"/>
-    <w:link w:val="BodyTextChar"/>
+    <w:link w:val="LegendaChar"/>
     <w:pPr>
-      <w:spacing w:after="120" w:before="0"/>
+      <w:spacing w:after="120"/>
     </w:pPr>
     <w:rPr>
       <w:i/>
     </w:rPr>
   </w:style>
-  <w:style w:customStyle="1" w:styleId="TableCaption" w:type="paragraph">
+  <w:style w:type="paragraph" w:customStyle="1" w:styleId="TableCaption">
     <w:name w:val="Table Caption"/>
-    <w:basedOn w:val="Caption"/>
+    <w:basedOn w:val="Legenda"/>
     <w:pPr>
       <w:keepNext/>
     </w:pPr>
   </w:style>
-  <w:style w:customStyle="1" w:styleId="ImageCaption" w:type="paragraph">
+  <w:style w:type="paragraph" w:customStyle="1" w:styleId="ImageCaption">
     <w:name w:val="Image Caption"/>
-    <w:basedOn w:val="Caption"/>
-  </w:style>
-  <w:style w:customStyle="1" w:styleId="Figure" w:type="paragraph">
+    <w:basedOn w:val="Legenda"/>
+  </w:style>
+  <w:style w:type="paragraph" w:customStyle="1" w:styleId="Figure">
     <w:name w:val="Figure"/>
     <w:basedOn w:val="Normal"/>
   </w:style>
-  <w:style w:customStyle="1" w:styleId="CaptionedFigure" w:type="paragraph">
+  <w:style w:type="paragraph" w:customStyle="1" w:styleId="CaptionedFigure">
     <w:name w:val="Captioned Figure"/>
     <w:basedOn w:val="Figure"/>
     <w:pPr>
       <w:keepNext/>
     </w:pPr>
   </w:style>
-  <w:style w:customStyle="1" w:styleId="BodyTextChar" w:type="character">
-    <w:name w:val="Body Text Char"/>
-    <w:basedOn w:val="DefaultParagraphFont"/>
-    <w:link w:val="BodyText"/>
-  </w:style>
-  <w:style w:customStyle="1" w:styleId="VerbatimChar" w:type="character">
+  <w:style w:type="character" w:customStyle="1" w:styleId="LegendaChar">
+    <w:name w:val="Legenda Char"/>
+    <w:basedOn w:val="Fontepargpadro"/>
+    <w:link w:val="Legenda"/>
+  </w:style>
+  <w:style w:type="character" w:customStyle="1" w:styleId="VerbatimChar">
     <w:name w:val="Verbatim Char"/>
-    <w:basedOn w:val="BodyTextChar"/>
-    <w:rPr>
-      <w:rFonts w:ascii="Consolas" w:hAnsi="Consolas"/>
-      <w:sz w:val="22"/>
-    </w:rPr>
-  </w:style>
-  <w:style w:customStyle="1" w:styleId="SectionNumber" w:type="character">
+    <w:basedOn w:val="LegendaChar"/>
+    <w:link w:val="SourceCode"/>
+    <w:rPr>
+      <w:rFonts w:ascii="Consolas" w:hAnsi="Consolas"/>
+      <w:sz w:val="22"/>
+    </w:rPr>
+  </w:style>
+  <w:style w:type="character" w:customStyle="1" w:styleId="SectionNumber">
     <w:name w:val="Section Number"/>
-    <w:basedOn w:val="BodyTextChar"/>
-  </w:style>
-  <w:style w:styleId="FootnoteReference" w:type="character">
-    <w:name w:val="Footnote Reference"/>
-    <w:basedOn w:val="BodyTextChar"/>
+    <w:basedOn w:val="LegendaChar"/>
+  </w:style>
+  <w:style w:type="character" w:styleId="Refdenotaderodap">
+    <w:name w:val="footnote reference"/>
+    <w:basedOn w:val="LegendaChar"/>
     <w:rPr>
       <w:vertAlign w:val="superscript"/>
     </w:rPr>
   </w:style>
-  <w:style w:styleId="Hyperlink" w:type="character">
+  <w:style w:type="character" w:styleId="Hyperlink">
     <w:name w:val="Hyperlink"/>
-    <w:basedOn w:val="BodyTextChar"/>
-    <w:rPr>
-      <w:color w:themeColor="accent1" w:val="4F81BD"/>
-    </w:rPr>
-  </w:style>
-  <w:style w:styleId="TOCHeading" w:type="paragraph">
+    <w:basedOn w:val="LegendaChar"/>
+    <w:rPr>
+      <w:color w:val="4F81BD" w:themeColor="accent1"/>
+    </w:rPr>
+  </w:style>
+  <w:style w:type="paragraph" w:styleId="CabealhodoSumrio">
     <w:name w:val="TOC Heading"/>
-    <w:basedOn w:val="Heading1"/>
-    <w:next w:val="BodyText"/>
+    <w:basedOn w:val="Ttulo1"/>
+    <w:next w:val="Corpodetexto"/>
     <w:uiPriority w:val="39"/>
     <w:unhideWhenUsed/>
     <w:qFormat/>
@@ -1153,20 +1551,19 @@
       <w:outlineLvl w:val="9"/>
     </w:pPr>
     <w:rPr>
-      <w:rFonts w:asciiTheme="majorHAnsi" w:cstheme="majorBidi" w:eastAsiaTheme="majorEastAsia" w:hAnsiTheme="majorHAnsi"/>
       <w:b w:val="0"/>
       <w:bCs w:val="0"/>
-      <w:color w:themeColor="accent1" w:themeShade="BF" w:val="365F91"/>
+      <w:color w:val="365F91" w:themeColor="accent1" w:themeShade="BF"/>
     </w:rPr>
   </w:style>
   <w:style w:type="paragraph" w:customStyle="1" w:styleId="Estilo1">
     <w:name w:val="Estilo1"/>
-    <w:basedOn w:val="BodyText"/>
+    <w:basedOn w:val="Corpodetexto"/>
     <w:qFormat/>
   </w:style>
   <w:style w:type="paragraph" w:customStyle="1" w:styleId="Estilo2">
     <w:name w:val="Estilo2"/>
-    <w:basedOn w:val="BodyText"/>
+    <w:basedOn w:val="Corpodetexto"/>
     <w:qFormat/>
   </w:style>
   <w:style w:type="paragraph" w:customStyle="1" w:styleId="SourceCode">
@@ -1174,269 +1571,331 @@
     <w:basedOn w:val="Normal"/>
     <w:link w:val="VerbatimChar"/>
     <w:pPr>
-      <w:wordWrap w:val="off"/>
-      <w:shd w:val="clear" w:fill="f8f8f8"/>
+      <w:shd w:val="clear" w:color="auto" w:fill="F8F8F8"/>
+      <w:wordWrap w:val="0"/>
     </w:pPr>
   </w:style>
   <w:style w:type="character" w:customStyle="1" w:styleId="KeywordTok">
     <w:name w:val="KeywordTok"/>
     <w:basedOn w:val="VerbatimChar"/>
     <w:rPr>
-      <w:color w:val="204a87"/>
-      <w:shd w:val="clear" w:fill="f8f8f8"/>
+      <w:rFonts w:ascii="Consolas" w:hAnsi="Consolas"/>
       <w:b/>
+      <w:color w:val="204A87"/>
+      <w:sz w:val="22"/>
+      <w:shd w:val="clear" w:color="auto" w:fill="F8F8F8"/>
     </w:rPr>
   </w:style>
   <w:style w:type="character" w:customStyle="1" w:styleId="DataTypeTok">
     <w:name w:val="DataTypeTok"/>
     <w:basedOn w:val="VerbatimChar"/>
     <w:rPr>
-      <w:color w:val="204a87"/>
-      <w:shd w:val="clear" w:fill="f8f8f8"/>
+      <w:rFonts w:ascii="Consolas" w:hAnsi="Consolas"/>
+      <w:color w:val="204A87"/>
+      <w:sz w:val="22"/>
+      <w:shd w:val="clear" w:color="auto" w:fill="F8F8F8"/>
     </w:rPr>
   </w:style>
   <w:style w:type="character" w:customStyle="1" w:styleId="DecValTok">
     <w:name w:val="DecValTok"/>
     <w:basedOn w:val="VerbatimChar"/>
     <w:rPr>
-      <w:color w:val="0000cf"/>
-      <w:shd w:val="clear" w:fill="f8f8f8"/>
+      <w:rFonts w:ascii="Consolas" w:hAnsi="Consolas"/>
+      <w:color w:val="0000CF"/>
+      <w:sz w:val="22"/>
+      <w:shd w:val="clear" w:color="auto" w:fill="F8F8F8"/>
     </w:rPr>
   </w:style>
   <w:style w:type="character" w:customStyle="1" w:styleId="BaseNTok">
     <w:name w:val="BaseNTok"/>
     <w:basedOn w:val="VerbatimChar"/>
     <w:rPr>
-      <w:color w:val="0000cf"/>
-      <w:shd w:val="clear" w:fill="f8f8f8"/>
+      <w:rFonts w:ascii="Consolas" w:hAnsi="Consolas"/>
+      <w:color w:val="0000CF"/>
+      <w:sz w:val="22"/>
+      <w:shd w:val="clear" w:color="auto" w:fill="F8F8F8"/>
     </w:rPr>
   </w:style>
   <w:style w:type="character" w:customStyle="1" w:styleId="FloatTok">
     <w:name w:val="FloatTok"/>
     <w:basedOn w:val="VerbatimChar"/>
     <w:rPr>
-      <w:color w:val="0000cf"/>
-      <w:shd w:val="clear" w:fill="f8f8f8"/>
+      <w:rFonts w:ascii="Consolas" w:hAnsi="Consolas"/>
+      <w:color w:val="0000CF"/>
+      <w:sz w:val="22"/>
+      <w:shd w:val="clear" w:color="auto" w:fill="F8F8F8"/>
     </w:rPr>
   </w:style>
   <w:style w:type="character" w:customStyle="1" w:styleId="ConstantTok">
     <w:name w:val="ConstantTok"/>
     <w:basedOn w:val="VerbatimChar"/>
     <w:rPr>
-      <w:color w:val="8f5902"/>
-      <w:shd w:val="clear" w:fill="f8f8f8"/>
+      <w:rFonts w:ascii="Consolas" w:hAnsi="Consolas"/>
+      <w:color w:val="8F5902"/>
+      <w:sz w:val="22"/>
+      <w:shd w:val="clear" w:color="auto" w:fill="F8F8F8"/>
     </w:rPr>
   </w:style>
   <w:style w:type="character" w:customStyle="1" w:styleId="CharTok">
     <w:name w:val="CharTok"/>
     <w:basedOn w:val="VerbatimChar"/>
     <w:rPr>
-      <w:color w:val="4e9a06"/>
-      <w:shd w:val="clear" w:fill="f8f8f8"/>
+      <w:rFonts w:ascii="Consolas" w:hAnsi="Consolas"/>
+      <w:color w:val="4E9A06"/>
+      <w:sz w:val="22"/>
+      <w:shd w:val="clear" w:color="auto" w:fill="F8F8F8"/>
     </w:rPr>
   </w:style>
   <w:style w:type="character" w:customStyle="1" w:styleId="SpecialCharTok">
     <w:name w:val="SpecialCharTok"/>
     <w:basedOn w:val="VerbatimChar"/>
     <w:rPr>
-      <w:color w:val="ce5c00"/>
-      <w:shd w:val="clear" w:fill="f8f8f8"/>
+      <w:rFonts w:ascii="Consolas" w:hAnsi="Consolas"/>
       <w:b/>
+      <w:color w:val="CE5C00"/>
+      <w:sz w:val="22"/>
+      <w:shd w:val="clear" w:color="auto" w:fill="F8F8F8"/>
     </w:rPr>
   </w:style>
   <w:style w:type="character" w:customStyle="1" w:styleId="StringTok">
     <w:name w:val="StringTok"/>
     <w:basedOn w:val="VerbatimChar"/>
     <w:rPr>
-      <w:color w:val="4e9a06"/>
-      <w:shd w:val="clear" w:fill="f8f8f8"/>
+      <w:rFonts w:ascii="Consolas" w:hAnsi="Consolas"/>
+      <w:color w:val="4E9A06"/>
+      <w:sz w:val="22"/>
+      <w:shd w:val="clear" w:color="auto" w:fill="F8F8F8"/>
     </w:rPr>
   </w:style>
   <w:style w:type="character" w:customStyle="1" w:styleId="VerbatimStringTok">
     <w:name w:val="VerbatimStringTok"/>
     <w:basedOn w:val="VerbatimChar"/>
     <w:rPr>
-      <w:color w:val="4e9a06"/>
-      <w:shd w:val="clear" w:fill="f8f8f8"/>
+      <w:rFonts w:ascii="Consolas" w:hAnsi="Consolas"/>
+      <w:color w:val="4E9A06"/>
+      <w:sz w:val="22"/>
+      <w:shd w:val="clear" w:color="auto" w:fill="F8F8F8"/>
     </w:rPr>
   </w:style>
   <w:style w:type="character" w:customStyle="1" w:styleId="SpecialStringTok">
     <w:name w:val="SpecialStringTok"/>
     <w:basedOn w:val="VerbatimChar"/>
     <w:rPr>
-      <w:color w:val="4e9a06"/>
-      <w:shd w:val="clear" w:fill="f8f8f8"/>
+      <w:rFonts w:ascii="Consolas" w:hAnsi="Consolas"/>
+      <w:color w:val="4E9A06"/>
+      <w:sz w:val="22"/>
+      <w:shd w:val="clear" w:color="auto" w:fill="F8F8F8"/>
     </w:rPr>
   </w:style>
   <w:style w:type="character" w:customStyle="1" w:styleId="ImportTok">
     <w:name w:val="ImportTok"/>
     <w:basedOn w:val="VerbatimChar"/>
     <w:rPr>
-      <w:shd w:val="clear" w:fill="f8f8f8"/>
+      <w:rFonts w:ascii="Consolas" w:hAnsi="Consolas"/>
+      <w:sz w:val="22"/>
+      <w:shd w:val="clear" w:color="auto" w:fill="F8F8F8"/>
     </w:rPr>
   </w:style>
   <w:style w:type="character" w:customStyle="1" w:styleId="CommentTok">
     <w:name w:val="CommentTok"/>
     <w:basedOn w:val="VerbatimChar"/>
     <w:rPr>
-      <w:color w:val="8f5902"/>
-      <w:shd w:val="clear" w:fill="f8f8f8"/>
+      <w:rFonts w:ascii="Consolas" w:hAnsi="Consolas"/>
       <w:i/>
+      <w:color w:val="8F5902"/>
+      <w:sz w:val="22"/>
+      <w:shd w:val="clear" w:color="auto" w:fill="F8F8F8"/>
     </w:rPr>
   </w:style>
   <w:style w:type="character" w:customStyle="1" w:styleId="DocumentationTok">
     <w:name w:val="DocumentationTok"/>
     <w:basedOn w:val="VerbatimChar"/>
     <w:rPr>
-      <w:color w:val="8f5902"/>
-      <w:shd w:val="clear" w:fill="f8f8f8"/>
+      <w:rFonts w:ascii="Consolas" w:hAnsi="Consolas"/>
       <w:b/>
       <w:i/>
+      <w:color w:val="8F5902"/>
+      <w:sz w:val="22"/>
+      <w:shd w:val="clear" w:color="auto" w:fill="F8F8F8"/>
     </w:rPr>
   </w:style>
   <w:style w:type="character" w:customStyle="1" w:styleId="AnnotationTok">
     <w:name w:val="AnnotationTok"/>
     <w:basedOn w:val="VerbatimChar"/>
     <w:rPr>
-      <w:color w:val="8f5902"/>
-      <w:shd w:val="clear" w:fill="f8f8f8"/>
+      <w:rFonts w:ascii="Consolas" w:hAnsi="Consolas"/>
       <w:b/>
       <w:i/>
+      <w:color w:val="8F5902"/>
+      <w:sz w:val="22"/>
+      <w:shd w:val="clear" w:color="auto" w:fill="F8F8F8"/>
     </w:rPr>
   </w:style>
   <w:style w:type="character" w:customStyle="1" w:styleId="CommentVarTok">
     <w:name w:val="CommentVarTok"/>
     <w:basedOn w:val="VerbatimChar"/>
     <w:rPr>
-      <w:color w:val="8f5902"/>
-      <w:shd w:val="clear" w:fill="f8f8f8"/>
+      <w:rFonts w:ascii="Consolas" w:hAnsi="Consolas"/>
       <w:b/>
       <w:i/>
+      <w:color w:val="8F5902"/>
+      <w:sz w:val="22"/>
+      <w:shd w:val="clear" w:color="auto" w:fill="F8F8F8"/>
     </w:rPr>
   </w:style>
   <w:style w:type="character" w:customStyle="1" w:styleId="OtherTok">
     <w:name w:val="OtherTok"/>
     <w:basedOn w:val="VerbatimChar"/>
     <w:rPr>
-      <w:color w:val="8f5902"/>
-      <w:shd w:val="clear" w:fill="f8f8f8"/>
+      <w:rFonts w:ascii="Consolas" w:hAnsi="Consolas"/>
+      <w:color w:val="8F5902"/>
+      <w:sz w:val="22"/>
+      <w:shd w:val="clear" w:color="auto" w:fill="F8F8F8"/>
     </w:rPr>
   </w:style>
   <w:style w:type="character" w:customStyle="1" w:styleId="FunctionTok">
     <w:name w:val="FunctionTok"/>
     <w:basedOn w:val="VerbatimChar"/>
     <w:rPr>
-      <w:color w:val="204a87"/>
-      <w:shd w:val="clear" w:fill="f8f8f8"/>
+      <w:rFonts w:ascii="Consolas" w:hAnsi="Consolas"/>
       <w:b/>
+      <w:color w:val="204A87"/>
+      <w:sz w:val="22"/>
+      <w:shd w:val="clear" w:color="auto" w:fill="F8F8F8"/>
     </w:rPr>
   </w:style>
   <w:style w:type="character" w:customStyle="1" w:styleId="VariableTok">
     <w:name w:val="VariableTok"/>
     <w:basedOn w:val="VerbatimChar"/>
     <w:rPr>
+      <w:rFonts w:ascii="Consolas" w:hAnsi="Consolas"/>
       <w:color w:val="000000"/>
-      <w:shd w:val="clear" w:fill="f8f8f8"/>
+      <w:sz w:val="22"/>
+      <w:shd w:val="clear" w:color="auto" w:fill="F8F8F8"/>
     </w:rPr>
   </w:style>
   <w:style w:type="character" w:customStyle="1" w:styleId="ControlFlowTok">
     <w:name w:val="ControlFlowTok"/>
     <w:basedOn w:val="VerbatimChar"/>
     <w:rPr>
-      <w:color w:val="204a87"/>
-      <w:shd w:val="clear" w:fill="f8f8f8"/>
+      <w:rFonts w:ascii="Consolas" w:hAnsi="Consolas"/>
       <w:b/>
+      <w:color w:val="204A87"/>
+      <w:sz w:val="22"/>
+      <w:shd w:val="clear" w:color="auto" w:fill="F8F8F8"/>
     </w:rPr>
   </w:style>
   <w:style w:type="character" w:customStyle="1" w:styleId="OperatorTok">
     <w:name w:val="OperatorTok"/>
     <w:basedOn w:val="VerbatimChar"/>
     <w:rPr>
-      <w:color w:val="ce5c00"/>
-      <w:shd w:val="clear" w:fill="f8f8f8"/>
+      <w:rFonts w:ascii="Consolas" w:hAnsi="Consolas"/>
       <w:b/>
+      <w:color w:val="CE5C00"/>
+      <w:sz w:val="22"/>
+      <w:shd w:val="clear" w:color="auto" w:fill="F8F8F8"/>
     </w:rPr>
   </w:style>
   <w:style w:type="character" w:customStyle="1" w:styleId="BuiltInTok">
     <w:name w:val="BuiltInTok"/>
     <w:basedOn w:val="VerbatimChar"/>
     <w:rPr>
-      <w:shd w:val="clear" w:fill="f8f8f8"/>
+      <w:rFonts w:ascii="Consolas" w:hAnsi="Consolas"/>
+      <w:sz w:val="22"/>
+      <w:shd w:val="clear" w:color="auto" w:fill="F8F8F8"/>
     </w:rPr>
   </w:style>
   <w:style w:type="character" w:customStyle="1" w:styleId="ExtensionTok">
     <w:name w:val="ExtensionTok"/>
     <w:basedOn w:val="VerbatimChar"/>
     <w:rPr>
-      <w:shd w:val="clear" w:fill="f8f8f8"/>
+      <w:rFonts w:ascii="Consolas" w:hAnsi="Consolas"/>
+      <w:sz w:val="22"/>
+      <w:shd w:val="clear" w:color="auto" w:fill="F8F8F8"/>
     </w:rPr>
   </w:style>
   <w:style w:type="character" w:customStyle="1" w:styleId="PreprocessorTok">
     <w:name w:val="PreprocessorTok"/>
     <w:basedOn w:val="VerbatimChar"/>
     <w:rPr>
-      <w:color w:val="8f5902"/>
-      <w:shd w:val="clear" w:fill="f8f8f8"/>
+      <w:rFonts w:ascii="Consolas" w:hAnsi="Consolas"/>
       <w:i/>
+      <w:color w:val="8F5902"/>
+      <w:sz w:val="22"/>
+      <w:shd w:val="clear" w:color="auto" w:fill="F8F8F8"/>
     </w:rPr>
   </w:style>
   <w:style w:type="character" w:customStyle="1" w:styleId="AttributeTok">
     <w:name w:val="AttributeTok"/>
     <w:basedOn w:val="VerbatimChar"/>
     <w:rPr>
-      <w:color w:val="204a87"/>
-      <w:shd w:val="clear" w:fill="f8f8f8"/>
+      <w:rFonts w:ascii="Consolas" w:hAnsi="Consolas"/>
+      <w:color w:val="204A87"/>
+      <w:sz w:val="22"/>
+      <w:shd w:val="clear" w:color="auto" w:fill="F8F8F8"/>
     </w:rPr>
   </w:style>
   <w:style w:type="character" w:customStyle="1" w:styleId="RegionMarkerTok">
     <w:name w:val="RegionMarkerTok"/>
     <w:basedOn w:val="VerbatimChar"/>
     <w:rPr>
-      <w:shd w:val="clear" w:fill="f8f8f8"/>
+      <w:rFonts w:ascii="Consolas" w:hAnsi="Consolas"/>
+      <w:sz w:val="22"/>
+      <w:shd w:val="clear" w:color="auto" w:fill="F8F8F8"/>
     </w:rPr>
   </w:style>
   <w:style w:type="character" w:customStyle="1" w:styleId="InformationTok">
     <w:name w:val="InformationTok"/>
     <w:basedOn w:val="VerbatimChar"/>
     <w:rPr>
-      <w:color w:val="8f5902"/>
-      <w:shd w:val="clear" w:fill="f8f8f8"/>
+      <w:rFonts w:ascii="Consolas" w:hAnsi="Consolas"/>
       <w:b/>
       <w:i/>
+      <w:color w:val="8F5902"/>
+      <w:sz w:val="22"/>
+      <w:shd w:val="clear" w:color="auto" w:fill="F8F8F8"/>
     </w:rPr>
   </w:style>
   <w:style w:type="character" w:customStyle="1" w:styleId="WarningTok">
     <w:name w:val="WarningTok"/>
     <w:basedOn w:val="VerbatimChar"/>
     <w:rPr>
-      <w:color w:val="8f5902"/>
-      <w:shd w:val="clear" w:fill="f8f8f8"/>
+      <w:rFonts w:ascii="Consolas" w:hAnsi="Consolas"/>
       <w:b/>
       <w:i/>
+      <w:color w:val="8F5902"/>
+      <w:sz w:val="22"/>
+      <w:shd w:val="clear" w:color="auto" w:fill="F8F8F8"/>
     </w:rPr>
   </w:style>
   <w:style w:type="character" w:customStyle="1" w:styleId="AlertTok">
     <w:name w:val="AlertTok"/>
     <w:basedOn w:val="VerbatimChar"/>
     <w:rPr>
-      <w:color w:val="ef2929"/>
-      <w:shd w:val="clear" w:fill="f8f8f8"/>
+      <w:rFonts w:ascii="Consolas" w:hAnsi="Consolas"/>
+      <w:color w:val="EF2929"/>
+      <w:sz w:val="22"/>
+      <w:shd w:val="clear" w:color="auto" w:fill="F8F8F8"/>
     </w:rPr>
   </w:style>
   <w:style w:type="character" w:customStyle="1" w:styleId="ErrorTok">
     <w:name w:val="ErrorTok"/>
     <w:basedOn w:val="VerbatimChar"/>
     <w:rPr>
-      <w:color w:val="a40000"/>
-      <w:shd w:val="clear" w:fill="f8f8f8"/>
+      <w:rFonts w:ascii="Consolas" w:hAnsi="Consolas"/>
       <w:b/>
+      <w:color w:val="A40000"/>
+      <w:sz w:val="22"/>
+      <w:shd w:val="clear" w:color="auto" w:fill="F8F8F8"/>
     </w:rPr>
   </w:style>
   <w:style w:type="character" w:customStyle="1" w:styleId="NormalTok">
     <w:name w:val="NormalTok"/>
     <w:basedOn w:val="VerbatimChar"/>
     <w:rPr>
-      <w:shd w:val="clear" w:fill="f8f8f8"/>
+      <w:rFonts w:ascii="Consolas" w:hAnsi="Consolas"/>
+      <w:sz w:val="22"/>
+      <w:shd w:val="clear" w:color="auto" w:fill="F8F8F8"/>
     </w:rPr>
   </w:style>
 </w:styles>

</xml_diff>

<commit_message>
Ajuste no template_doc e no tamanho dos plots para caberem nas páginas junto com as análises
</commit_message>
<xml_diff>
--- a/R/Relatorio_anual_2022.docx
+++ b/R/Relatorio_anual_2022.docx
@@ -83,7 +83,7 @@
         <w:pStyle w:val="Date"/>
       </w:pPr>
       <w:r>
-        <w:t xml:space="preserve">2023-03-06</w:t>
+        <w:t xml:space="preserve">2023-03-23</w:t>
       </w:r>
     </w:p>
     <w:p>
@@ -99,13 +99,25 @@
         <w:pStyle w:val="BodyText"/>
       </w:pPr>
       <w:r>
-        <w:t xml:space="preserve">O Instituto Sou da Paz acompanha as estatísticas criminais divulgadas pela Secretaria da Segurança Pública de São Paulo (SSP/SP) desde 2012, a fim de contribuir para a melhor compreensão das dinâmicas criminais e atividades policiais no estado de São Paulo e em suas grandes regiões - Capital, Grande São Paulo e Interior. Além dos dados mensal e trimestralmente divulgados pela SSP/SP, são consideradas informações produzidas pelas Corregedorias das Polícias Civil e Militar do Estado de São Paulo publicadas no Diário Oficial.</w:t>
-      </w:r>
-      <w:r>
-        <w:t xml:space="preserve"> </w:t>
-      </w:r>
-      <w:r>
-        <w:t xml:space="preserve">Nesta edição do Sou da Paz Analisa, damos destaque aos casos de extorsão mediante sequestro, que tiveram aumento de 143,5% em 2022, comparado ao ano anterior. Nesta modalidade de crime, são registrados os casos que ficaram popularmente conhecidos como</w:t>
+        <w:t xml:space="preserve">O Instituto Sou da Paz acompanha as estatísticas criminais divulgadas pela Secretaria da Segurança Pública de São Paulo (SSP/SP) desde 2012, a fim de contribuir para a melhor compreensão das dinâmicas criminais e atividades policiais no estado de São Paulo e em suas grandes regiões - Capital, Grande São Paulo e Interior.</w:t>
+      </w:r>
+      <w:r>
+        <w:t xml:space="preserve"> </w:t>
+      </w:r>
+      <w:r>
+        <w:t xml:space="preserve">Além dos dados mensal e trimestralmente divulgados pela SSP/SP, são consideradas informações produzidas pelas Corregedorias das Polícias Civil e Militar do Estado de São Paulo publicadas no Diário Oficial.</w:t>
+      </w:r>
+      <w:r>
+        <w:t xml:space="preserve"> </w:t>
+      </w:r>
+      <w:r>
+        <w:t xml:space="preserve">Nesta edição do Sou da Paz Analisa, damos destaque aos casos de extorsão mediante sequestro, que tiveram aumento de 143,5% em 2022, comparado ao ano anterior.</w:t>
+      </w:r>
+      <w:r>
+        <w:t xml:space="preserve"> </w:t>
+      </w:r>
+      <w:r>
+        <w:t xml:space="preserve">Nesta modalidade de crime, são registrados os casos que ficaram popularmente conhecidos como</w:t>
       </w:r>
       <w:r>
         <w:t xml:space="preserve"> </w:t>
@@ -126,7 +138,37 @@
         <w:t xml:space="preserve"> </w:t>
       </w:r>
       <w:r>
-        <w:t xml:space="preserve">Nos crimes de letalidade violenta, as mortes cometidas por policiais em serviço reduziram em -39% no período. Os casos de homicídio doloso aumentaram em 7,2%, com destaque para a região da Grande São Paulo, com representativos 21,2% de casos a mais registrados em 2022. Os casos de latrocínio aumentaram em 46,5%. Os casos de violência contra a mulher, mais especificamente a modalidade de lesão corporal, vêm aumentando de maneira substancial. As pessoas vulneráveis foram as maiores vitimadas nos casos de estupro registrados em 2022, representando 77% do total dos casos. As dinâmicas de roubo voltaram a subir, com destaque para a Capital, com 12,4% de novos casos no período.</w:t>
+        <w:t xml:space="preserve">Nos crimes de letalidade violenta, as mortes cometidas por policiais em serviço reduziram em -39% no período.</w:t>
+      </w:r>
+      <w:r>
+        <w:t xml:space="preserve"> </w:t>
+      </w:r>
+      <w:r>
+        <w:t xml:space="preserve">Os casos de homicídio doloso aumentaram em 7,2%, com destaque para a região da Grande São Paulo, com representativos 21,2% de casos a mais registrados em 2022.</w:t>
+      </w:r>
+      <w:r>
+        <w:t xml:space="preserve"> </w:t>
+      </w:r>
+      <w:r>
+        <w:t xml:space="preserve">Os casos de latrocínio aumentaram em 46,5%.</w:t>
+      </w:r>
+      <w:r>
+        <w:t xml:space="preserve"> </w:t>
+      </w:r>
+      <w:r>
+        <w:t xml:space="preserve">Os casos de violência contra a mulher, mais especificamente a modalidade de lesão corporal, vêm aumentando de maneira substancial.</w:t>
+      </w:r>
+      <w:r>
+        <w:t xml:space="preserve"> </w:t>
+      </w:r>
+      <w:r>
+        <w:t xml:space="preserve">As pessoas vulneráveis foram as maiores vitimadas nos casos de estupro registrados em 2022, representando 77% do total dos casos.</w:t>
+      </w:r>
+      <w:r>
+        <w:t xml:space="preserve"> </w:t>
+      </w:r>
+      <w:r>
+        <w:t xml:space="preserve">As dinâmicas de roubo voltaram a subir, com destaque para a Capital, com 12,4% de novos casos no período.</w:t>
       </w:r>
     </w:p>
     <w:p>
@@ -140,30 +182,6 @@
       </w:pPr>
       <w:r>
         <w:t xml:space="preserve">Criminalidade Violenta</w:t>
-      </w:r>
-    </w:p>
-    <w:p>
-      <w:pPr>
-        <w:pStyle w:val="BodyText"/>
-      </w:pPr>
-      <w:r>
-        <w:t xml:space="preserve">Texto de descrição do</w:t>
-      </w:r>
-      <w:r>
-        <w:t xml:space="preserve"> </w:t>
-      </w:r>
-      <w:r>
-        <w:rPr>
-          <w:iCs/>
-          <w:i/>
-        </w:rPr>
-        <w:t xml:space="preserve">principal</w:t>
-      </w:r>
-      <w:r>
-        <w:t xml:space="preserve"> </w:t>
-      </w:r>
-      <w:r>
-        <w:t xml:space="preserve">destaque dos dados</w:t>
       </w:r>
     </w:p>
     <w:p>
@@ -173,7 +191,7 @@
       <w:r>
         <w:drawing>
           <wp:inline>
-            <wp:extent cx="5334000" cy="3556000"/>
+            <wp:extent cx="7392202" cy="3696101"/>
             <wp:effectExtent b="0" l="0" r="0" t="0"/>
             <wp:docPr descr="" title="" id="21" name="Picture"/>
             <a:graphic>
@@ -194,7 +212,7 @@
                   <pic:spPr bwMode="auto">
                     <a:xfrm>
                       <a:off x="0" y="0"/>
-                      <a:ext cx="5334000" cy="3556000"/>
+                      <a:ext cx="7392202" cy="3696101"/>
                     </a:xfrm>
                     <a:prstGeom prst="rect">
                       <a:avLst/>
@@ -218,7 +236,13 @@
         <w:pStyle w:val="BodyText"/>
       </w:pPr>
       <w:r>
-        <w:t xml:space="preserve">Em 2022, a criminalidade violenta no estado de São Paulo apresentou aumento em todos os tipos criminais analisados, porém a extorsão mediante sequestro é, entre todos, o crime que teve o maior acréscimo, dobrando o número de casos na comparação entre os anos de 2021 e 2022. Esta elevação pode ter como um dos principais fatores uma nova dinâmica, chamada de</w:t>
+        <w:t xml:space="preserve">Em 2022, a criminalidade violenta no estado de São Paulo apresentou aumento em todos os tipos criminais analisados, porém a extorsão mediante sequestro é, entre todos, o crime que teve o maior acréscimo, dobrando o número de casos na comparação entre os anos de 2021 e 2022.</w:t>
+      </w:r>
+      <w:r>
+        <w:t xml:space="preserve"> </w:t>
+      </w:r>
+      <w:r>
+        <w:t xml:space="preserve">Esta elevação pode ter como um dos principais fatores uma nova dinâmica, chamada de</w:t>
       </w:r>
       <w:r>
         <w:t xml:space="preserve"> </w:t>
@@ -233,48 +257,42 @@
         <w:t xml:space="preserve">”</w:t>
       </w:r>
       <w:r>
-        <w:t xml:space="preserve">, modalidade de crime que surgiu com o advento da tecnologia de transferências monetárias de forma imediata, o pix, lançado pelo Banco Central em 2020. O aumento no número total de ocorrências no ano de 2022 também se atrela ao fim das políticas de redução de circulação social e da campanha de vacinação contra Covid-19 que, ao longo dos anos de 2020 e 2021, reduziram o número de pessoas em circulação nas ruas. Ao observarmos outros crimes, também é constatado o aumento nos números de casos, como o estrupo com um acréscimo de 7,3% de registros — mantendo o total agregado acima de 10.000 casos desde a pandemia de Covid-19 —, e o latrocínio e homicídios dolosos que apresentaram aumentos de 7,3% e 7,2%, respectivamente, mas com pouca variação bruta.</w:t>
-      </w:r>
-      <w:r>
-        <w:t xml:space="preserve"> </w:t>
-      </w:r>
-      <w:r>
-        <w:t xml:space="preserve"> </w:t>
-      </w:r>
-      <w:r>
-        <w:t xml:space="preserve">::: {custom-style=</w:t>
-      </w:r>
-      <w:r>
-        <w:t xml:space="preserve">“</w:t>
-      </w:r>
-      <w:r>
-        <w:t xml:space="preserve">Estilo2</w:t>
-      </w:r>
-      <w:r>
-        <w:t xml:space="preserve">”</w:t>
-      </w:r>
-      <w:r>
-        <w:t xml:space="preserve">}</w:t>
-      </w:r>
-      <w:r>
-        <w:t xml:space="preserve"> </w:t>
-      </w:r>
+        <w:t xml:space="preserve">, modalidade de crime que surgiu com o advento da tecnologia de transferências monetárias de forma imediata, o pix, lançado pelo Banco Central em 2020.</w:t>
+      </w:r>
+      <w:r>
+        <w:t xml:space="preserve"> </w:t>
+      </w:r>
+      <w:r>
+        <w:t xml:space="preserve">O aumento no número total de ocorrências no ano de 2022 também se atrela ao fim das políticas de redução de circulação social e da campanha de vacinação contra Covid-19 que, ao longo dos anos de 2020 e 2021, reduziram o número de pessoas em circulação nas ruas.</w:t>
+      </w:r>
+      <w:r>
+        <w:t xml:space="preserve"> </w:t>
+      </w:r>
+      <w:r>
+        <w:t xml:space="preserve">Ao observarmos outros crimes, também é constatado o aumento nos números de casos, como o estrupo com um acréscimo de 7,3% de registros — mantendo o total agregado acima de 10.000 casos desde a pandemia de Covid-19 —, e o latrocínio e homicídios dolosos que apresentaram aumentos de 7,3% e 7,2%, respectivamente, mas com pouca variação bruta.</w:t>
+      </w:r>
+    </w:p>
+    <w:p>
+      <w:r>
+        <w:br w:type="page"/>
+      </w:r>
+    </w:p>
+    <w:p>
+      <w:pPr>
+        <w:pStyle w:val="Estilo2"/>
+      </w:pPr>
       <w:r>
         <w:t xml:space="preserve">Letalidade Violenta</w:t>
       </w:r>
-      <w:r>
-        <w:t xml:space="preserve"> </w:t>
-      </w:r>
-      <w:r>
-        <w:t xml:space="preserve">:::</w:t>
-      </w:r>
-      <w:r>
-        <w:t xml:space="preserve"> </w:t>
-      </w:r>
+    </w:p>
+    <w:p>
+      <w:pPr>
+        <w:pStyle w:val="BodyText"/>
+      </w:pPr>
       <w:r>
         <w:drawing>
           <wp:inline>
-            <wp:extent cx="5334000" cy="3556000"/>
+            <wp:extent cx="7392202" cy="3696101"/>
             <wp:effectExtent b="0" l="0" r="0" t="0"/>
             <wp:docPr descr="" title="" id="24" name="Picture"/>
             <a:graphic>
@@ -295,7 +313,7 @@
                   <pic:spPr bwMode="auto">
                     <a:xfrm>
                       <a:off x="0" y="0"/>
-                      <a:ext cx="5334000" cy="3556000"/>
+                      <a:ext cx="7392202" cy="3696101"/>
                     </a:xfrm>
                     <a:prstGeom prst="rect">
                       <a:avLst/>
@@ -319,7 +337,31 @@
         <w:pStyle w:val="BodyText"/>
       </w:pPr>
       <w:r>
-        <w:t xml:space="preserve">As mortes cometidas por policiais em serviço reduziram significativamente no estado de São Paulo em 2022. Foram -39% de mortes registradas, comparado ao ano anterior. Em contrapartida, os casos de mortes cometidas por policiais fora de serviço aumentaram em 8% no período analisado, mantendo caráter oscilatório, após queda notável ocorrida em 2019 . Os casos de latrocínio aumentaram em 24%. Num panorama do total de vítimas, houve pouca variação (2%), fenômeno que pode ser explicado se observado a redução dos casos de mortos pela polícia em serviço e o aumento de latrocínios no estado.</w:t>
+        <w:t xml:space="preserve">As mortes cometidas por policiais em serviço reduziram significativamente no estado de São Paulo em 2022.</w:t>
+      </w:r>
+      <w:r>
+        <w:t xml:space="preserve"> </w:t>
+      </w:r>
+      <w:r>
+        <w:t xml:space="preserve">Foram -39% de mortes registradas, comparado ao ano anterior.</w:t>
+      </w:r>
+      <w:r>
+        <w:t xml:space="preserve"> </w:t>
+      </w:r>
+      <w:r>
+        <w:t xml:space="preserve">Em contrapartida, os casos de mortes cometidas por policiais fora de serviço aumentaram em 8% no período analisado, mantendo caráter oscilatório, após queda notável ocorrida em 2019 .</w:t>
+      </w:r>
+      <w:r>
+        <w:t xml:space="preserve"> </w:t>
+      </w:r>
+      <w:r>
+        <w:t xml:space="preserve">Os casos de latrocínio aumentaram em 24%.</w:t>
+      </w:r>
+      <w:r>
+        <w:t xml:space="preserve"> </w:t>
+      </w:r>
+      <w:r>
+        <w:t xml:space="preserve">Num panorama do total de vítimas, houve pouca variação (2%), fenômeno que pode ser explicado se observado a redução dos casos de mortos pela polícia em serviço e o aumento de latrocínios no estado.</w:t>
       </w:r>
     </w:p>
     <w:p>
@@ -342,7 +384,7 @@
       <w:r>
         <w:drawing>
           <wp:inline>
-            <wp:extent cx="5334000" cy="3556000"/>
+            <wp:extent cx="7392202" cy="4158113"/>
             <wp:effectExtent b="0" l="0" r="0" t="0"/>
             <wp:docPr descr="" title="" id="27" name="Picture"/>
             <a:graphic>
@@ -363,7 +405,7 @@
                   <pic:spPr bwMode="auto">
                     <a:xfrm>
                       <a:off x="0" y="0"/>
-                      <a:ext cx="5334000" cy="3556000"/>
+                      <a:ext cx="7392202" cy="4158113"/>
                     </a:xfrm>
                     <a:prstGeom prst="rect">
                       <a:avLst/>
@@ -387,7 +429,55 @@
         <w:pStyle w:val="BodyText"/>
       </w:pPr>
       <w:r>
-        <w:t xml:space="preserve">Os casos de homicídio doloso seguem com suas variações, que podem ser observadas desde o início da série histórica. Ao comparar o ano de 2022 com 2018, é notada uma redução mínima de -1,4% de casos registrados. Já comparado com 2019, ano pré-pandemia de covid-19, houve aumento de 4,7%. Entre 2022 e 2020, ano em que ocorreram diversas mudanças no comportamento da sociedade em decorrência da pandemia, notamos aumento de 0,6% nos casos de homicídio no estado de São Paulo. Neste período, destaca-se somente a redução da Capital, região em manteve diversas políticas de isolamento social, com -15% de casos registrados. Em 2022, os casos voltaram a subir de maneira notável, com 7,2% de casos de homicídios a mais registrados em São Paulo. O destaque fica com a região da Grande São Paulo, que teve 21,2% de casos a mais no período analisado. No Interior, houve aumento de 5,6% e na Capital, queda de -0,5%. Com esta série é possível constatar que o período pandêmico sofrido entre os anos de 2020 e 2021 não afetou os índices de homicídio doloso no estado de São Paulo, visto que houve pouca variação se comparado aos anos que antecederam a pandemia.</w:t>
+        <w:t xml:space="preserve">Os casos de homicídio doloso seguem com suas variações, que podem ser observadas desde o início da série histórica.</w:t>
+      </w:r>
+      <w:r>
+        <w:t xml:space="preserve"> </w:t>
+      </w:r>
+      <w:r>
+        <w:t xml:space="preserve">Ao comparar o ano de 2022 com 2018, é notada uma redução mínima de -1,4% de casos registrados.</w:t>
+      </w:r>
+      <w:r>
+        <w:t xml:space="preserve"> </w:t>
+      </w:r>
+      <w:r>
+        <w:t xml:space="preserve">Já comparado com 2019, ano pré-pandemia de covid-19, houve aumento de 4,7%.</w:t>
+      </w:r>
+      <w:r>
+        <w:t xml:space="preserve"> </w:t>
+      </w:r>
+      <w:r>
+        <w:t xml:space="preserve">Entre 2022 e 2020, ano em que ocorreram diversas mudanças no comportamento da sociedade em decorrência da pandemia, notamos aumento de 0,6% nos casos de homicídio no estado de São Paulo.</w:t>
+      </w:r>
+      <w:r>
+        <w:t xml:space="preserve"> </w:t>
+      </w:r>
+      <w:r>
+        <w:t xml:space="preserve">Neste período, destaca-se somente a redução da Capital, região em manteve diversas políticas de isolamento social, com -15% de casos registrados.</w:t>
+      </w:r>
+      <w:r>
+        <w:t xml:space="preserve"> </w:t>
+      </w:r>
+      <w:r>
+        <w:t xml:space="preserve">Em 2022, os casos voltaram a subir de maneira notável, com 7,2% de casos de homicídios a mais registrados em São Paulo.</w:t>
+      </w:r>
+      <w:r>
+        <w:t xml:space="preserve"> </w:t>
+      </w:r>
+      <w:r>
+        <w:t xml:space="preserve">O destaque fica com a região da Grande São Paulo, que teve 21,2% de casos a mais no período analisado.</w:t>
+      </w:r>
+      <w:r>
+        <w:t xml:space="preserve"> </w:t>
+      </w:r>
+      <w:r>
+        <w:t xml:space="preserve">No Interior, houve aumento de 5,6% e na Capital, queda de -0,5%.</w:t>
+      </w:r>
+      <w:r>
+        <w:t xml:space="preserve"> </w:t>
+      </w:r>
+      <w:r>
+        <w:t xml:space="preserve">Com esta série é possível constatar que o período pandêmico sofrido entre os anos de 2020 e 2021 não afetou os índices de homicídio doloso no estado de São Paulo, visto que houve pouca variação se comparado aos anos que antecederam a pandemia.</w:t>
       </w:r>
     </w:p>
     <w:p>
@@ -410,7 +500,7 @@
       <w:r>
         <w:drawing>
           <wp:inline>
-            <wp:extent cx="5334000" cy="3556000"/>
+            <wp:extent cx="7392202" cy="4158113"/>
             <wp:effectExtent b="0" l="0" r="0" t="0"/>
             <wp:docPr descr="" title="" id="30" name="Picture"/>
             <a:graphic>
@@ -431,7 +521,7 @@
                   <pic:spPr bwMode="auto">
                     <a:xfrm>
                       <a:off x="0" y="0"/>
-                      <a:ext cx="5334000" cy="3556000"/>
+                      <a:ext cx="7392202" cy="4158113"/>
                     </a:xfrm>
                     <a:prstGeom prst="rect">
                       <a:avLst/>
@@ -455,7 +545,19 @@
         <w:pStyle w:val="BodyText"/>
       </w:pPr>
       <w:r>
-        <w:t xml:space="preserve">Em 2022 houveram 178 casos de latrocínios registrados pela polícia paulista, aumento de 7,6% se comparado ao ano anterior. A Capital foi a região que apresentou maior alta no número de casos de latrocínio, saindo de 53 em 2021, para 63 em 2022, um salto de 18,8%. Na comparação entre os anos de 2020 e 2022, não se observa redução significativa no total de casos, porém, a Capital tem o maior acréscimo (46,5%) observado no total de casos entre os dois anos, o que é explicado pela redução do número de pessoas em circulação nas ruas durante o ano de 2020 em razão da pandemia de Covid-19, cenário normalizado em 2022.</w:t>
+        <w:t xml:space="preserve">Em 2022 houveram 178 casos de latrocínios registrados pela polícia paulista, aumento de 7,6% se comparado ao ano anterior.</w:t>
+      </w:r>
+      <w:r>
+        <w:t xml:space="preserve"> </w:t>
+      </w:r>
+      <w:r>
+        <w:t xml:space="preserve">A Capital foi a região que apresentou maior alta no número de casos de latrocínio, saindo de 53 em 2021, para 63 em 2022, um salto de 18,8%.</w:t>
+      </w:r>
+      <w:r>
+        <w:t xml:space="preserve"> </w:t>
+      </w:r>
+      <w:r>
+        <w:t xml:space="preserve">Na comparação entre os anos de 2020 e 2022, não se observa redução significativa no total de casos, porém, a Capital tem o maior acréscimo (46,5%) observado no total de casos entre os dois anos, o que é explicado pela redução do número de pessoas em circulação nas ruas durante o ano de 2020 em razão da pandemia de Covid-19, cenário normalizado em 2022.</w:t>
       </w:r>
     </w:p>
     <w:p>
@@ -478,7 +580,7 @@
       <w:r>
         <w:drawing>
           <wp:inline>
-            <wp:extent cx="5334000" cy="3556000"/>
+            <wp:extent cx="7392202" cy="4158113"/>
             <wp:effectExtent b="0" l="0" r="0" t="0"/>
             <wp:docPr descr="" title="" id="33" name="Picture"/>
             <a:graphic>
@@ -499,7 +601,7 @@
                   <pic:spPr bwMode="auto">
                     <a:xfrm>
                       <a:off x="0" y="0"/>
-                      <a:ext cx="5334000" cy="3556000"/>
+                      <a:ext cx="7392202" cy="4158113"/>
                     </a:xfrm>
                     <a:prstGeom prst="rect">
                       <a:avLst/>
@@ -523,7 +625,25 @@
         <w:pStyle w:val="BodyText"/>
       </w:pPr>
       <w:r>
-        <w:t xml:space="preserve">Ao menos 52.672 casos de lesão corporal de mulheres foram registrados em 2022 no estado de São Paulo, um aumento residual de 1,38% em comparação a 2021. Dentre as regiões analisadas, somente a Capital apresentou aumento em relação ao ano anterior, 3.909 casos a mais. Tanto o Interior, quanto a Grande São Paulo tiveram queda nas notificações. O aumento progressivo que vem sendo observado desde então denota a urgência de se pensar políticas públicas para a redução efetiva dos casos de lesão corporal contra a mulher.</w:t>
+        <w:t xml:space="preserve">Ao menos 52.672 casos de lesão corporal de mulheres foram registrados em 2022 no estado de São Paulo, um aumento residual de 1,38% em comparação a 2021.</w:t>
+      </w:r>
+      <w:r>
+        <w:t xml:space="preserve"> </w:t>
+      </w:r>
+      <w:r>
+        <w:t xml:space="preserve">Dentre as regiões analisadas, somente a Capital apresentou aumento em relação ao ano anterior, 3.909 casos a mais.</w:t>
+      </w:r>
+      <w:r>
+        <w:t xml:space="preserve"> </w:t>
+      </w:r>
+      <w:r>
+        <w:t xml:space="preserve">Tanto o Interior, quanto a Grande São Paulo tiveram queda nas notificações.</w:t>
+      </w:r>
+      <w:r>
+        <w:t xml:space="preserve"> </w:t>
+      </w:r>
+      <w:r>
+        <w:t xml:space="preserve">O aumento progressivo que vem sendo observado desde então denota a urgência de se pensar políticas públicas para a redução efetiva dos casos de lesão corporal contra a mulher.</w:t>
       </w:r>
       <w:r>
         <w:t xml:space="preserve"> </w:t>
@@ -544,7 +664,7 @@
       <w:r>
         <w:drawing>
           <wp:inline>
-            <wp:extent cx="5334000" cy="3556000"/>
+            <wp:extent cx="7392202" cy="4158113"/>
             <wp:effectExtent b="0" l="0" r="0" t="0"/>
             <wp:docPr descr="" title="" id="36" name="Picture"/>
             <a:graphic>
@@ -565,7 +685,7 @@
                   <pic:spPr bwMode="auto">
                     <a:xfrm>
                       <a:off x="0" y="0"/>
-                      <a:ext cx="5334000" cy="3556000"/>
+                      <a:ext cx="7392202" cy="4158113"/>
                     </a:xfrm>
                     <a:prstGeom prst="rect">
                       <a:avLst/>
@@ -589,7 +709,37 @@
         <w:pStyle w:val="BodyText"/>
       </w:pPr>
       <w:r>
-        <w:t xml:space="preserve">Os casos de estupro aumentaram 7,3% em comparação a 2021, e uma variação geral no período de 2019 a 2022 de 1,9%. A tendência de crescimento nos casos de violência sexual também se confirma entre estupro de vulneráveis, que aumentou 5,4% para o mesmo período. Entre 2021 e 2022, foram registrados 715 casos a mais de estupro de vulnerável, uma média 2 casos registrados por dia no estado. Somente na Capital houve redução nas ocorrências estupro (de vulnerável ou não), respectivamente, de -8,1% e -4,7%. Na Grande São Paulo, o aumento foi de 5,8% para vulnerável, e 7,8% para estupro em geral, enquanto no Interior houve aumento de 4,3% nos casos de estupro, e 8,1% nos casos de estupro de vulnerável entre 2018 e 2022. O estupro de vulneráveis (contra vítimas menores de 14 anos ou pessoas cujas condições de saúde as impedem de discernir o ato sexual) compõe 77% do total dos casos de estupros registrados em 2022.</w:t>
+        <w:t xml:space="preserve">Os casos de estupro aumentaram 7,3% em comparação a 2021, e uma variação geral no período de 2019 a 2022 de 1,9%.</w:t>
+      </w:r>
+      <w:r>
+        <w:t xml:space="preserve"> </w:t>
+      </w:r>
+      <w:r>
+        <w:t xml:space="preserve">A tendência de crescimento nos casos de violência sexual também se confirma entre estupro de vulneráveis, que aumentou 5,4% para o mesmo período.</w:t>
+      </w:r>
+      <w:r>
+        <w:t xml:space="preserve"> </w:t>
+      </w:r>
+      <w:r>
+        <w:t xml:space="preserve">Entre 2021 e 2022, foram registrados 715 casos a mais de estupro de vulnerável, uma média 2 casos registrados por dia no estado.</w:t>
+      </w:r>
+      <w:r>
+        <w:t xml:space="preserve"> </w:t>
+      </w:r>
+      <w:r>
+        <w:t xml:space="preserve">Somente na Capital houve redução nas ocorrências estupro (de vulnerável ou não), respectivamente, de -8,1% e -4,7%.</w:t>
+      </w:r>
+      <w:r>
+        <w:t xml:space="preserve"> </w:t>
+      </w:r>
+      <w:r>
+        <w:t xml:space="preserve">Na Grande São Paulo, o aumento foi de 5,8% para vulnerável, e 7,8% para estupro em geral, enquanto no Interior houve aumento de 4,3% nos casos de estupro, e 8,1% nos casos de estupro de vulnerável entre 2018 e 2022.</w:t>
+      </w:r>
+      <w:r>
+        <w:t xml:space="preserve"> </w:t>
+      </w:r>
+      <w:r>
+        <w:t xml:space="preserve">O estupro de vulneráveis (contra vítimas menores de 14 anos ou pessoas cujas condições de saúde as impedem de discernir o ato sexual) compõe 77% do total dos casos de estupros registrados em 2022.</w:t>
       </w:r>
     </w:p>
     <w:p>
@@ -612,7 +762,7 @@
       <w:r>
         <w:drawing>
           <wp:inline>
-            <wp:extent cx="5334000" cy="4000500"/>
+            <wp:extent cx="7392202" cy="4158113"/>
             <wp:effectExtent b="0" l="0" r="0" t="0"/>
             <wp:docPr descr="" title="" id="39" name="Picture"/>
             <a:graphic>
@@ -633,7 +783,7 @@
                   <pic:spPr bwMode="auto">
                     <a:xfrm>
                       <a:off x="0" y="0"/>
-                      <a:ext cx="5334000" cy="4000500"/>
+                      <a:ext cx="7392202" cy="4158113"/>
                     </a:xfrm>
                     <a:prstGeom prst="rect">
                       <a:avLst/>
@@ -657,7 +807,13 @@
         <w:pStyle w:val="BodyText"/>
       </w:pPr>
       <w:r>
-        <w:t xml:space="preserve">Os casos de feminicídio também aumentaram 27% em 2022, alcançando o maior patamar dos último quatro anos. Dentre eles, 24,60% foram cometidos na Grande São Paulo, 19,7% na Capital e 55,6% no Interior.</w:t>
+        <w:t xml:space="preserve">Os casos de feminicídio também aumentaram 27% em 2022, alcançando o maior patamar dos último quatro anos.</w:t>
+      </w:r>
+      <w:r>
+        <w:t xml:space="preserve"> </w:t>
+      </w:r>
+      <w:r>
+        <w:t xml:space="preserve">Dentre eles, 24,60% foram cometidos na Grande São Paulo, 19,7% na Capital e 55,6% no Interior.</w:t>
       </w:r>
     </w:p>
     <w:p>
@@ -680,7 +836,7 @@
       <w:r>
         <w:drawing>
           <wp:inline>
-            <wp:extent cx="5334000" cy="3556000"/>
+            <wp:extent cx="7392202" cy="4158113"/>
             <wp:effectExtent b="0" l="0" r="0" t="0"/>
             <wp:docPr descr="" title="" id="42" name="Picture"/>
             <a:graphic>
@@ -701,7 +857,7 @@
                   <pic:spPr bwMode="auto">
                     <a:xfrm>
                       <a:off x="0" y="0"/>
-                      <a:ext cx="5334000" cy="3556000"/>
+                      <a:ext cx="7392202" cy="4158113"/>
                     </a:xfrm>
                     <a:prstGeom prst="rect">
                       <a:avLst/>
@@ -725,10 +881,290 @@
         <w:pStyle w:val="BodyText"/>
       </w:pPr>
       <w:r>
-        <w:t xml:space="preserve">O ano de 2022 terminou com um total de 286.573 casos de roubos (outros) em todo o estado de São Paulo, 10,75% maior que o total do ano anterior, que fechou com 258.747 casos registrados pela polícia, com a Capital paulista demonstrando o maior aumento percentual dentre todas ass regiões do estado, crescimento de 12,4%. Este aumento também é elevado quando se compara os totais de 2020 com 2022, apresentando um aumento de 14,30%, o que pode se inferir sendo um reflexo da pandemia de Covid-19, que durante o ano de 2020 teve seu maior pico de contágio e as políticas de redução de livre circulação de maior rigor, diminuindo a quantidade de pessoas em movimento nas ruas, o que em 2022 não é mais observado, com a população voltando completamente à circulação.</w:t>
-      </w:r>
-    </w:p>
-    <w:sectPr/>
+        <w:t xml:space="preserve">O ano de 2022 terminou com um total de 286.573 casos de roubos (outros) em todo o estado de São Paulo, 10,75% maior que o total do ano anterior, que fechou com 258.747 casos registrados pela polícia, com a Capital paulista demonstrando o maior aumento percentual dentre todas ass regiões do estado, crescimento de 12,4%.</w:t>
+      </w:r>
+      <w:r>
+        <w:t xml:space="preserve"> </w:t>
+      </w:r>
+      <w:r>
+        <w:t xml:space="preserve">Este aumento também é elevado quando se compara os totais de 2020 com 2022, apresentando um aumento de 14,30%, o que pode se inferir sendo um reflexo da pandemia de Covid-19, que durante o ano de 2020 teve seu maior pico de contágio e as políticas de redução de livre circulação de maior rigor, diminuindo a quantidade de pessoas em movimento nas ruas, o que em 2022 não é mais observado, com a população voltando completamente à circulação.</w:t>
+      </w:r>
+    </w:p>
+    <w:p>
+      <w:r>
+        <w:br w:type="page"/>
+      </w:r>
+    </w:p>
+    <w:p>
+      <w:pPr>
+        <w:pStyle w:val="Estilo1"/>
+      </w:pPr>
+      <w:r>
+        <w:t xml:space="preserve">Letalidade policial em serviço e em folga</w:t>
+      </w:r>
+    </w:p>
+    <w:p>
+      <w:pPr>
+        <w:pStyle w:val="BodyText"/>
+      </w:pPr>
+      <w:r>
+        <w:t xml:space="preserve">As mortes cometidas por policiais em serviço reduziram substancialmente após as políticas e novas práticas adotadas pelas polícias (como as câmeras corporais, em 2020).</w:t>
+      </w:r>
+      <w:r>
+        <w:t xml:space="preserve"> </w:t>
+      </w:r>
+      <w:r>
+        <w:t xml:space="preserve">Em contrapartida, as mortes cometidas fora de serviço seguem em caráter de de estabilidade, com notável aumento de 8,4% nos casos registrados em 2022, comparado ao ano anterior.</w:t>
+      </w:r>
+      <w:r>
+        <w:t xml:space="preserve"> </w:t>
+      </w:r>
+      <w:r>
+        <w:t xml:space="preserve">Os casos de vitimização de policiais em folga tiveram atenuado aumento.</w:t>
+      </w:r>
+      <w:r>
+        <w:t xml:space="preserve"> </w:t>
+      </w:r>
+      <w:r>
+        <w:t xml:space="preserve">Foram 52,9% de casos a mais em 2022 comparado a 2021.</w:t>
+      </w:r>
+      <w:r>
+        <w:t xml:space="preserve"> </w:t>
+      </w:r>
+      <w:r>
+        <w:t xml:space="preserve">Já durante o serviço, foram -12,5% de casos registrados.</w:t>
+      </w:r>
+      <w:r>
+        <w:t xml:space="preserve"> </w:t>
+      </w:r>
+      <w:r>
+        <w:t xml:space="preserve">O aumento de mortes cometidas por policiais fora de serviço e de policiais vitimados em folga podem apresentar uma nova dinâmica que necessita de atenção.</w:t>
+      </w:r>
+      <w:r>
+        <w:t xml:space="preserve"> </w:t>
+      </w:r>
+      <w:r>
+        <w:t xml:space="preserve">É necessário verificar as dinâmicas dos fatos (se houve conflito ou outro tipo de delito) e em local aquele policial ocupava no momento da morte cometida ou vitimada (se tentava conter um assalto, ou se fora vítima de assalto, por exemplo).</w:t>
+      </w:r>
+      <w:r>
+        <w:t xml:space="preserve"> </w:t>
+      </w:r>
+      <w:r>
+        <w:t xml:space="preserve">Analisar tais dinâmicas e compreender como a sociedade tem se movimentado para as gestões governamentais manterem o compromisso com a redução dos homicídios no estado.</w:t>
+      </w:r>
+    </w:p>
+    <w:p>
+      <w:pPr>
+        <w:pStyle w:val="BodyText"/>
+      </w:pPr>
+      <w:r>
+        <w:drawing>
+          <wp:inline>
+            <wp:extent cx="8316227" cy="5544151"/>
+            <wp:effectExtent b="0" l="0" r="0" t="0"/>
+            <wp:docPr descr="" title="" id="45" name="Picture"/>
+            <a:graphic>
+              <a:graphicData uri="http://schemas.openxmlformats.org/drawingml/2006/picture">
+                <pic:pic>
+                  <pic:nvPicPr>
+                    <pic:cNvPr descr="Relatorio_anual_2022_files/figure-docx/letalidade-1.png" id="46" name="Picture"/>
+                    <pic:cNvPicPr>
+                      <a:picLocks noChangeArrowheads="1" noChangeAspect="1"/>
+                    </pic:cNvPicPr>
+                  </pic:nvPicPr>
+                  <pic:blipFill>
+                    <a:blip r:embed="rId44"/>
+                    <a:stretch>
+                      <a:fillRect/>
+                    </a:stretch>
+                  </pic:blipFill>
+                  <pic:spPr bwMode="auto">
+                    <a:xfrm>
+                      <a:off x="0" y="0"/>
+                      <a:ext cx="8316227" cy="5544151"/>
+                    </a:xfrm>
+                    <a:prstGeom prst="rect">
+                      <a:avLst/>
+                    </a:prstGeom>
+                    <a:noFill/>
+                    <a:ln w="9525">
+                      <a:noFill/>
+                      <a:headEnd/>
+                      <a:tailEnd/>
+                    </a:ln>
+                  </pic:spPr>
+                </pic:pic>
+              </a:graphicData>
+            </a:graphic>
+          </wp:inline>
+        </w:drawing>
+      </w:r>
+      <w:r>
+        <w:drawing>
+          <wp:inline>
+            <wp:extent cx="8316227" cy="5544151"/>
+            <wp:effectExtent b="0" l="0" r="0" t="0"/>
+            <wp:docPr descr="" title="" id="48" name="Picture"/>
+            <a:graphic>
+              <a:graphicData uri="http://schemas.openxmlformats.org/drawingml/2006/picture">
+                <pic:pic>
+                  <pic:nvPicPr>
+                    <pic:cNvPr descr="Relatorio_anual_2022_files/figure-docx/letalidade-2.png" id="49" name="Picture"/>
+                    <pic:cNvPicPr>
+                      <a:picLocks noChangeArrowheads="1" noChangeAspect="1"/>
+                    </pic:cNvPicPr>
+                  </pic:nvPicPr>
+                  <pic:blipFill>
+                    <a:blip r:embed="rId47"/>
+                    <a:stretch>
+                      <a:fillRect/>
+                    </a:stretch>
+                  </pic:blipFill>
+                  <pic:spPr bwMode="auto">
+                    <a:xfrm>
+                      <a:off x="0" y="0"/>
+                      <a:ext cx="8316227" cy="5544151"/>
+                    </a:xfrm>
+                    <a:prstGeom prst="rect">
+                      <a:avLst/>
+                    </a:prstGeom>
+                    <a:noFill/>
+                    <a:ln w="9525">
+                      <a:noFill/>
+                      <a:headEnd/>
+                      <a:tailEnd/>
+                    </a:ln>
+                  </pic:spPr>
+                </pic:pic>
+              </a:graphicData>
+            </a:graphic>
+          </wp:inline>
+        </w:drawing>
+      </w:r>
+    </w:p>
+    <w:p>
+      <w:r>
+        <w:br w:type="page"/>
+      </w:r>
+    </w:p>
+    <w:p>
+      <w:pPr>
+        <w:pStyle w:val="Estilo1"/>
+      </w:pPr>
+      <w:r>
+        <w:t xml:space="preserve">Raça e idade das vitímas MDIP</w:t>
+      </w:r>
+    </w:p>
+    <w:p>
+      <w:pPr>
+        <w:pStyle w:val="SourceCode"/>
+      </w:pPr>
+      <w:r>
+        <w:rPr>
+          <w:rStyle w:val="VerbatimChar"/>
+        </w:rPr>
+        <w:t xml:space="preserve">## # A tibble: 3 × 2</w:t>
+      </w:r>
+      <w:r>
+        <w:br/>
+      </w:r>
+      <w:r>
+        <w:rPr>
+          <w:rStyle w:val="VerbatimChar"/>
+        </w:rPr>
+        <w:t xml:space="preserve">##   cor_pele_agregada     n</w:t>
+      </w:r>
+      <w:r>
+        <w:br/>
+      </w:r>
+      <w:r>
+        <w:rPr>
+          <w:rStyle w:val="VerbatimChar"/>
+        </w:rPr>
+        <w:t xml:space="preserve">##   &lt;chr&gt;             &lt;int&gt;</w:t>
+      </w:r>
+      <w:r>
+        <w:br/>
+      </w:r>
+      <w:r>
+        <w:rPr>
+          <w:rStyle w:val="VerbatimChar"/>
+        </w:rPr>
+        <w:t xml:space="preserve">## 1 Branca             1216</w:t>
+      </w:r>
+      <w:r>
+        <w:br/>
+      </w:r>
+      <w:r>
+        <w:rPr>
+          <w:rStyle w:val="VerbatimChar"/>
+        </w:rPr>
+        <w:t xml:space="preserve">## 2 NA                   86</w:t>
+      </w:r>
+      <w:r>
+        <w:br/>
+      </w:r>
+      <w:r>
+        <w:rPr>
+          <w:rStyle w:val="VerbatimChar"/>
+        </w:rPr>
+        <w:t xml:space="preserve">## 3 Negra              2215</w:t>
+      </w:r>
+    </w:p>
+    <w:p>
+      <w:pPr>
+        <w:pStyle w:val="FirstParagraph"/>
+      </w:pPr>
+      <w:r>
+        <w:drawing>
+          <wp:inline>
+            <wp:extent cx="8316227" cy="5544151"/>
+            <wp:effectExtent b="0" l="0" r="0" t="0"/>
+            <wp:docPr descr="" title="" id="51" name="Picture"/>
+            <a:graphic>
+              <a:graphicData uri="http://schemas.openxmlformats.org/drawingml/2006/picture">
+                <pic:pic>
+                  <pic:nvPicPr>
+                    <pic:cNvPr descr="Relatorio_anual_2022_files/figure-docx/raça%20e%20idade-1.png" id="52" name="Picture"/>
+                    <pic:cNvPicPr>
+                      <a:picLocks noChangeArrowheads="1" noChangeAspect="1"/>
+                    </pic:cNvPicPr>
+                  </pic:nvPicPr>
+                  <pic:blipFill>
+                    <a:blip r:embed="rId50"/>
+                    <a:stretch>
+                      <a:fillRect/>
+                    </a:stretch>
+                  </pic:blipFill>
+                  <pic:spPr bwMode="auto">
+                    <a:xfrm>
+                      <a:off x="0" y="0"/>
+                      <a:ext cx="8316227" cy="5544151"/>
+                    </a:xfrm>
+                    <a:prstGeom prst="rect">
+                      <a:avLst/>
+                    </a:prstGeom>
+                    <a:noFill/>
+                    <a:ln w="9525">
+                      <a:noFill/>
+                      <a:headEnd/>
+                      <a:tailEnd/>
+                    </a:ln>
+                  </pic:spPr>
+                </pic:pic>
+              </a:graphicData>
+            </a:graphic>
+          </wp:inline>
+        </w:drawing>
+      </w:r>
+    </w:p>
+    <w:sectPr>
+      <w:headerReference r:id="rId9" w:type="default"/>
+      <w:pgSz w:h="11906" w:orient="landscape" w:w="16838"/>
+      <w:pgMar w:bottom="720" w:footer="567" w:gutter="0" w:header="567" w:left="720" w:right="720" w:top="720"/>
+      <w:cols w:space="708"/>
+      <w:docGrid w:linePitch="360"/>
+    </w:sectPr>
   </w:body>
 </w:document>
 </file>
@@ -756,6 +1192,56 @@
 </w:footnotes>
 </file>
 
+<file path=word/header1.xml><?xml version="1.0" encoding="utf-8"?>
+<w:hdr xmlns:wpc="http://schemas.microsoft.com/office/word/2010/wordprocessingCanvas" xmlns:cx="http://schemas.microsoft.com/office/drawing/2014/chartex" xmlns:cx1="http://schemas.microsoft.com/office/drawing/2015/9/8/chartex" xmlns:cx2="http://schemas.microsoft.com/office/drawing/2015/10/21/chartex" xmlns:cx3="http://schemas.microsoft.com/office/drawing/2016/5/9/chartex" xmlns:cx4="http://schemas.microsoft.com/office/drawing/2016/5/10/chartex" xmlns:cx5="http://schemas.microsoft.com/office/drawing/2016/5/11/chartex" xmlns:cx6="http://schemas.microsoft.com/office/drawing/2016/5/12/chartex" xmlns:cx7="http://schemas.microsoft.com/office/drawing/2016/5/13/chartex" xmlns:cx8="http://schemas.microsoft.com/office/drawing/2016/5/14/chartex" xmlns:mc="http://schemas.openxmlformats.org/markup-compatibility/2006" xmlns:aink="http://schemas.microsoft.com/office/drawing/2016/ink" xmlns:am3d="http://schemas.microsoft.com/office/drawing/2017/model3d" xmlns:o="urn:schemas-microsoft-com:office:office" xmlns:r="http://schemas.openxmlformats.org/officeDocument/2006/relationships" xmlns:m="http://schemas.openxmlformats.org/officeDocument/2006/math" xmlns:v="urn:schemas-microsoft-com:vml" xmlns:wp14="http://schemas.microsoft.com/office/word/2010/wordprocessingDrawing" xmlns:wp="http://schemas.openxmlformats.org/drawingml/2006/wordprocessingDrawing" xmlns:w10="urn:schemas-microsoft-com:office:word" xmlns:w="http://schemas.openxmlformats.org/wordprocessingml/2006/main" xmlns:w14="http://schemas.microsoft.com/office/word/2010/wordml" xmlns:w15="http://schemas.microsoft.com/office/word/2012/wordml" xmlns:w16cid="http://schemas.microsoft.com/office/word/2016/wordml/cid" xmlns:w16se="http://schemas.microsoft.com/office/word/2015/wordml/symex" xmlns:wpg="http://schemas.microsoft.com/office/word/2010/wordprocessingGroup" xmlns:wpi="http://schemas.microsoft.com/office/word/2010/wordprocessingInk" xmlns:wne="http://schemas.microsoft.com/office/word/2006/wordml" xmlns:wps="http://schemas.microsoft.com/office/word/2010/wordprocessingShape" mc:Ignorable="w14 w15 w16se w16cid wp14">
+  <w:p>
+    <w:pPr>
+      <w:pStyle w:val="Cabealho"/>
+      <w:jc w:val="right"/>
+      <w:rPr>
+        <w:rFonts w:ascii="Trebuchet MS" w:hAnsi="Trebuchet MS" w:cstheme="majorHAnsi"/>
+        <w:b/>
+        <w:color w:val="2F5496" w:themeColor="accent1" w:themeShade="BF"/>
+        <w:szCs w:val="24"/>
+      </w:rPr>
+    </w:pPr>
+    <w:r>
+      <w:rPr>
+        <w:rFonts w:ascii="Trebuchet MS" w:hAnsi="Trebuchet MS" w:cstheme="majorHAnsi"/>
+        <w:b/>
+        <w:color w:val="2F5496" w:themeColor="accent1" w:themeShade="BF"/>
+        <w:szCs w:val="24"/>
+      </w:rPr>
+      <w:t>SOU DA PAZ ANALISA |PANORAMA 2022</w:t>
+    </w:r>
+  </w:p>
+  <w:p>
+    <w:pPr>
+      <w:pStyle w:val="Cabealho"/>
+      <w:jc w:val="right"/>
+      <w:rPr>
+        <w:rFonts w:ascii="Trebuchet MS" w:hAnsi="Trebuchet MS" w:cstheme="majorHAnsi"/>
+        <w:b/>
+        <w:color w:val="2F5496" w:themeColor="accent1" w:themeShade="BF"/>
+        <w:szCs w:val="24"/>
+      </w:rPr>
+    </w:pPr>
+  </w:p>
+  <w:p>
+    <w:pPr>
+      <w:pStyle w:val="Cabealho"/>
+      <w:jc w:val="right"/>
+      <w:rPr>
+        <w:rFonts w:ascii="Trebuchet MS" w:hAnsi="Trebuchet MS" w:cstheme="majorHAnsi"/>
+        <w:b/>
+        <w:color w:val="2F5496" w:themeColor="accent1" w:themeShade="BF"/>
+        <w:szCs w:val="24"/>
+      </w:rPr>
+    </w:pPr>
+  </w:p>
+</w:hdr>
+</file>
+
 <file path=word/numbering.xml><?xml version="1.0" encoding="utf-8"?>
 <w:numbering xmlns:w="http://schemas.openxmlformats.org/wordprocessingml/2006/main">
   <w:abstractNum w:abstractNumId="990">
@@ -841,348 +1327,418 @@
 </file>
 
 <file path=word/styles.xml><?xml version="1.0" encoding="utf-8"?>
-<w:styles xmlns:r="http://schemas.openxmlformats.org/officeDocument/2006/relationships" xmlns:w="http://schemas.openxmlformats.org/wordprocessingml/2006/main">
+<w:styles xmlns:mc="http://schemas.openxmlformats.org/markup-compatibility/2006" xmlns:r="http://schemas.openxmlformats.org/officeDocument/2006/relationships" xmlns:w="http://schemas.openxmlformats.org/wordprocessingml/2006/main" xmlns:w14="http://schemas.microsoft.com/office/word/2010/wordml" xmlns:w15="http://schemas.microsoft.com/office/word/2012/wordml" xmlns:w16cid="http://schemas.microsoft.com/office/word/2016/wordml/cid" xmlns:w16se="http://schemas.microsoft.com/office/word/2015/wordml/symex" mc:Ignorable="w14 w15 w16se w16cid">
   <w:docDefaults>
     <w:rPrDefault>
       <w:rPr>
         <w:rFonts w:asciiTheme="minorHAnsi" w:cstheme="minorBidi" w:eastAsiaTheme="minorHAnsi" w:hAnsiTheme="minorHAnsi"/>
-        <w:sz w:val="24"/>
-        <w:szCs w:val="24"/>
-        <w:lang w:bidi="ar-SA" w:eastAsia="en-US" w:val="en-US"/>
+        <w:sz w:val="22"/>
+        <w:szCs w:val="22"/>
+        <w:lang w:bidi="ar-SA" w:eastAsia="en-US" w:val="pt-BR"/>
       </w:rPr>
     </w:rPrDefault>
     <w:pPrDefault>
       <w:pPr>
-        <w:spacing w:after="200"/>
+        <w:spacing w:after="160" w:line="259" w:lineRule="auto"/>
       </w:pPr>
     </w:pPrDefault>
   </w:docDefaults>
-  <w:latentStyles w:count="276" w:defLockedState="0" w:defQFormat="0" w:defSemiHidden="0" w:defUIPriority="0" w:defUnhideWhenUsed="0"/>
+  <w:latentStyles w:count="375" w:defLockedState="0" w:defQFormat="0" w:defSemiHidden="0" w:defUIPriority="99" w:defUnhideWhenUsed="0">
+    <w:lsdException w:name="Normal" w:qFormat="1" w:uiPriority="0"/>
+    <w:lsdException w:name="heading 1" w:qFormat="1" w:uiPriority="9"/>
+    <w:lsdException w:name="heading 2" w:qFormat="1" w:semiHidden="1" w:uiPriority="9" w:unhideWhenUsed="1"/>
+    <w:lsdException w:name="heading 3" w:qFormat="1" w:semiHidden="1" w:uiPriority="9" w:unhideWhenUsed="1"/>
+    <w:lsdException w:name="heading 4" w:qFormat="1" w:semiHidden="1" w:uiPriority="9" w:unhideWhenUsed="1"/>
+    <w:lsdException w:name="heading 5" w:qFormat="1" w:semiHidden="1" w:uiPriority="9" w:unhideWhenUsed="1"/>
+    <w:lsdException w:name="heading 6" w:qFormat="1" w:semiHidden="1" w:uiPriority="9" w:unhideWhenUsed="1"/>
+    <w:lsdException w:name="heading 7" w:qFormat="1" w:semiHidden="1" w:uiPriority="9" w:unhideWhenUsed="1"/>
+    <w:lsdException w:name="heading 8" w:qFormat="1" w:semiHidden="1" w:uiPriority="9" w:unhideWhenUsed="1"/>
+    <w:lsdException w:name="heading 9" w:qFormat="1" w:semiHidden="1" w:uiPriority="9" w:unhideWhenUsed="1"/>
+    <w:lsdException w:name="index 1" w:semiHidden="1" w:unhideWhenUsed="1"/>
+    <w:lsdException w:name="index 2" w:semiHidden="1" w:unhideWhenUsed="1"/>
+    <w:lsdException w:name="index 3" w:semiHidden="1" w:unhideWhenUsed="1"/>
+    <w:lsdException w:name="index 4" w:semiHidden="1" w:unhideWhenUsed="1"/>
+    <w:lsdException w:name="index 5" w:semiHidden="1" w:unhideWhenUsed="1"/>
+    <w:lsdException w:name="index 6" w:semiHidden="1" w:unhideWhenUsed="1"/>
+    <w:lsdException w:name="index 7" w:semiHidden="1" w:unhideWhenUsed="1"/>
+    <w:lsdException w:name="index 8" w:semiHidden="1" w:unhideWhenUsed="1"/>
+    <w:lsdException w:name="index 9" w:semiHidden="1" w:unhideWhenUsed="1"/>
+    <w:lsdException w:name="toc 1" w:semiHidden="1" w:uiPriority="39" w:unhideWhenUsed="1"/>
+    <w:lsdException w:name="toc 2" w:semiHidden="1" w:uiPriority="39" w:unhideWhenUsed="1"/>
+    <w:lsdException w:name="toc 3" w:semiHidden="1" w:uiPriority="39" w:unhideWhenUsed="1"/>
+    <w:lsdException w:name="toc 4" w:semiHidden="1" w:uiPriority="39" w:unhideWhenUsed="1"/>
+    <w:lsdException w:name="toc 5" w:semiHidden="1" w:uiPriority="39" w:unhideWhenUsed="1"/>
+    <w:lsdException w:name="toc 6" w:semiHidden="1" w:uiPriority="39" w:unhideWhenUsed="1"/>
+    <w:lsdException w:name="toc 7" w:semiHidden="1" w:uiPriority="39" w:unhideWhenUsed="1"/>
+    <w:lsdException w:name="toc 8" w:semiHidden="1" w:uiPriority="39" w:unhideWhenUsed="1"/>
+    <w:lsdException w:name="toc 9" w:semiHidden="1" w:uiPriority="39" w:unhideWhenUsed="1"/>
+    <w:lsdException w:name="Normal Indent" w:semiHidden="1" w:unhideWhenUsed="1"/>
+    <w:lsdException w:name="footnote text" w:semiHidden="1" w:unhideWhenUsed="1"/>
+    <w:lsdException w:name="annotation text" w:semiHidden="1" w:unhideWhenUsed="1"/>
+    <w:lsdException w:name="header" w:semiHidden="1" w:unhideWhenUsed="1"/>
+    <w:lsdException w:name="footer" w:semiHidden="1" w:unhideWhenUsed="1"/>
+    <w:lsdException w:name="index heading" w:semiHidden="1" w:unhideWhenUsed="1"/>
+    <w:lsdException w:name="caption" w:qFormat="1" w:semiHidden="1" w:uiPriority="35" w:unhideWhenUsed="1"/>
+    <w:lsdException w:name="table of figures" w:semiHidden="1" w:unhideWhenUsed="1"/>
+    <w:lsdException w:name="envelope address" w:semiHidden="1" w:unhideWhenUsed="1"/>
+    <w:lsdException w:name="envelope return" w:semiHidden="1" w:unhideWhenUsed="1"/>
+    <w:lsdException w:name="footnote reference" w:semiHidden="1" w:unhideWhenUsed="1"/>
+    <w:lsdException w:name="annotation reference" w:semiHidden="1" w:unhideWhenUsed="1"/>
+    <w:lsdException w:name="line number" w:semiHidden="1" w:unhideWhenUsed="1"/>
+    <w:lsdException w:name="page number" w:semiHidden="1" w:unhideWhenUsed="1"/>
+    <w:lsdException w:name="endnote reference" w:semiHidden="1" w:unhideWhenUsed="1"/>
+    <w:lsdException w:name="endnote text" w:semiHidden="1" w:unhideWhenUsed="1"/>
+    <w:lsdException w:name="table of authorities" w:semiHidden="1" w:unhideWhenUsed="1"/>
+    <w:lsdException w:name="macro" w:semiHidden="1" w:unhideWhenUsed="1"/>
+    <w:lsdException w:name="toa heading" w:semiHidden="1" w:unhideWhenUsed="1"/>
+    <w:lsdException w:name="List" w:semiHidden="1" w:unhideWhenUsed="1"/>
+    <w:lsdException w:name="List Bullet" w:semiHidden="1" w:unhideWhenUsed="1"/>
+    <w:lsdException w:name="List Number" w:semiHidden="1" w:unhideWhenUsed="1"/>
+    <w:lsdException w:name="List 2" w:semiHidden="1" w:unhideWhenUsed="1"/>
+    <w:lsdException w:name="List 3" w:semiHidden="1" w:unhideWhenUsed="1"/>
+    <w:lsdException w:name="List 4" w:semiHidden="1" w:unhideWhenUsed="1"/>
+    <w:lsdException w:name="List 5" w:semiHidden="1" w:unhideWhenUsed="1"/>
+    <w:lsdException w:name="List Bullet 2" w:semiHidden="1" w:unhideWhenUsed="1"/>
+    <w:lsdException w:name="List Bullet 3" w:semiHidden="1" w:unhideWhenUsed="1"/>
+    <w:lsdException w:name="List Bullet 4" w:semiHidden="1" w:unhideWhenUsed="1"/>
+    <w:lsdException w:name="List Bullet 5" w:semiHidden="1" w:unhideWhenUsed="1"/>
+    <w:lsdException w:name="List Number 2" w:semiHidden="1" w:unhideWhenUsed="1"/>
+    <w:lsdException w:name="List Number 3" w:semiHidden="1" w:unhideWhenUsed="1"/>
+    <w:lsdException w:name="List Number 4" w:semiHidden="1" w:unhideWhenUsed="1"/>
+    <w:lsdException w:name="List Number 5" w:semiHidden="1" w:unhideWhenUsed="1"/>
+    <w:lsdException w:name="Title" w:qFormat="1" w:uiPriority="10"/>
+    <w:lsdException w:name="Closing" w:semiHidden="1" w:unhideWhenUsed="1"/>
+    <w:lsdException w:name="Signature" w:semiHidden="1" w:unhideWhenUsed="1"/>
+    <w:lsdException w:name="Default Paragraph Font" w:semiHidden="1" w:uiPriority="1" w:unhideWhenUsed="1"/>
+    <w:lsdException w:name="Body Text" w:semiHidden="1" w:unhideWhenUsed="1"/>
+    <w:lsdException w:name="Body Text Indent" w:semiHidden="1" w:unhideWhenUsed="1"/>
+    <w:lsdException w:name="List Continue" w:semiHidden="1" w:unhideWhenUsed="1"/>
+    <w:lsdException w:name="List Continue 2" w:semiHidden="1" w:unhideWhenUsed="1"/>
+    <w:lsdException w:name="List Continue 3" w:semiHidden="1" w:unhideWhenUsed="1"/>
+    <w:lsdException w:name="List Continue 4" w:semiHidden="1" w:unhideWhenUsed="1"/>
+    <w:lsdException w:name="List Continue 5" w:semiHidden="1" w:unhideWhenUsed="1"/>
+    <w:lsdException w:name="Message Header" w:semiHidden="1" w:unhideWhenUsed="1"/>
+    <w:lsdException w:name="Subtitle" w:qFormat="1" w:uiPriority="11"/>
+    <w:lsdException w:name="Salutation" w:semiHidden="1" w:unhideWhenUsed="1"/>
+    <w:lsdException w:name="Date" w:semiHidden="1" w:unhideWhenUsed="1"/>
+    <w:lsdException w:name="Body Text First Indent" w:semiHidden="1" w:unhideWhenUsed="1"/>
+    <w:lsdException w:name="Body Text First Indent 2" w:semiHidden="1" w:unhideWhenUsed="1"/>
+    <w:lsdException w:name="Note Heading" w:semiHidden="1" w:unhideWhenUsed="1"/>
+    <w:lsdException w:name="Body Text 2" w:semiHidden="1" w:unhideWhenUsed="1"/>
+    <w:lsdException w:name="Body Text 3" w:semiHidden="1" w:unhideWhenUsed="1"/>
+    <w:lsdException w:name="Body Text Indent 2" w:semiHidden="1" w:unhideWhenUsed="1"/>
+    <w:lsdException w:name="Body Text Indent 3" w:semiHidden="1" w:unhideWhenUsed="1"/>
+    <w:lsdException w:name="Block Text" w:semiHidden="1" w:unhideWhenUsed="1"/>
+    <w:lsdException w:name="Hyperlink" w:semiHidden="1" w:unhideWhenUsed="1"/>
+    <w:lsdException w:name="FollowedHyperlink" w:semiHidden="1" w:unhideWhenUsed="1"/>
+    <w:lsdException w:name="Strong" w:qFormat="1" w:uiPriority="22"/>
+    <w:lsdException w:name="Emphasis" w:qFormat="1" w:uiPriority="20"/>
+    <w:lsdException w:name="Document Map" w:semiHidden="1" w:unhideWhenUsed="1"/>
+    <w:lsdException w:name="Plain Text" w:semiHidden="1" w:unhideWhenUsed="1"/>
+    <w:lsdException w:name="E-mail Signature" w:semiHidden="1" w:unhideWhenUsed="1"/>
+    <w:lsdException w:name="HTML Top of Form" w:semiHidden="1" w:unhideWhenUsed="1"/>
+    <w:lsdException w:name="HTML Bottom of Form" w:semiHidden="1" w:unhideWhenUsed="1"/>
+    <w:lsdException w:name="Normal (Web)" w:semiHidden="1" w:unhideWhenUsed="1"/>
+    <w:lsdException w:name="HTML Acronym" w:semiHidden="1" w:unhideWhenUsed="1"/>
+    <w:lsdException w:name="HTML Address" w:semiHidden="1" w:unhideWhenUsed="1"/>
+    <w:lsdException w:name="HTML Cite" w:semiHidden="1" w:unhideWhenUsed="1"/>
+    <w:lsdException w:name="HTML Code" w:semiHidden="1" w:unhideWhenUsed="1"/>
+    <w:lsdException w:name="HTML Definition" w:semiHidden="1" w:unhideWhenUsed="1"/>
+    <w:lsdException w:name="HTML Keyboard" w:semiHidden="1" w:unhideWhenUsed="1"/>
+    <w:lsdException w:name="HTML Preformatted" w:semiHidden="1" w:unhideWhenUsed="1"/>
+    <w:lsdException w:name="HTML Sample" w:semiHidden="1" w:unhideWhenUsed="1"/>
+    <w:lsdException w:name="HTML Typewriter" w:semiHidden="1" w:unhideWhenUsed="1"/>
+    <w:lsdException w:name="HTML Variable" w:semiHidden="1" w:unhideWhenUsed="1"/>
+    <w:lsdException w:name="Normal Table" w:semiHidden="1" w:unhideWhenUsed="1"/>
+    <w:lsdException w:name="annotation subject" w:semiHidden="1" w:unhideWhenUsed="1"/>
+    <w:lsdException w:name="No List" w:semiHidden="1" w:unhideWhenUsed="1"/>
+    <w:lsdException w:name="Outline List 1" w:semiHidden="1" w:unhideWhenUsed="1"/>
+    <w:lsdException w:name="Outline List 2" w:semiHidden="1" w:unhideWhenUsed="1"/>
+    <w:lsdException w:name="Outline List 3" w:semiHidden="1" w:unhideWhenUsed="1"/>
+    <w:lsdException w:name="Table Simple 1" w:semiHidden="1" w:unhideWhenUsed="1"/>
+    <w:lsdException w:name="Table Simple 2" w:semiHidden="1" w:unhideWhenUsed="1"/>
+    <w:lsdException w:name="Table Simple 3" w:semiHidden="1" w:unhideWhenUsed="1"/>
+    <w:lsdException w:name="Table Classic 1" w:semiHidden="1" w:unhideWhenUsed="1"/>
+    <w:lsdException w:name="Table Classic 2" w:semiHidden="1" w:unhideWhenUsed="1"/>
+    <w:lsdException w:name="Table Classic 3" w:semiHidden="1" w:unhideWhenUsed="1"/>
+    <w:lsdException w:name="Table Classic 4" w:semiHidden="1" w:unhideWhenUsed="1"/>
+    <w:lsdException w:name="Table Colorful 1" w:semiHidden="1" w:unhideWhenUsed="1"/>
+    <w:lsdException w:name="Table Colorful 2" w:semiHidden="1" w:unhideWhenUsed="1"/>
+    <w:lsdException w:name="Table Colorful 3" w:semiHidden="1" w:unhideWhenUsed="1"/>
+    <w:lsdException w:name="Table Columns 1" w:semiHidden="1" w:unhideWhenUsed="1"/>
+    <w:lsdException w:name="Table Columns 2" w:semiHidden="1" w:unhideWhenUsed="1"/>
+    <w:lsdException w:name="Table Columns 3" w:semiHidden="1" w:unhideWhenUsed="1"/>
+    <w:lsdException w:name="Table Columns 4" w:semiHidden="1" w:unhideWhenUsed="1"/>
+    <w:lsdException w:name="Table Columns 5" w:semiHidden="1" w:unhideWhenUsed="1"/>
+    <w:lsdException w:name="Table Grid 1" w:semiHidden="1" w:unhideWhenUsed="1"/>
+    <w:lsdException w:name="Table Grid 2" w:semiHidden="1" w:unhideWhenUsed="1"/>
+    <w:lsdException w:name="Table Grid 3" w:semiHidden="1" w:unhideWhenUsed="1"/>
+    <w:lsdException w:name="Table Grid 4" w:semiHidden="1" w:unhideWhenUsed="1"/>
+    <w:lsdException w:name="Table Grid 5" w:semiHidden="1" w:unhideWhenUsed="1"/>
+    <w:lsdException w:name="Table Grid 6" w:semiHidden="1" w:unhideWhenUsed="1"/>
+    <w:lsdException w:name="Table Grid 7" w:semiHidden="1" w:unhideWhenUsed="1"/>
+    <w:lsdException w:name="Table Grid 8" w:semiHidden="1" w:unhideWhenUsed="1"/>
+    <w:lsdException w:name="Table List 1" w:semiHidden="1" w:unhideWhenUsed="1"/>
+    <w:lsdException w:name="Table List 2" w:semiHidden="1" w:unhideWhenUsed="1"/>
+    <w:lsdException w:name="Table List 3" w:semiHidden="1" w:unhideWhenUsed="1"/>
+    <w:lsdException w:name="Table List 4" w:semiHidden="1" w:unhideWhenUsed="1"/>
+    <w:lsdException w:name="Table List 5" w:semiHidden="1" w:unhideWhenUsed="1"/>
+    <w:lsdException w:name="Table List 6" w:semiHidden="1" w:unhideWhenUsed="1"/>
+    <w:lsdException w:name="Table List 7" w:semiHidden="1" w:unhideWhenUsed="1"/>
+    <w:lsdException w:name="Table List 8" w:semiHidden="1" w:unhideWhenUsed="1"/>
+    <w:lsdException w:name="Table 3D effects 1" w:semiHidden="1" w:unhideWhenUsed="1"/>
+    <w:lsdException w:name="Table 3D effects 2" w:semiHidden="1" w:unhideWhenUsed="1"/>
+    <w:lsdException w:name="Table 3D effects 3" w:semiHidden="1" w:unhideWhenUsed="1"/>
+    <w:lsdException w:name="Table Contemporary" w:semiHidden="1" w:unhideWhenUsed="1"/>
+    <w:lsdException w:name="Table Elegant" w:semiHidden="1" w:unhideWhenUsed="1"/>
+    <w:lsdException w:name="Table Professional" w:semiHidden="1" w:unhideWhenUsed="1"/>
+    <w:lsdException w:name="Table Subtle 1" w:semiHidden="1" w:unhideWhenUsed="1"/>
+    <w:lsdException w:name="Table Subtle 2" w:semiHidden="1" w:unhideWhenUsed="1"/>
+    <w:lsdException w:name="Table Web 1" w:semiHidden="1" w:unhideWhenUsed="1"/>
+    <w:lsdException w:name="Table Web 2" w:semiHidden="1" w:unhideWhenUsed="1"/>
+    <w:lsdException w:name="Table Web 3" w:semiHidden="1" w:unhideWhenUsed="1"/>
+    <w:lsdException w:name="Balloon Text" w:semiHidden="1" w:unhideWhenUsed="1"/>
+    <w:lsdException w:name="Table Grid" w:uiPriority="39"/>
+    <w:lsdException w:name="Table Theme" w:semiHidden="1" w:unhideWhenUsed="1"/>
+    <w:lsdException w:name="Placeholder Text" w:semiHidden="1"/>
+    <w:lsdException w:name="No Spacing" w:qFormat="1" w:uiPriority="1"/>
+    <w:lsdException w:name="Light Shading" w:uiPriority="60"/>
+    <w:lsdException w:name="Light List" w:uiPriority="61"/>
+    <w:lsdException w:name="Light Grid" w:uiPriority="62"/>
+    <w:lsdException w:name="Medium Shading 1" w:uiPriority="63"/>
+    <w:lsdException w:name="Medium Shading 2" w:uiPriority="64"/>
+    <w:lsdException w:name="Medium List 1" w:uiPriority="65"/>
+    <w:lsdException w:name="Medium List 2" w:uiPriority="66"/>
+    <w:lsdException w:name="Medium Grid 1" w:uiPriority="67"/>
+    <w:lsdException w:name="Medium Grid 2" w:uiPriority="68"/>
+    <w:lsdException w:name="Medium Grid 3" w:uiPriority="69"/>
+    <w:lsdException w:name="Dark List" w:uiPriority="70"/>
+    <w:lsdException w:name="Colorful Shading" w:uiPriority="71"/>
+    <w:lsdException w:name="Colorful List" w:uiPriority="72"/>
+    <w:lsdException w:name="Colorful Grid" w:uiPriority="73"/>
+    <w:lsdException w:name="Light Shading Accent 1" w:uiPriority="60"/>
+    <w:lsdException w:name="Light List Accent 1" w:uiPriority="61"/>
+    <w:lsdException w:name="Light Grid Accent 1" w:uiPriority="62"/>
+    <w:lsdException w:name="Medium Shading 1 Accent 1" w:uiPriority="63"/>
+    <w:lsdException w:name="Medium Shading 2 Accent 1" w:uiPriority="64"/>
+    <w:lsdException w:name="Medium List 1 Accent 1" w:uiPriority="65"/>
+    <w:lsdException w:name="Revision" w:semiHidden="1"/>
+    <w:lsdException w:name="List Paragraph" w:qFormat="1" w:uiPriority="34"/>
+    <w:lsdException w:name="Quote" w:qFormat="1" w:uiPriority="29"/>
+    <w:lsdException w:name="Intense Quote" w:qFormat="1" w:uiPriority="30"/>
+    <w:lsdException w:name="Medium List 2 Accent 1" w:uiPriority="66"/>
+    <w:lsdException w:name="Medium Grid 1 Accent 1" w:uiPriority="67"/>
+    <w:lsdException w:name="Medium Grid 2 Accent 1" w:uiPriority="68"/>
+    <w:lsdException w:name="Medium Grid 3 Accent 1" w:uiPriority="69"/>
+    <w:lsdException w:name="Dark List Accent 1" w:uiPriority="70"/>
+    <w:lsdException w:name="Colorful Shading Accent 1" w:uiPriority="71"/>
+    <w:lsdException w:name="Colorful List Accent 1" w:uiPriority="72"/>
+    <w:lsdException w:name="Colorful Grid Accent 1" w:uiPriority="73"/>
+    <w:lsdException w:name="Light Shading Accent 2" w:uiPriority="60"/>
+    <w:lsdException w:name="Light List Accent 2" w:uiPriority="61"/>
+    <w:lsdException w:name="Light Grid Accent 2" w:uiPriority="62"/>
+    <w:lsdException w:name="Medium Shading 1 Accent 2" w:uiPriority="63"/>
+    <w:lsdException w:name="Medium Shading 2 Accent 2" w:uiPriority="64"/>
+    <w:lsdException w:name="Medium List 1 Accent 2" w:uiPriority="65"/>
+    <w:lsdException w:name="Medium List 2 Accent 2" w:uiPriority="66"/>
+    <w:lsdException w:name="Medium Grid 1 Accent 2" w:uiPriority="67"/>
+    <w:lsdException w:name="Medium Grid 2 Accent 2" w:uiPriority="68"/>
+    <w:lsdException w:name="Medium Grid 3 Accent 2" w:uiPriority="69"/>
+    <w:lsdException w:name="Dark List Accent 2" w:uiPriority="70"/>
+    <w:lsdException w:name="Colorful Shading Accent 2" w:uiPriority="71"/>
+    <w:lsdException w:name="Colorful List Accent 2" w:uiPriority="72"/>
+    <w:lsdException w:name="Colorful Grid Accent 2" w:uiPriority="73"/>
+    <w:lsdException w:name="Light Shading Accent 3" w:uiPriority="60"/>
+    <w:lsdException w:name="Light List Accent 3" w:uiPriority="61"/>
+    <w:lsdException w:name="Light Grid Accent 3" w:uiPriority="62"/>
+    <w:lsdException w:name="Medium Shading 1 Accent 3" w:uiPriority="63"/>
+    <w:lsdException w:name="Medium Shading 2 Accent 3" w:uiPriority="64"/>
+    <w:lsdException w:name="Medium List 1 Accent 3" w:uiPriority="65"/>
+    <w:lsdException w:name="Medium List 2 Accent 3" w:uiPriority="66"/>
+    <w:lsdException w:name="Medium Grid 1 Accent 3" w:uiPriority="67"/>
+    <w:lsdException w:name="Medium Grid 2 Accent 3" w:uiPriority="68"/>
+    <w:lsdException w:name="Medium Grid 3 Accent 3" w:uiPriority="69"/>
+    <w:lsdException w:name="Dark List Accent 3" w:uiPriority="70"/>
+    <w:lsdException w:name="Colorful Shading Accent 3" w:uiPriority="71"/>
+    <w:lsdException w:name="Colorful List Accent 3" w:uiPriority="72"/>
+    <w:lsdException w:name="Colorful Grid Accent 3" w:uiPriority="73"/>
+    <w:lsdException w:name="Light Shading Accent 4" w:uiPriority="60"/>
+    <w:lsdException w:name="Light List Accent 4" w:uiPriority="61"/>
+    <w:lsdException w:name="Light Grid Accent 4" w:uiPriority="62"/>
+    <w:lsdException w:name="Medium Shading 1 Accent 4" w:uiPriority="63"/>
+    <w:lsdException w:name="Medium Shading 2 Accent 4" w:uiPriority="64"/>
+    <w:lsdException w:name="Medium List 1 Accent 4" w:uiPriority="65"/>
+    <w:lsdException w:name="Medium List 2 Accent 4" w:uiPriority="66"/>
+    <w:lsdException w:name="Medium Grid 1 Accent 4" w:uiPriority="67"/>
+    <w:lsdException w:name="Medium Grid 2 Accent 4" w:uiPriority="68"/>
+    <w:lsdException w:name="Medium Grid 3 Accent 4" w:uiPriority="69"/>
+    <w:lsdException w:name="Dark List Accent 4" w:uiPriority="70"/>
+    <w:lsdException w:name="Colorful Shading Accent 4" w:uiPriority="71"/>
+    <w:lsdException w:name="Colorful List Accent 4" w:uiPriority="72"/>
+    <w:lsdException w:name="Colorful Grid Accent 4" w:uiPriority="73"/>
+    <w:lsdException w:name="Light Shading Accent 5" w:uiPriority="60"/>
+    <w:lsdException w:name="Light List Accent 5" w:uiPriority="61"/>
+    <w:lsdException w:name="Light Grid Accent 5" w:uiPriority="62"/>
+    <w:lsdException w:name="Medium Shading 1 Accent 5" w:uiPriority="63"/>
+    <w:lsdException w:name="Medium Shading 2 Accent 5" w:uiPriority="64"/>
+    <w:lsdException w:name="Medium List 1 Accent 5" w:uiPriority="65"/>
+    <w:lsdException w:name="Medium List 2 Accent 5" w:uiPriority="66"/>
+    <w:lsdException w:name="Medium Grid 1 Accent 5" w:uiPriority="67"/>
+    <w:lsdException w:name="Medium Grid 2 Accent 5" w:uiPriority="68"/>
+    <w:lsdException w:name="Medium Grid 3 Accent 5" w:uiPriority="69"/>
+    <w:lsdException w:name="Dark List Accent 5" w:uiPriority="70"/>
+    <w:lsdException w:name="Colorful Shading Accent 5" w:uiPriority="71"/>
+    <w:lsdException w:name="Colorful List Accent 5" w:uiPriority="72"/>
+    <w:lsdException w:name="Colorful Grid Accent 5" w:uiPriority="73"/>
+    <w:lsdException w:name="Light Shading Accent 6" w:uiPriority="60"/>
+    <w:lsdException w:name="Light List Accent 6" w:uiPriority="61"/>
+    <w:lsdException w:name="Light Grid Accent 6" w:uiPriority="62"/>
+    <w:lsdException w:name="Medium Shading 1 Accent 6" w:uiPriority="63"/>
+    <w:lsdException w:name="Medium Shading 2 Accent 6" w:uiPriority="64"/>
+    <w:lsdException w:name="Medium List 1 Accent 6" w:uiPriority="65"/>
+    <w:lsdException w:name="Medium List 2 Accent 6" w:uiPriority="66"/>
+    <w:lsdException w:name="Medium Grid 1 Accent 6" w:uiPriority="67"/>
+    <w:lsdException w:name="Medium Grid 2 Accent 6" w:uiPriority="68"/>
+    <w:lsdException w:name="Medium Grid 3 Accent 6" w:uiPriority="69"/>
+    <w:lsdException w:name="Dark List Accent 6" w:uiPriority="70"/>
+    <w:lsdException w:name="Colorful Shading Accent 6" w:uiPriority="71"/>
+    <w:lsdException w:name="Colorful List Accent 6" w:uiPriority="72"/>
+    <w:lsdException w:name="Colorful Grid Accent 6" w:uiPriority="73"/>
+    <w:lsdException w:name="Subtle Emphasis" w:qFormat="1" w:uiPriority="19"/>
+    <w:lsdException w:name="Intense Emphasis" w:qFormat="1" w:uiPriority="21"/>
+    <w:lsdException w:name="Subtle Reference" w:qFormat="1" w:uiPriority="31"/>
+    <w:lsdException w:name="Intense Reference" w:qFormat="1" w:uiPriority="32"/>
+    <w:lsdException w:name="Book Title" w:qFormat="1" w:uiPriority="33"/>
+    <w:lsdException w:name="Bibliography" w:semiHidden="1" w:uiPriority="37" w:unhideWhenUsed="1"/>
+    <w:lsdException w:name="TOC Heading" w:qFormat="1" w:semiHidden="1" w:uiPriority="39" w:unhideWhenUsed="1"/>
+    <w:lsdException w:name="Plain Table 1" w:uiPriority="41"/>
+    <w:lsdException w:name="Plain Table 2" w:uiPriority="42"/>
+    <w:lsdException w:name="Plain Table 3" w:uiPriority="43"/>
+    <w:lsdException w:name="Plain Table 4" w:uiPriority="44"/>
+    <w:lsdException w:name="Plain Table 5" w:uiPriority="45"/>
+    <w:lsdException w:name="Grid Table Light" w:uiPriority="40"/>
+    <w:lsdException w:name="Grid Table 1 Light" w:uiPriority="46"/>
+    <w:lsdException w:name="Grid Table 2" w:uiPriority="47"/>
+    <w:lsdException w:name="Grid Table 3" w:uiPriority="48"/>
+    <w:lsdException w:name="Grid Table 4" w:uiPriority="49"/>
+    <w:lsdException w:name="Grid Table 5 Dark" w:uiPriority="50"/>
+    <w:lsdException w:name="Grid Table 6 Colorful" w:uiPriority="51"/>
+    <w:lsdException w:name="Grid Table 7 Colorful" w:uiPriority="52"/>
+    <w:lsdException w:name="Grid Table 1 Light Accent 1" w:uiPriority="46"/>
+    <w:lsdException w:name="Grid Table 2 Accent 1" w:uiPriority="47"/>
+    <w:lsdException w:name="Grid Table 3 Accent 1" w:uiPriority="48"/>
+    <w:lsdException w:name="Grid Table 4 Accent 1" w:uiPriority="49"/>
+    <w:lsdException w:name="Grid Table 5 Dark Accent 1" w:uiPriority="50"/>
+    <w:lsdException w:name="Grid Table 6 Colorful Accent 1" w:uiPriority="51"/>
+    <w:lsdException w:name="Grid Table 7 Colorful Accent 1" w:uiPriority="52"/>
+    <w:lsdException w:name="Grid Table 1 Light Accent 2" w:uiPriority="46"/>
+    <w:lsdException w:name="Grid Table 2 Accent 2" w:uiPriority="47"/>
+    <w:lsdException w:name="Grid Table 3 Accent 2" w:uiPriority="48"/>
+    <w:lsdException w:name="Grid Table 4 Accent 2" w:uiPriority="49"/>
+    <w:lsdException w:name="Grid Table 5 Dark Accent 2" w:uiPriority="50"/>
+    <w:lsdException w:name="Grid Table 6 Colorful Accent 2" w:uiPriority="51"/>
+    <w:lsdException w:name="Grid Table 7 Colorful Accent 2" w:uiPriority="52"/>
+    <w:lsdException w:name="Grid Table 1 Light Accent 3" w:uiPriority="46"/>
+    <w:lsdException w:name="Grid Table 2 Accent 3" w:uiPriority="47"/>
+    <w:lsdException w:name="Grid Table 3 Accent 3" w:uiPriority="48"/>
+    <w:lsdException w:name="Grid Table 4 Accent 3" w:uiPriority="49"/>
+    <w:lsdException w:name="Grid Table 5 Dark Accent 3" w:uiPriority="50"/>
+    <w:lsdException w:name="Grid Table 6 Colorful Accent 3" w:uiPriority="51"/>
+    <w:lsdException w:name="Grid Table 7 Colorful Accent 3" w:uiPriority="52"/>
+    <w:lsdException w:name="Grid Table 1 Light Accent 4" w:uiPriority="46"/>
+    <w:lsdException w:name="Grid Table 2 Accent 4" w:uiPriority="47"/>
+    <w:lsdException w:name="Grid Table 3 Accent 4" w:uiPriority="48"/>
+    <w:lsdException w:name="Grid Table 4 Accent 4" w:uiPriority="49"/>
+    <w:lsdException w:name="Grid Table 5 Dark Accent 4" w:uiPriority="50"/>
+    <w:lsdException w:name="Grid Table 6 Colorful Accent 4" w:uiPriority="51"/>
+    <w:lsdException w:name="Grid Table 7 Colorful Accent 4" w:uiPriority="52"/>
+    <w:lsdException w:name="Grid Table 1 Light Accent 5" w:uiPriority="46"/>
+    <w:lsdException w:name="Grid Table 2 Accent 5" w:uiPriority="47"/>
+    <w:lsdException w:name="Grid Table 3 Accent 5" w:uiPriority="48"/>
+    <w:lsdException w:name="Grid Table 4 Accent 5" w:uiPriority="49"/>
+    <w:lsdException w:name="Grid Table 5 Dark Accent 5" w:uiPriority="50"/>
+    <w:lsdException w:name="Grid Table 6 Colorful Accent 5" w:uiPriority="51"/>
+    <w:lsdException w:name="Grid Table 7 Colorful Accent 5" w:uiPriority="52"/>
+    <w:lsdException w:name="Grid Table 1 Light Accent 6" w:uiPriority="46"/>
+    <w:lsdException w:name="Grid Table 2 Accent 6" w:uiPriority="47"/>
+    <w:lsdException w:name="Grid Table 3 Accent 6" w:uiPriority="48"/>
+    <w:lsdException w:name="Grid Table 4 Accent 6" w:uiPriority="49"/>
+    <w:lsdException w:name="Grid Table 5 Dark Accent 6" w:uiPriority="50"/>
+    <w:lsdException w:name="Grid Table 6 Colorful Accent 6" w:uiPriority="51"/>
+    <w:lsdException w:name="Grid Table 7 Colorful Accent 6" w:uiPriority="52"/>
+    <w:lsdException w:name="List Table 1 Light" w:uiPriority="46"/>
+    <w:lsdException w:name="List Table 2" w:uiPriority="47"/>
+    <w:lsdException w:name="List Table 3" w:uiPriority="48"/>
+    <w:lsdException w:name="List Table 4" w:uiPriority="49"/>
+    <w:lsdException w:name="List Table 5 Dark" w:uiPriority="50"/>
+    <w:lsdException w:name="List Table 6 Colorful" w:uiPriority="51"/>
+    <w:lsdException w:name="List Table 7 Colorful" w:uiPriority="52"/>
+    <w:lsdException w:name="List Table 1 Light Accent 1" w:uiPriority="46"/>
+    <w:lsdException w:name="List Table 2 Accent 1" w:uiPriority="47"/>
+    <w:lsdException w:name="List Table 3 Accent 1" w:uiPriority="48"/>
+    <w:lsdException w:name="List Table 4 Accent 1" w:uiPriority="49"/>
+    <w:lsdException w:name="List Table 5 Dark Accent 1" w:uiPriority="50"/>
+    <w:lsdException w:name="List Table 6 Colorful Accent 1" w:uiPriority="51"/>
+    <w:lsdException w:name="List Table 7 Colorful Accent 1" w:uiPriority="52"/>
+    <w:lsdException w:name="List Table 1 Light Accent 2" w:uiPriority="46"/>
+    <w:lsdException w:name="List Table 2 Accent 2" w:uiPriority="47"/>
+    <w:lsdException w:name="List Table 3 Accent 2" w:uiPriority="48"/>
+    <w:lsdException w:name="List Table 4 Accent 2" w:uiPriority="49"/>
+    <w:lsdException w:name="List Table 5 Dark Accent 2" w:uiPriority="50"/>
+    <w:lsdException w:name="List Table 6 Colorful Accent 2" w:uiPriority="51"/>
+    <w:lsdException w:name="List Table 7 Colorful Accent 2" w:uiPriority="52"/>
+    <w:lsdException w:name="List Table 1 Light Accent 3" w:uiPriority="46"/>
+    <w:lsdException w:name="List Table 2 Accent 3" w:uiPriority="47"/>
+    <w:lsdException w:name="List Table 3 Accent 3" w:uiPriority="48"/>
+    <w:lsdException w:name="List Table 4 Accent 3" w:uiPriority="49"/>
+    <w:lsdException w:name="List Table 5 Dark Accent 3" w:uiPriority="50"/>
+    <w:lsdException w:name="List Table 6 Colorful Accent 3" w:uiPriority="51"/>
+    <w:lsdException w:name="List Table 7 Colorful Accent 3" w:uiPriority="52"/>
+    <w:lsdException w:name="List Table 1 Light Accent 4" w:uiPriority="46"/>
+    <w:lsdException w:name="List Table 2 Accent 4" w:uiPriority="47"/>
+    <w:lsdException w:name="List Table 3 Accent 4" w:uiPriority="48"/>
+    <w:lsdException w:name="List Table 4 Accent 4" w:uiPriority="49"/>
+    <w:lsdException w:name="List Table 5 Dark Accent 4" w:uiPriority="50"/>
+    <w:lsdException w:name="List Table 6 Colorful Accent 4" w:uiPriority="51"/>
+    <w:lsdException w:name="List Table 7 Colorful Accent 4" w:uiPriority="52"/>
+    <w:lsdException w:name="List Table 1 Light Accent 5" w:uiPriority="46"/>
+    <w:lsdException w:name="List Table 2 Accent 5" w:uiPriority="47"/>
+    <w:lsdException w:name="List Table 3 Accent 5" w:uiPriority="48"/>
+    <w:lsdException w:name="List Table 4 Accent 5" w:uiPriority="49"/>
+    <w:lsdException w:name="List Table 5 Dark Accent 5" w:uiPriority="50"/>
+    <w:lsdException w:name="List Table 6 Colorful Accent 5" w:uiPriority="51"/>
+    <w:lsdException w:name="List Table 7 Colorful Accent 5" w:uiPriority="52"/>
+    <w:lsdException w:name="List Table 1 Light Accent 6" w:uiPriority="46"/>
+    <w:lsdException w:name="List Table 2 Accent 6" w:uiPriority="47"/>
+    <w:lsdException w:name="List Table 3 Accent 6" w:uiPriority="48"/>
+    <w:lsdException w:name="List Table 4 Accent 6" w:uiPriority="49"/>
+    <w:lsdException w:name="List Table 5 Dark Accent 6" w:uiPriority="50"/>
+    <w:lsdException w:name="List Table 6 Colorful Accent 6" w:uiPriority="51"/>
+    <w:lsdException w:name="List Table 7 Colorful Accent 6" w:uiPriority="52"/>
+    <w:lsdException w:name="Mention" w:semiHidden="1" w:unhideWhenUsed="1"/>
+    <w:lsdException w:name="Smart Hyperlink" w:semiHidden="1" w:unhideWhenUsed="1"/>
+    <w:lsdException w:name="Hashtag" w:semiHidden="1" w:unhideWhenUsed="1"/>
+    <w:lsdException w:name="Unresolved Mention" w:semiHidden="1" w:unhideWhenUsed="1"/>
+  </w:latentStyles>
   <w:style w:default="1" w:styleId="Normal" w:type="paragraph">
     <w:name w:val="Normal"/>
     <w:qFormat/>
-  </w:style>
-  <w:style w:styleId="BodyText" w:type="paragraph">
-    <w:name w:val="Body Text"/>
-    <w:basedOn w:val="Normal"/>
-    <w:link w:val="BodyTextChar"/>
-    <w:pPr>
-      <w:spacing w:after="180" w:before="180"/>
-    </w:pPr>
-    <w:qFormat/>
-  </w:style>
-  <w:style w:customStyle="1" w:styleId="FirstParagraph" w:type="paragraph">
-    <w:name w:val="First Paragraph"/>
-    <w:basedOn w:val="BodyText"/>
-    <w:next w:val="BodyText"/>
-    <w:qFormat/>
-  </w:style>
-  <w:style w:customStyle="1" w:styleId="Compact" w:type="paragraph">
-    <w:name w:val="Compact"/>
-    <w:basedOn w:val="BodyText"/>
-    <w:qFormat/>
-    <w:pPr>
-      <w:spacing w:after="36" w:before="36"/>
-    </w:pPr>
-  </w:style>
-  <w:style w:styleId="Title" w:type="paragraph">
-    <w:name w:val="Title"/>
-    <w:basedOn w:val="Normal"/>
-    <w:next w:val="BodyText"/>
-    <w:qFormat/>
-    <w:pPr>
-      <w:keepNext/>
-      <w:keepLines/>
-      <w:spacing w:after="240" w:before="480"/>
-      <w:jc w:val="center"/>
-    </w:pPr>
-    <w:rPr>
-      <w:rFonts w:asciiTheme="majorHAnsi" w:cstheme="majorBidi" w:eastAsiaTheme="majorEastAsia" w:hAnsiTheme="majorHAnsi"/>
-      <w:b/>
-      <w:bCs/>
-      <w:color w:themeColor="accent1" w:themeShade="B5" w:val="345A8A"/>
-      <w:sz w:val="36"/>
-      <w:szCs w:val="36"/>
-    </w:rPr>
-  </w:style>
-  <w:style w:styleId="Subtitle" w:type="paragraph">
-    <w:name w:val="Subtitle"/>
-    <w:basedOn w:val="Title"/>
-    <w:next w:val="BodyText"/>
-    <w:qFormat/>
-    <w:pPr>
-      <w:keepNext/>
-      <w:keepLines/>
-      <w:spacing w:after="240" w:before="240"/>
-      <w:jc w:val="center"/>
-    </w:pPr>
-    <w:rPr>
-      <w:sz w:val="30"/>
-      <w:szCs w:val="30"/>
-    </w:rPr>
-  </w:style>
-  <w:style w:customStyle="1" w:styleId="Author" w:type="paragraph">
-    <w:name w:val="Author"/>
-    <w:next w:val="BodyText"/>
-    <w:qFormat/>
-    <w:pPr>
-      <w:keepNext/>
-      <w:keepLines/>
-      <w:jc w:val="center"/>
-    </w:pPr>
-  </w:style>
-  <w:style w:styleId="Date" w:type="paragraph">
-    <w:name w:val="Date"/>
-    <w:next w:val="BodyText"/>
-    <w:qFormat/>
-    <w:pPr>
-      <w:keepNext/>
-      <w:keepLines/>
-      <w:jc w:val="center"/>
-    </w:pPr>
-  </w:style>
-  <w:style w:customStyle="1" w:styleId="Abstract" w:type="paragraph">
-    <w:name w:val="Abstract"/>
-    <w:basedOn w:val="Normal"/>
-    <w:next w:val="BodyText"/>
-    <w:qFormat/>
-    <w:pPr>
-      <w:keepNext/>
-      <w:keepLines/>
-      <w:spacing w:after="300" w:before="300"/>
-    </w:pPr>
-    <w:rPr>
-      <w:sz w:val="20"/>
-      <w:szCs w:val="20"/>
-    </w:rPr>
-  </w:style>
-  <w:style w:styleId="Bibliography" w:type="paragraph">
-    <w:name w:val="Bibliography"/>
-    <w:basedOn w:val="Normal"/>
-    <w:next w:val="Bibliography"/>
-    <w:qFormat/>
-    <w:pPr/>
-    <w:rPr/>
-  </w:style>
-  <w:style w:styleId="Heading1" w:type="paragraph">
-    <w:name w:val="Heading 1"/>
-    <w:basedOn w:val="Normal"/>
-    <w:next w:val="BodyText"/>
-    <w:uiPriority w:val="9"/>
-    <w:qFormat/>
-    <w:pPr>
-      <w:keepNext/>
-      <w:keepLines/>
-      <w:spacing w:after="0" w:before="480"/>
-      <w:outlineLvl w:val="0"/>
-    </w:pPr>
-    <w:rPr>
-      <w:rFonts w:asciiTheme="majorHAnsi" w:cstheme="majorBidi" w:eastAsiaTheme="majorEastAsia" w:hAnsiTheme="majorHAnsi"/>
-      <w:b/>
-      <w:bCs/>
-      <w:color w:themeColor="accent1" w:val="4F81BD"/>
-      <w:sz w:val="32"/>
-      <w:szCs w:val="32"/>
-    </w:rPr>
-  </w:style>
-  <w:style w:styleId="Heading2" w:type="paragraph">
-    <w:name w:val="Heading 2"/>
-    <w:basedOn w:val="Normal"/>
-    <w:next w:val="BodyText"/>
-    <w:uiPriority w:val="9"/>
-    <w:unhideWhenUsed/>
-    <w:qFormat/>
-    <w:pPr>
-      <w:keepNext/>
-      <w:keepLines/>
-      <w:spacing w:after="0" w:before="200"/>
-      <w:outlineLvl w:val="1"/>
-    </w:pPr>
-    <w:rPr>
-      <w:rFonts w:asciiTheme="majorHAnsi" w:cstheme="majorBidi" w:eastAsiaTheme="majorEastAsia" w:hAnsiTheme="majorHAnsi"/>
-      <w:b/>
-      <w:bCs/>
-      <w:color w:themeColor="accent1" w:val="4F81BD"/>
-      <w:sz w:val="28"/>
-      <w:szCs w:val="28"/>
-    </w:rPr>
-  </w:style>
-  <w:style w:styleId="Heading3" w:type="paragraph">
-    <w:name w:val="Heading 3"/>
-    <w:basedOn w:val="Normal"/>
-    <w:next w:val="BodyText"/>
-    <w:uiPriority w:val="9"/>
-    <w:unhideWhenUsed/>
-    <w:qFormat/>
-    <w:pPr>
-      <w:keepNext/>
-      <w:keepLines/>
-      <w:spacing w:after="0" w:before="200"/>
-      <w:outlineLvl w:val="2"/>
-    </w:pPr>
-    <w:rPr>
-      <w:rFonts w:asciiTheme="majorHAnsi" w:cstheme="majorBidi" w:eastAsiaTheme="majorEastAsia" w:hAnsiTheme="majorHAnsi"/>
-      <w:b/>
-      <w:bCs/>
-      <w:color w:themeColor="accent1" w:val="4F81BD"/>
+    <w:rsid w:val="009D6AFC"/>
+    <w:rPr>
       <w:sz w:val="24"/>
-      <w:szCs w:val="24"/>
-    </w:rPr>
-  </w:style>
-  <w:style w:styleId="Heading4" w:type="paragraph">
-    <w:name w:val="Heading 4"/>
-    <w:basedOn w:val="Normal"/>
-    <w:next w:val="BodyText"/>
-    <w:uiPriority w:val="9"/>
-    <w:unhideWhenUsed/>
-    <w:qFormat/>
-    <w:pPr>
-      <w:keepNext/>
-      <w:keepLines/>
-      <w:spacing w:after="0" w:before="200"/>
-      <w:outlineLvl w:val="3"/>
-    </w:pPr>
-    <w:rPr>
-      <w:rFonts w:asciiTheme="majorHAnsi" w:cstheme="majorBidi" w:eastAsiaTheme="majorEastAsia" w:hAnsiTheme="majorHAnsi"/>
-      <w:i/>
-      <w:bCs/>
-      <w:color w:themeColor="accent1" w:val="4F81BD"/>
-      <w:sz w:val="24"/>
-      <w:szCs w:val="24"/>
-    </w:rPr>
-  </w:style>
-  <w:style w:styleId="Heading5" w:type="paragraph">
-    <w:name w:val="Heading 5"/>
-    <w:basedOn w:val="Normal"/>
-    <w:next w:val="BodyText"/>
-    <w:uiPriority w:val="9"/>
-    <w:unhideWhenUsed/>
-    <w:qFormat/>
-    <w:pPr>
-      <w:keepNext/>
-      <w:keepLines/>
-      <w:spacing w:after="0" w:before="200"/>
-      <w:outlineLvl w:val="4"/>
-    </w:pPr>
-    <w:rPr>
-      <w:rFonts w:asciiTheme="majorHAnsi" w:cstheme="majorBidi" w:eastAsiaTheme="majorEastAsia" w:hAnsiTheme="majorHAnsi"/>
-      <w:iCs/>
-      <w:color w:themeColor="accent1" w:val="4F81BD"/>
-      <w:sz w:val="24"/>
-      <w:szCs w:val="24"/>
-    </w:rPr>
-  </w:style>
-  <w:style w:styleId="Heading6" w:type="paragraph">
-    <w:name w:val="Heading 6"/>
-    <w:basedOn w:val="Normal"/>
-    <w:next w:val="BodyText"/>
-    <w:uiPriority w:val="9"/>
-    <w:unhideWhenUsed/>
-    <w:qFormat/>
-    <w:pPr>
-      <w:keepNext/>
-      <w:keepLines/>
-      <w:spacing w:after="0" w:before="200"/>
-      <w:outlineLvl w:val="5"/>
-    </w:pPr>
-    <w:rPr>
-      <w:rFonts w:asciiTheme="majorHAnsi" w:cstheme="majorBidi" w:eastAsiaTheme="majorEastAsia" w:hAnsiTheme="majorHAnsi"/>
-      <w:color w:themeColor="accent1" w:val="4F81BD"/>
-      <w:sz w:val="24"/>
-      <w:szCs w:val="24"/>
-    </w:rPr>
-  </w:style>
-  <w:style w:styleId="Heading7" w:type="paragraph">
-    <w:name w:val="Heading 7"/>
-    <w:basedOn w:val="Normal"/>
-    <w:next w:val="BodyText"/>
-    <w:uiPriority w:val="9"/>
-    <w:unhideWhenUsed/>
-    <w:qFormat/>
-    <w:pPr>
-      <w:keepNext/>
-      <w:keepLines/>
-      <w:spacing w:after="0" w:before="200"/>
-      <w:outlineLvl w:val="6"/>
-    </w:pPr>
-    <w:rPr>
-      <w:rFonts w:asciiTheme="majorHAnsi" w:cstheme="majorBidi" w:eastAsiaTheme="majorEastAsia" w:hAnsiTheme="majorHAnsi"/>
-      <w:color w:themeColor="accent1" w:val="4F81BD"/>
-      <w:sz w:val="24"/>
-      <w:szCs w:val="24"/>
-    </w:rPr>
-  </w:style>
-  <w:style w:styleId="Heading8" w:type="paragraph">
-    <w:name w:val="Heading 8"/>
-    <w:basedOn w:val="Normal"/>
-    <w:next w:val="BodyText"/>
-    <w:uiPriority w:val="9"/>
-    <w:unhideWhenUsed/>
-    <w:qFormat/>
-    <w:pPr>
-      <w:keepNext/>
-      <w:keepLines/>
-      <w:spacing w:after="0" w:before="200"/>
-      <w:outlineLvl w:val="7"/>
-    </w:pPr>
-    <w:rPr>
-      <w:rFonts w:asciiTheme="majorHAnsi" w:cstheme="majorBidi" w:eastAsiaTheme="majorEastAsia" w:hAnsiTheme="majorHAnsi"/>
-      <w:color w:themeColor="accent1" w:val="4F81BD"/>
-      <w:sz w:val="24"/>
-      <w:szCs w:val="24"/>
-    </w:rPr>
-  </w:style>
-  <w:style w:styleId="Heading9" w:type="paragraph">
-    <w:name w:val="Heading 9"/>
-    <w:basedOn w:val="Normal"/>
-    <w:next w:val="BodyText"/>
-    <w:uiPriority w:val="9"/>
-    <w:unhideWhenUsed/>
-    <w:qFormat/>
-    <w:pPr>
-      <w:keepNext/>
-      <w:keepLines/>
-      <w:spacing w:after="0" w:before="200"/>
-      <w:outlineLvl w:val="8"/>
-    </w:pPr>
-    <w:rPr>
-      <w:rFonts w:asciiTheme="majorHAnsi" w:cstheme="majorBidi" w:eastAsiaTheme="majorEastAsia" w:hAnsiTheme="majorHAnsi"/>
-      <w:color w:themeColor="accent1" w:val="4F81BD"/>
-      <w:sz w:val="24"/>
-      <w:szCs w:val="24"/>
-    </w:rPr>
-  </w:style>
-  <w:style w:styleId="BlockText" w:type="paragraph">
-    <w:name w:val="Block Text"/>
-    <w:basedOn w:val="BodyText"/>
-    <w:next w:val="BodyText"/>
-    <w:uiPriority w:val="9"/>
-    <w:unhideWhenUsed/>
-    <w:qFormat/>
-    <w:pPr>
-      <w:spacing w:after="100" w:before="100"/>
-      <w:ind w:firstLine="0" w:left="480" w:right="480"/>
-    </w:pPr>
-  </w:style>
-  <w:style w:styleId="FootnoteText" w:type="paragraph">
-    <w:name w:val="Footnote Text"/>
-    <w:basedOn w:val="Normal"/>
-    <w:next w:val="FootnoteText"/>
-    <w:uiPriority w:val="9"/>
-    <w:unhideWhenUsed/>
-    <w:qFormat/>
-  </w:style>
-  <w:style w:default="1" w:styleId="DefaultParagraphFont" w:type="character">
+    </w:rPr>
+  </w:style>
+  <w:style w:default="1" w:styleId="Fontepargpadro" w:type="character">
     <w:name w:val="Default Paragraph Font"/>
+    <w:uiPriority w:val="1"/>
     <w:semiHidden/>
     <w:unhideWhenUsed/>
   </w:style>
-  <w:style w:default="1" w:styleId="Table" w:type="table">
-    <w:name w:val="Table"/>
-    <w:basedOn w:val="TableNormal"/>
+  <w:style w:default="1" w:styleId="Tabelanormal" w:type="table">
+    <w:name w:val="Normal Table"/>
+    <w:uiPriority w:val="99"/>
     <w:semiHidden/>
     <w:unhideWhenUsed/>
-    <w:qFormat/>
     <w:tblPr>
       <w:tblInd w:type="dxa" w:w="0"/>
       <w:tblCellMar>
@@ -1192,130 +1748,152 @@
         <w:right w:type="dxa" w:w="108"/>
       </w:tblCellMar>
     </w:tblPr>
-    <w:tblStylePr w:type="firstRow">
-      <w:tblPr>
-        <w:jc w:val="left"/>
-        <w:tblInd w:type="dxa" w:w="0"/>
-      </w:tblPr>
-      <w:trPr>
-        <w:jc w:val="left"/>
-      </w:trPr>
-      <w:tcPr>
-        <w:vAlign w:val="bottom"/>
-        <w:tcBorders>
-          <w:bottom w:val="single"/>
-        </w:tcBorders>
-      </w:tcPr>
-    </w:tblStylePr>
-  </w:style>
-  <w:style w:customStyle="1" w:styleId="DefinitionTerm" w:type="paragraph">
-    <w:name w:val="Definition Term"/>
+  </w:style>
+  <w:style w:default="1" w:styleId="Semlista" w:type="numbering">
+    <w:name w:val="No List"/>
+    <w:uiPriority w:val="99"/>
+    <w:semiHidden/>
+    <w:unhideWhenUsed/>
+  </w:style>
+  <w:style w:styleId="Cabealho" w:type="paragraph">
+    <w:name w:val="header"/>
     <w:basedOn w:val="Normal"/>
-    <w:next w:val="Definition"/>
+    <w:link w:val="CabealhoChar"/>
+    <w:uiPriority w:val="99"/>
+    <w:unhideWhenUsed/>
+    <w:rsid w:val="006078E3"/>
     <w:pPr>
-      <w:keepNext/>
-      <w:keepLines/>
-      <w:spacing w:after="0"/>
+      <w:tabs>
+        <w:tab w:pos="4252" w:val="center"/>
+        <w:tab w:pos="8504" w:val="right"/>
+      </w:tabs>
+      <w:spacing w:after="0" w:line="240" w:lineRule="auto"/>
     </w:pPr>
-    <w:rPr>
+  </w:style>
+  <w:style w:customStyle="1" w:styleId="CabealhoChar" w:type="character">
+    <w:name w:val="Cabeçalho Char"/>
+    <w:basedOn w:val="Fontepargpadro"/>
+    <w:link w:val="Cabealho"/>
+    <w:uiPriority w:val="99"/>
+    <w:rsid w:val="006078E3"/>
+  </w:style>
+  <w:style w:styleId="Rodap" w:type="paragraph">
+    <w:name w:val="footer"/>
+    <w:basedOn w:val="Normal"/>
+    <w:link w:val="RodapChar"/>
+    <w:uiPriority w:val="99"/>
+    <w:unhideWhenUsed/>
+    <w:rsid w:val="006078E3"/>
+    <w:pPr>
+      <w:tabs>
+        <w:tab w:pos="4252" w:val="center"/>
+        <w:tab w:pos="8504" w:val="right"/>
+      </w:tabs>
+      <w:spacing w:after="0" w:line="240" w:lineRule="auto"/>
+    </w:pPr>
+  </w:style>
+  <w:style w:customStyle="1" w:styleId="RodapChar" w:type="character">
+    <w:name w:val="Rodapé Char"/>
+    <w:basedOn w:val="Fontepargpadro"/>
+    <w:link w:val="Rodap"/>
+    <w:uiPriority w:val="99"/>
+    <w:rsid w:val="006078E3"/>
+  </w:style>
+  <w:style w:customStyle="1" w:styleId="Estilo1" w:type="paragraph">
+    <w:name w:val="Estilo1"/>
+    <w:basedOn w:val="Normal"/>
+    <w:link w:val="Estilo1Char"/>
+    <w:qFormat/>
+    <w:rsid w:val="00B042DC"/>
+    <w:rPr>
+      <w:rFonts w:ascii="Trebuchet MS" w:hAnsi="Trebuchet MS"/>
+      <w:color w:themeColor="accent1" w:themeShade="BF" w:val="2F5496"/>
+      <w:sz w:val="32"/>
+      <w:szCs w:val="32"/>
+    </w:rPr>
+  </w:style>
+  <w:style w:customStyle="1" w:styleId="Estilo2" w:type="paragraph">
+    <w:name w:val="Estilo2"/>
+    <w:basedOn w:val="Normal"/>
+    <w:link w:val="Estilo2Char"/>
+    <w:qFormat/>
+    <w:rsid w:val="00B042DC"/>
+    <w:rPr>
+      <w:rFonts w:ascii="Trebuchet MS" w:hAnsi="Trebuchet MS"/>
+      <w:color w:themeColor="accent1" w:val="4472C4"/>
+      <w:sz w:val="28"/>
+      <w:szCs w:val="28"/>
+    </w:rPr>
+  </w:style>
+  <w:style w:customStyle="1" w:styleId="Estilo1Char" w:type="character">
+    <w:name w:val="Estilo1 Char"/>
+    <w:basedOn w:val="Fontepargpadro"/>
+    <w:link w:val="Estilo1"/>
+    <w:rsid w:val="00B042DC"/>
+    <w:rPr>
+      <w:rFonts w:ascii="Trebuchet MS" w:hAnsi="Trebuchet MS"/>
+      <w:color w:themeColor="accent1" w:themeShade="BF" w:val="2F5496"/>
+      <w:sz w:val="32"/>
+      <w:szCs w:val="32"/>
+    </w:rPr>
+  </w:style>
+  <w:style w:customStyle="1" w:styleId="Estilo3" w:type="paragraph">
+    <w:name w:val="Estilo3"/>
+    <w:basedOn w:val="Normal"/>
+    <w:link w:val="Estilo3Char"/>
+    <w:qFormat/>
+    <w:rsid w:val="00B042DC"/>
+    <w:rPr>
+      <w:rFonts w:ascii="Trebuchet MS" w:hAnsi="Trebuchet MS"/>
       <w:b/>
-    </w:rPr>
-  </w:style>
-  <w:style w:customStyle="1" w:styleId="Definition" w:type="paragraph">
-    <w:name w:val="Definition"/>
+      <w:szCs w:val="24"/>
+    </w:rPr>
+  </w:style>
+  <w:style w:customStyle="1" w:styleId="Estilo2Char" w:type="character">
+    <w:name w:val="Estilo2 Char"/>
+    <w:basedOn w:val="Fontepargpadro"/>
+    <w:link w:val="Estilo2"/>
+    <w:rsid w:val="00B042DC"/>
+    <w:rPr>
+      <w:rFonts w:ascii="Trebuchet MS" w:hAnsi="Trebuchet MS"/>
+      <w:color w:themeColor="accent1" w:val="4472C4"/>
+      <w:sz w:val="28"/>
+      <w:szCs w:val="28"/>
+    </w:rPr>
+  </w:style>
+  <w:style w:customStyle="1" w:styleId="Estilotextonormal" w:type="paragraph">
+    <w:name w:val="Estilo texto normal"/>
     <w:basedOn w:val="Normal"/>
-  </w:style>
-  <w:style w:styleId="Caption" w:type="paragraph">
-    <w:name w:val="Caption"/>
-    <w:basedOn w:val="Normal"/>
-    <w:link w:val="BodyTextChar"/>
-    <w:pPr>
-      <w:spacing w:after="120" w:before="0"/>
-    </w:pPr>
-    <w:rPr>
-      <w:i/>
-    </w:rPr>
-  </w:style>
-  <w:style w:customStyle="1" w:styleId="TableCaption" w:type="paragraph">
-    <w:name w:val="Table Caption"/>
-    <w:basedOn w:val="Caption"/>
-    <w:pPr>
-      <w:keepNext/>
-    </w:pPr>
-  </w:style>
-  <w:style w:customStyle="1" w:styleId="ImageCaption" w:type="paragraph">
-    <w:name w:val="Image Caption"/>
-    <w:basedOn w:val="Caption"/>
-  </w:style>
-  <w:style w:customStyle="1" w:styleId="Figure" w:type="paragraph">
-    <w:name w:val="Figure"/>
-    <w:basedOn w:val="Normal"/>
-  </w:style>
-  <w:style w:customStyle="1" w:styleId="CaptionedFigure" w:type="paragraph">
-    <w:name w:val="Captioned Figure"/>
-    <w:basedOn w:val="Figure"/>
-    <w:pPr>
-      <w:keepNext/>
-    </w:pPr>
-  </w:style>
-  <w:style w:customStyle="1" w:styleId="BodyTextChar" w:type="character">
-    <w:name w:val="Body Text Char"/>
-    <w:basedOn w:val="DefaultParagraphFont"/>
-    <w:link w:val="BodyText"/>
-  </w:style>
-  <w:style w:customStyle="1" w:styleId="VerbatimChar" w:type="character">
-    <w:name w:val="Verbatim Char"/>
-    <w:basedOn w:val="BodyTextChar"/>
-    <w:rPr>
-      <w:rFonts w:ascii="Consolas" w:hAnsi="Consolas"/>
-      <w:sz w:val="22"/>
-    </w:rPr>
-  </w:style>
-  <w:style w:customStyle="1" w:styleId="SectionNumber" w:type="character">
-    <w:name w:val="Section Number"/>
-    <w:basedOn w:val="BodyTextChar"/>
-  </w:style>
-  <w:style w:styleId="FootnoteReference" w:type="character">
-    <w:name w:val="Footnote Reference"/>
-    <w:basedOn w:val="BodyTextChar"/>
-    <w:rPr>
-      <w:vertAlign w:val="superscript"/>
-    </w:rPr>
-  </w:style>
-  <w:style w:styleId="Hyperlink" w:type="character">
-    <w:name w:val="Hyperlink"/>
-    <w:basedOn w:val="BodyTextChar"/>
-    <w:rPr>
-      <w:color w:themeColor="accent1" w:val="4F81BD"/>
-    </w:rPr>
-  </w:style>
-  <w:style w:styleId="TOCHeading" w:type="paragraph">
-    <w:name w:val="TOC Heading"/>
-    <w:basedOn w:val="Heading1"/>
-    <w:next w:val="BodyText"/>
-    <w:uiPriority w:val="39"/>
-    <w:unhideWhenUsed/>
+    <w:link w:val="EstilotextonormalChar"/>
     <w:qFormat/>
-    <w:pPr>
-      <w:spacing w:before="240" w:line="259" w:lineRule="auto"/>
-      <w:outlineLvl w:val="9"/>
-    </w:pPr>
-    <w:rPr>
-      <w:rFonts w:asciiTheme="majorHAnsi" w:cstheme="majorBidi" w:eastAsiaTheme="majorEastAsia" w:hAnsiTheme="majorHAnsi"/>
-      <w:b w:val="0"/>
-      <w:bCs w:val="0"/>
-      <w:color w:themeColor="accent1" w:themeShade="BF" w:val="365F91"/>
-    </w:rPr>
-  </w:style>
-  <w:style w:type="paragraph" w:customStyle="1" w:styleId="Estilo1">
-    <w:name w:val="Estilo1"/>
-    <w:basedOn w:val="BodyText"/>
-    <w:qFormat/>
-  </w:style>
-  <w:style w:type="paragraph" w:customStyle="1" w:styleId="Estilo2">
-    <w:name w:val="Estilo2"/>
-    <w:basedOn w:val="BodyText"/>
-    <w:qFormat/>
+    <w:rsid w:val="00B042DC"/>
+    <w:rPr>
+      <w:rFonts w:ascii="Trebuchet MS" w:hAnsi="Trebuchet MS"/>
+      <w:szCs w:val="24"/>
+    </w:rPr>
+  </w:style>
+  <w:style w:customStyle="1" w:styleId="Estilo3Char" w:type="character">
+    <w:name w:val="Estilo3 Char"/>
+    <w:basedOn w:val="Fontepargpadro"/>
+    <w:link w:val="Estilo3"/>
+    <w:rsid w:val="00B042DC"/>
+    <w:rPr>
+      <w:rFonts w:ascii="Trebuchet MS" w:hAnsi="Trebuchet MS"/>
+      <w:b/>
+      <w:sz w:val="24"/>
+      <w:szCs w:val="24"/>
+    </w:rPr>
+  </w:style>
+  <w:style w:customStyle="1" w:styleId="EstilotextonormalChar" w:type="character">
+    <w:name w:val="Estilo texto normal Char"/>
+    <w:basedOn w:val="Fontepargpadro"/>
+    <w:link w:val="Estilotextonormal"/>
+    <w:rsid w:val="00B042DC"/>
+    <w:rPr>
+      <w:rFonts w:ascii="Trebuchet MS" w:hAnsi="Trebuchet MS"/>
+      <w:sz w:val="24"/>
+      <w:szCs w:val="24"/>
+    </w:rPr>
   </w:style>
   <w:style w:type="paragraph" w:customStyle="1" w:styleId="SourceCode">
     <w:name w:val="Source Code"/>
@@ -1589,7 +2167,7 @@
 </file>
 
 <file path=word/theme/theme1.xml><?xml version="1.0" encoding="utf-8"?>
-<a:theme xmlns:a="http://schemas.openxmlformats.org/drawingml/2006/main" name="Office Theme">
+<a:theme xmlns:a="http://schemas.openxmlformats.org/drawingml/2006/main" name="Tema do Office">
   <a:themeElements>
     <a:clrScheme name="Office">
       <a:dk1>
@@ -1599,44 +2177,44 @@
         <a:sysClr val="window" lastClr="FFFFFF"/>
       </a:lt1>
       <a:dk2>
-        <a:srgbClr val="1F497D"/>
+        <a:srgbClr val="44546A"/>
       </a:dk2>
       <a:lt2>
-        <a:srgbClr val="EEECE1"/>
+        <a:srgbClr val="E7E6E6"/>
       </a:lt2>
       <a:accent1>
-        <a:srgbClr val="4F81BD"/>
+        <a:srgbClr val="4472C4"/>
       </a:accent1>
       <a:accent2>
-        <a:srgbClr val="C0504D"/>
+        <a:srgbClr val="ED7D31"/>
       </a:accent2>
       <a:accent3>
-        <a:srgbClr val="9BBB59"/>
+        <a:srgbClr val="A5A5A5"/>
       </a:accent3>
       <a:accent4>
-        <a:srgbClr val="8064A2"/>
+        <a:srgbClr val="FFC000"/>
       </a:accent4>
       <a:accent5>
-        <a:srgbClr val="4BACC6"/>
+        <a:srgbClr val="5B9BD5"/>
       </a:accent5>
       <a:accent6>
-        <a:srgbClr val="F79646"/>
+        <a:srgbClr val="70AD47"/>
       </a:accent6>
       <a:hlink>
-        <a:srgbClr val="0000FF"/>
+        <a:srgbClr val="0563C1"/>
       </a:hlink>
       <a:folHlink>
-        <a:srgbClr val="800080"/>
+        <a:srgbClr val="954F72"/>
       </a:folHlink>
     </a:clrScheme>
     <a:fontScheme name="Office">
       <a:majorFont>
-        <a:latin typeface="Calibri"/>
+        <a:latin typeface="Calibri Light" panose="020F0302020204030204"/>
         <a:ea typeface=""/>
         <a:cs typeface=""/>
-        <a:font script="Jpan" typeface="ＭＳ ゴシック"/>
+        <a:font script="Jpan" typeface="游ゴシック Light"/>
         <a:font script="Hang" typeface="맑은 고딕"/>
-        <a:font script="Hans" typeface="宋体"/>
+        <a:font script="Hans" typeface="等线 Light"/>
         <a:font script="Hant" typeface="新細明體"/>
         <a:font script="Arab" typeface="Times New Roman"/>
         <a:font script="Hebr" typeface="Times New Roman"/>
@@ -1663,14 +2241,32 @@
         <a:font script="Mong" typeface="Mongolian Baiti"/>
         <a:font script="Viet" typeface="Times New Roman"/>
         <a:font script="Uigh" typeface="Microsoft Uighur"/>
+        <a:font script="Geor" typeface="Sylfaen"/>
+        <a:font script="Armn" typeface="Arial"/>
+        <a:font script="Bugi" typeface="Leelawadee UI"/>
+        <a:font script="Bopo" typeface="Microsoft JhengHei"/>
+        <a:font script="Java" typeface="Javanese Text"/>
+        <a:font script="Lisu" typeface="Segoe UI"/>
+        <a:font script="Mymr" typeface="Myanmar Text"/>
+        <a:font script="Nkoo" typeface="Ebrima"/>
+        <a:font script="Olck" typeface="Nirmala UI"/>
+        <a:font script="Osma" typeface="Ebrima"/>
+        <a:font script="Phag" typeface="Phagspa"/>
+        <a:font script="Syrn" typeface="Estrangelo Edessa"/>
+        <a:font script="Syrj" typeface="Estrangelo Edessa"/>
+        <a:font script="Syre" typeface="Estrangelo Edessa"/>
+        <a:font script="Sora" typeface="Nirmala UI"/>
+        <a:font script="Tale" typeface="Microsoft Tai Le"/>
+        <a:font script="Talu" typeface="Microsoft New Tai Lue"/>
+        <a:font script="Tfng" typeface="Ebrima"/>
       </a:majorFont>
       <a:minorFont>
-        <a:latin typeface="Cambria"/>
+        <a:latin typeface="Calibri" panose="020F0502020204030204"/>
         <a:ea typeface=""/>
         <a:cs typeface=""/>
-        <a:font script="Jpan" typeface="ＭＳ 明朝"/>
+        <a:font script="Jpan" typeface="游明朝"/>
         <a:font script="Hang" typeface="맑은 고딕"/>
-        <a:font script="Hans" typeface="宋体"/>
+        <a:font script="Hans" typeface="等线"/>
         <a:font script="Hant" typeface="新細明體"/>
         <a:font script="Arab" typeface="Arial"/>
         <a:font script="Hebr" typeface="Arial"/>
@@ -1697,6 +2293,24 @@
         <a:font script="Mong" typeface="Mongolian Baiti"/>
         <a:font script="Viet" typeface="Arial"/>
         <a:font script="Uigh" typeface="Microsoft Uighur"/>
+        <a:font script="Geor" typeface="Sylfaen"/>
+        <a:font script="Armn" typeface="Arial"/>
+        <a:font script="Bugi" typeface="Leelawadee UI"/>
+        <a:font script="Bopo" typeface="Microsoft JhengHei"/>
+        <a:font script="Java" typeface="Javanese Text"/>
+        <a:font script="Lisu" typeface="Segoe UI"/>
+        <a:font script="Mymr" typeface="Myanmar Text"/>
+        <a:font script="Nkoo" typeface="Ebrima"/>
+        <a:font script="Olck" typeface="Nirmala UI"/>
+        <a:font script="Osma" typeface="Ebrima"/>
+        <a:font script="Phag" typeface="Phagspa"/>
+        <a:font script="Syrn" typeface="Estrangelo Edessa"/>
+        <a:font script="Syrj" typeface="Estrangelo Edessa"/>
+        <a:font script="Syre" typeface="Estrangelo Edessa"/>
+        <a:font script="Sora" typeface="Nirmala UI"/>
+        <a:font script="Tale" typeface="Microsoft Tai Le"/>
+        <a:font script="Talu" typeface="Microsoft New Tai Lue"/>
+        <a:font script="Tfng" typeface="Ebrima"/>
       </a:minorFont>
     </a:fontScheme>
     <a:fmtScheme name="Office">
@@ -1708,200 +2322,141 @@
           <a:gsLst>
             <a:gs pos="0">
               <a:schemeClr val="phClr">
-                <a:tint val="50000"/>
-                <a:satMod val="300000"/>
+                <a:lumMod val="110000"/>
+                <a:satMod val="105000"/>
+                <a:tint val="67000"/>
               </a:schemeClr>
             </a:gs>
-            <a:gs pos="35000">
+            <a:gs pos="50000">
               <a:schemeClr val="phClr">
-                <a:tint val="37000"/>
-                <a:satMod val="300000"/>
+                <a:lumMod val="105000"/>
+                <a:satMod val="103000"/>
+                <a:tint val="73000"/>
               </a:schemeClr>
             </a:gs>
             <a:gs pos="100000">
               <a:schemeClr val="phClr">
-                <a:tint val="15000"/>
-                <a:satMod val="350000"/>
+                <a:lumMod val="105000"/>
+                <a:satMod val="109000"/>
+                <a:tint val="81000"/>
               </a:schemeClr>
             </a:gs>
           </a:gsLst>
-          <a:lin ang="16200000" scaled="1"/>
+          <a:lin ang="5400000" scaled="0"/>
         </a:gradFill>
         <a:gradFill rotWithShape="1">
           <a:gsLst>
             <a:gs pos="0">
               <a:schemeClr val="phClr">
-                <a:tint val="100000"/>
+                <a:satMod val="103000"/>
+                <a:lumMod val="102000"/>
+                <a:tint val="94000"/>
+              </a:schemeClr>
+            </a:gs>
+            <a:gs pos="50000">
+              <a:schemeClr val="phClr">
+                <a:satMod val="110000"/>
+                <a:lumMod val="100000"/>
                 <a:shade val="100000"/>
-                <a:satMod val="130000"/>
               </a:schemeClr>
             </a:gs>
             <a:gs pos="100000">
               <a:schemeClr val="phClr">
-                <a:tint val="50000"/>
-                <a:shade val="100000"/>
-                <a:satMod val="350000"/>
+                <a:lumMod val="99000"/>
+                <a:satMod val="120000"/>
+                <a:shade val="78000"/>
               </a:schemeClr>
             </a:gs>
           </a:gsLst>
-          <a:lin ang="16200000" scaled="0"/>
+          <a:lin ang="5400000" scaled="0"/>
         </a:gradFill>
       </a:fillStyleLst>
       <a:lnStyleLst>
-        <a:ln w="9525" cap="flat" cmpd="sng" algn="ctr">
-          <a:solidFill>
-            <a:schemeClr val="phClr">
-              <a:shade val="95000"/>
-              <a:satMod val="105000"/>
-            </a:schemeClr>
-          </a:solidFill>
-          <a:prstDash val="solid"/>
-        </a:ln>
-        <a:ln w="25400" cap="flat" cmpd="sng" algn="ctr">
+        <a:ln w="6350" cap="flat" cmpd="sng" algn="ctr">
           <a:solidFill>
             <a:schemeClr val="phClr"/>
           </a:solidFill>
           <a:prstDash val="solid"/>
+          <a:miter lim="800000"/>
         </a:ln>
-        <a:ln w="38100" cap="flat" cmpd="sng" algn="ctr">
+        <a:ln w="12700" cap="flat" cmpd="sng" algn="ctr">
           <a:solidFill>
             <a:schemeClr val="phClr"/>
           </a:solidFill>
           <a:prstDash val="solid"/>
+          <a:miter lim="800000"/>
+        </a:ln>
+        <a:ln w="19050" cap="flat" cmpd="sng" algn="ctr">
+          <a:solidFill>
+            <a:schemeClr val="phClr"/>
+          </a:solidFill>
+          <a:prstDash val="solid"/>
+          <a:miter lim="800000"/>
         </a:ln>
       </a:lnStyleLst>
       <a:effectStyleLst>
         <a:effectStyle>
+          <a:effectLst/>
+        </a:effectStyle>
+        <a:effectStyle>
+          <a:effectLst/>
+        </a:effectStyle>
+        <a:effectStyle>
           <a:effectLst>
-            <a:outerShdw blurRad="40000" dist="20000" dir="5400000" rotWithShape="0">
+            <a:outerShdw blurRad="57150" dist="19050" dir="5400000" algn="ctr" rotWithShape="0">
               <a:srgbClr val="000000">
-                <a:alpha val="38000"/>
+                <a:alpha val="63000"/>
               </a:srgbClr>
             </a:outerShdw>
           </a:effectLst>
-        </a:effectStyle>
-        <a:effectStyle>
-          <a:effectLst>
-            <a:outerShdw blurRad="40000" dist="23000" dir="5400000" rotWithShape="0">
-              <a:srgbClr val="000000">
-                <a:alpha val="35000"/>
-              </a:srgbClr>
-            </a:outerShdw>
-          </a:effectLst>
-        </a:effectStyle>
-        <a:effectStyle>
-          <a:effectLst>
-            <a:outerShdw blurRad="40000" dist="23000" dir="5400000" rotWithShape="0">
-              <a:srgbClr val="000000">
-                <a:alpha val="35000"/>
-              </a:srgbClr>
-            </a:outerShdw>
-          </a:effectLst>
-          <a:scene3d>
-            <a:camera prst="orthographicFront">
-              <a:rot lat="0" lon="0" rev="0"/>
-            </a:camera>
-            <a:lightRig rig="threePt" dir="t">
-              <a:rot lat="0" lon="0" rev="1200000"/>
-            </a:lightRig>
-          </a:scene3d>
-          <a:sp3d>
-            <a:bevelT w="63500" h="25400"/>
-          </a:sp3d>
         </a:effectStyle>
       </a:effectStyleLst>
       <a:bgFillStyleLst>
         <a:solidFill>
           <a:schemeClr val="phClr"/>
         </a:solidFill>
+        <a:solidFill>
+          <a:schemeClr val="phClr">
+            <a:tint val="95000"/>
+            <a:satMod val="170000"/>
+          </a:schemeClr>
+        </a:solidFill>
         <a:gradFill rotWithShape="1">
           <a:gsLst>
             <a:gs pos="0">
               <a:schemeClr val="phClr">
-                <a:tint val="40000"/>
-                <a:satMod val="350000"/>
+                <a:tint val="93000"/>
+                <a:satMod val="150000"/>
+                <a:shade val="98000"/>
+                <a:lumMod val="102000"/>
               </a:schemeClr>
             </a:gs>
-            <a:gs pos="40000">
+            <a:gs pos="50000">
               <a:schemeClr val="phClr">
-                <a:tint val="45000"/>
-                <a:shade val="99000"/>
-                <a:satMod val="350000"/>
+                <a:tint val="98000"/>
+                <a:satMod val="130000"/>
+                <a:shade val="90000"/>
+                <a:lumMod val="103000"/>
               </a:schemeClr>
             </a:gs>
             <a:gs pos="100000">
               <a:schemeClr val="phClr">
-                <a:shade val="20000"/>
-                <a:satMod val="255000"/>
+                <a:shade val="63000"/>
+                <a:satMod val="120000"/>
               </a:schemeClr>
             </a:gs>
           </a:gsLst>
-          <a:path path="circle">
-            <a:fillToRect l="50000" t="-80000" r="50000" b="180000"/>
-          </a:path>
-        </a:gradFill>
-        <a:gradFill rotWithShape="1">
-          <a:gsLst>
-            <a:gs pos="0">
-              <a:schemeClr val="phClr">
-                <a:tint val="80000"/>
-                <a:satMod val="300000"/>
-              </a:schemeClr>
-            </a:gs>
-            <a:gs pos="100000">
-              <a:schemeClr val="phClr">
-                <a:shade val="30000"/>
-                <a:satMod val="200000"/>
-              </a:schemeClr>
-            </a:gs>
-          </a:gsLst>
-          <a:path path="circle">
-            <a:fillToRect l="50000" t="50000" r="50000" b="50000"/>
-          </a:path>
+          <a:lin ang="5400000" scaled="0"/>
         </a:gradFill>
       </a:bgFillStyleLst>
     </a:fmtScheme>
   </a:themeElements>
-  <a:objectDefaults>
-    <a:spDef>
-      <a:spPr/>
-      <a:bodyPr/>
-      <a:lstStyle/>
-      <a:style>
-        <a:lnRef idx="1">
-          <a:schemeClr val="accent1"/>
-        </a:lnRef>
-        <a:fillRef idx="3">
-          <a:schemeClr val="accent1"/>
-        </a:fillRef>
-        <a:effectRef idx="2">
-          <a:schemeClr val="accent1"/>
-        </a:effectRef>
-        <a:fontRef idx="minor">
-          <a:schemeClr val="lt1"/>
-        </a:fontRef>
-      </a:style>
-    </a:spDef>
-    <a:lnDef>
-      <a:spPr/>
-      <a:bodyPr/>
-      <a:lstStyle/>
-      <a:style>
-        <a:lnRef idx="2">
-          <a:schemeClr val="accent1"/>
-        </a:lnRef>
-        <a:fillRef idx="0">
-          <a:schemeClr val="accent1"/>
-        </a:fillRef>
-        <a:effectRef idx="1">
-          <a:schemeClr val="accent1"/>
-        </a:effectRef>
-        <a:fontRef idx="minor">
-          <a:schemeClr val="tx1"/>
-        </a:fontRef>
-      </a:style>
-    </a:lnDef>
-  </a:objectDefaults>
+  <a:objectDefaults/>
   <a:extraClrSchemeLst/>
+  <a:extLst>
+    <a:ext uri="{05A4C25C-085E-4340-85A3-A5531E510DB2}">
+      <thm15:themeFamily xmlns:thm15="http://schemas.microsoft.com/office/thememl/2012/main" name="Office Theme" id="{62F939B6-93AF-4DB8-9C6B-D6C7DFDC589F}" vid="{4A3C46E8-61CC-4603-A589-7422A47A8E4A}"/>
+    </a:ext>
+  </a:extLst>
 </a:theme>
 </file>
</xml_diff>

<commit_message>
Base com dados da SSP e MP mesclada e com info da presença ou não de COP nos batalhões.
</commit_message>
<xml_diff>
--- a/R/Relatorio_anual_2022.docx
+++ b/R/Relatorio_anual_2022.docx
@@ -83,7 +83,7 @@
         <w:pStyle w:val="Date"/>
       </w:pPr>
       <w:r>
-        <w:t xml:space="preserve">2023-03-23</w:t>
+        <w:t xml:space="preserve">2023-03-24</w:t>
       </w:r>
     </w:p>
     <w:p>
@@ -645,8 +645,10 @@
       <w:r>
         <w:t xml:space="preserve">O aumento progressivo que vem sendo observado desde então denota a urgência de se pensar políticas públicas para a redução efetiva dos casos de lesão corporal contra a mulher.</w:t>
       </w:r>
-      <w:r>
-        <w:t xml:space="preserve"> </w:t>
+    </w:p>
+    <w:p>
+      <w:r>
+        <w:br w:type="page"/>
       </w:r>
     </w:p>
     <w:p>
@@ -960,7 +962,7 @@
       <w:r>
         <w:drawing>
           <wp:inline>
-            <wp:extent cx="8316227" cy="5544151"/>
+            <wp:extent cx="7392202" cy="4158113"/>
             <wp:effectExtent b="0" l="0" r="0" t="0"/>
             <wp:docPr descr="" title="" id="45" name="Picture"/>
             <a:graphic>
@@ -981,7 +983,7 @@
                   <pic:spPr bwMode="auto">
                     <a:xfrm>
                       <a:off x="0" y="0"/>
-                      <a:ext cx="8316227" cy="5544151"/>
+                      <a:ext cx="7392202" cy="4158113"/>
                     </a:xfrm>
                     <a:prstGeom prst="rect">
                       <a:avLst/>
@@ -1002,7 +1004,7 @@
       <w:r>
         <w:drawing>
           <wp:inline>
-            <wp:extent cx="8316227" cy="5544151"/>
+            <wp:extent cx="7392202" cy="4158113"/>
             <wp:effectExtent b="0" l="0" r="0" t="0"/>
             <wp:docPr descr="" title="" id="48" name="Picture"/>
             <a:graphic>
@@ -1023,7 +1025,7 @@
                   <pic:spPr bwMode="auto">
                     <a:xfrm>
                       <a:off x="0" y="0"/>
-                      <a:ext cx="8316227" cy="5544151"/>
+                      <a:ext cx="7392202" cy="4158113"/>
                     </a:xfrm>
                     <a:prstGeom prst="rect">
                       <a:avLst/>
@@ -1118,7 +1120,7 @@
       <w:r>
         <w:drawing>
           <wp:inline>
-            <wp:extent cx="8316227" cy="5544151"/>
+            <wp:extent cx="7392202" cy="4158113"/>
             <wp:effectExtent b="0" l="0" r="0" t="0"/>
             <wp:docPr descr="" title="" id="51" name="Picture"/>
             <a:graphic>
@@ -1139,7 +1141,7 @@
                   <pic:spPr bwMode="auto">
                     <a:xfrm>
                       <a:off x="0" y="0"/>
-                      <a:ext cx="8316227" cy="5544151"/>
+                      <a:ext cx="7392202" cy="4158113"/>
                     </a:xfrm>
                     <a:prstGeom prst="rect">
                       <a:avLst/>

</xml_diff>